<commit_message>
Update app overview docs and rename CRM permission label
Co-Authored-By: Claude Sonnet 5.5 <noreply@anthropic.com>
</commit_message>
<xml_diff>
--- a/docs/APP_OVERVIEW.docx
+++ b/docs/APP_OVERVIEW.docx
@@ -29,7 +29,7 @@
           <w:sz w:val="22"/>
           <w:szCs w:val="22"/>
         </w:rPr>
-        <w:t xml:space="preserve">Status snapshot of the frontend after the module skeletons, rebranding and roles work (commit </w:t>
+        <w:t xml:space="preserve">Status snapshot of the frontend after the Enquiries, Marketing Insights and navigation work (commit </w:t>
       </w:r>
       <w:r>
         <w:rPr>
@@ -38,7 +38,7 @@
           <w:szCs w:val="22"/>
           <w:shd w:fill="F1F3F5" w:val="clear"/>
         </w:rPr>
-        <w:t xml:space="preserve">a70159c</w:t>
+        <w:t xml:space="preserve">af261dd</w:t>
       </w:r>
       <w:r>
         <w:rPr>
@@ -93,7 +93,7 @@
           <w:sz w:val="22"/>
           <w:szCs w:val="22"/>
         </w:rPr>
-        <w:t xml:space="preserve">A clickable, frontend-only web app. One part is a complete Practice Management System (PMS) demo for clinics: schedule, patients, visits, photos, billing, inventory, forms, reports and AI "agents". Three more modules (CRM, Booking, Campaigns) exist only as empty skeletons in the navigation. There is no backend: all data is in-memory sample data that resets on reload, and sign-in, roles and settings are demo state in the browser.</w:t>
+        <w:t xml:space="preserve">A clickable, frontend-only web app. One part is a complete Practice Management System (PMS) demo for clinics: schedule, patients, visits, photos, billing, inventory, forms, reports and AI "agents". On top of it sit a working Enquiries screen (front-desk handling of enquiries through to a booked appointment) and a Marketing Insights screen, both on sample data. CRM, Online Bookings and Campaigns exist only as labelled previews. There is no backend: all data is in-memory sample data that resets on reload, and sign-in, roles and settings are demo state in the browser.</w:t>
       </w:r>
     </w:p>
     <w:p>
@@ -1372,7 +1372,7 @@
                 <w:sz w:val="19"/>
                 <w:szCs w:val="19"/>
               </w:rPr>
-              <w:t xml:space="preserve">CRM</w:t>
+              <w:t xml:space="preserve">Enquiries</w:t>
             </w:r>
           </w:p>
         </w:tc>
@@ -1405,7 +1405,7 @@
                 <w:szCs w:val="19"/>
                 <w:shd w:fill="F1F3F5" w:val="clear"/>
               </w:rPr>
-              <w:t xml:space="preserve">/crm</w:t>
+              <w:t xml:space="preserve">/enquiries</w:t>
             </w:r>
           </w:p>
         </w:tc>
@@ -1437,7 +1437,7 @@
                 <w:sz w:val="19"/>
                 <w:szCs w:val="19"/>
               </w:rPr>
-              <w:t xml:space="preserve">Skeleton. Lists contacts derived from patients, plus a "planned" list</w:t>
+              <w:t xml:space="preserve">Working demo: list, filters, create/edit, status, follow-up tasks, link patient, book appointment</w:t>
             </w:r>
           </w:p>
         </w:tc>
@@ -1474,7 +1474,7 @@
                 <w:sz w:val="19"/>
                 <w:szCs w:val="19"/>
               </w:rPr>
-              <w:t xml:space="preserve">Booking</w:t>
+              <w:t xml:space="preserve">Marketing Insights</w:t>
             </w:r>
           </w:p>
         </w:tc>
@@ -1507,7 +1507,7 @@
                 <w:szCs w:val="19"/>
                 <w:shd w:fill="F1F3F5" w:val="clear"/>
               </w:rPr>
-              <w:t xml:space="preserve">/booking</w:t>
+              <w:t xml:space="preserve">/marketing-insights</w:t>
             </w:r>
           </w:p>
         </w:tc>
@@ -1539,7 +1539,7 @@
                 <w:sz w:val="19"/>
                 <w:szCs w:val="19"/>
               </w:rPr>
-              <w:t xml:space="preserve">Skeleton</w:t>
+              <w:t xml:space="preserve">Working demo on sample data</w:t>
             </w:r>
           </w:p>
         </w:tc>
@@ -1576,6 +1576,210 @@
                 <w:sz w:val="19"/>
                 <w:szCs w:val="19"/>
               </w:rPr>
+              <w:t xml:space="preserve">CRM</w:t>
+            </w:r>
+          </w:p>
+        </w:tc>
+        <w:tc>
+          <w:tcPr>
+            <w:tcW w:type="dxa" w:w="3120"/>
+            <w:tcBorders>
+              <w:top w:val="single" w:color="D5DBE1" w:sz="4"/>
+              <w:left w:val="single" w:color="D5DBE1" w:sz="4"/>
+              <w:bottom w:val="single" w:color="D5DBE1" w:sz="4"/>
+              <w:right w:val="single" w:color="D5DBE1" w:sz="4"/>
+            </w:tcBorders>
+            <w:tcMar>
+              <w:top w:type="dxa" w:w="60"/>
+              <w:left w:type="dxa" w:w="100"/>
+              <w:bottom w:type="dxa" w:w="60"/>
+              <w:right w:type="dxa" w:w="100"/>
+            </w:tcMar>
+          </w:tcPr>
+          <w:p>
+            <w:pPr>
+              <w:jc w:val="left"/>
+            </w:pPr>
+            <w:r>
+              <w:rPr>
+                <w:rFonts w:ascii="Consolas" w:cs="Consolas" w:eastAsia="Consolas" w:hAnsi="Consolas"/>
+                <w:b w:val="false"/>
+                <w:bCs w:val="false"/>
+                <w:sz w:val="19"/>
+                <w:szCs w:val="19"/>
+                <w:shd w:fill="F1F3F5" w:val="clear"/>
+              </w:rPr>
+              <w:t xml:space="preserve">/crm</w:t>
+            </w:r>
+          </w:p>
+        </w:tc>
+        <w:tc>
+          <w:tcPr>
+            <w:tcW w:type="dxa" w:w="3120"/>
+            <w:tcBorders>
+              <w:top w:val="single" w:color="D5DBE1" w:sz="4"/>
+              <w:left w:val="single" w:color="D5DBE1" w:sz="4"/>
+              <w:bottom w:val="single" w:color="D5DBE1" w:sz="4"/>
+              <w:right w:val="single" w:color="D5DBE1" w:sz="4"/>
+            </w:tcBorders>
+            <w:tcMar>
+              <w:top w:type="dxa" w:w="60"/>
+              <w:left w:type="dxa" w:w="100"/>
+              <w:bottom w:type="dxa" w:w="60"/>
+              <w:right w:type="dxa" w:w="100"/>
+            </w:tcMar>
+          </w:tcPr>
+          <w:p>
+            <w:pPr>
+              <w:jc w:val="left"/>
+            </w:pPr>
+            <w:r>
+              <w:rPr>
+                <w:rFonts w:ascii="Calibri" w:cs="Calibri" w:eastAsia="Calibri" w:hAnsi="Calibri"/>
+                <w:b w:val="false"/>
+                <w:bCs w:val="false"/>
+                <w:sz w:val="19"/>
+                <w:szCs w:val="19"/>
+              </w:rPr>
+              <w:t xml:space="preserve">Preview. Lists contacts derived from patients. Reached from the account menu</w:t>
+            </w:r>
+          </w:p>
+        </w:tc>
+      </w:tr>
+      <w:tr>
+        <w:trPr>
+          <w:tblHeader w:val="off"/>
+        </w:trPr>
+        <w:tc>
+          <w:tcPr>
+            <w:tcW w:type="dxa" w:w="3120"/>
+            <w:tcBorders>
+              <w:top w:val="single" w:color="D5DBE1" w:sz="4"/>
+              <w:left w:val="single" w:color="D5DBE1" w:sz="4"/>
+              <w:bottom w:val="single" w:color="D5DBE1" w:sz="4"/>
+              <w:right w:val="single" w:color="D5DBE1" w:sz="4"/>
+            </w:tcBorders>
+            <w:tcMar>
+              <w:top w:type="dxa" w:w="60"/>
+              <w:left w:type="dxa" w:w="100"/>
+              <w:bottom w:type="dxa" w:w="60"/>
+              <w:right w:type="dxa" w:w="100"/>
+            </w:tcMar>
+          </w:tcPr>
+          <w:p>
+            <w:pPr>
+              <w:jc w:val="left"/>
+            </w:pPr>
+            <w:r>
+              <w:rPr>
+                <w:rFonts w:ascii="Calibri" w:cs="Calibri" w:eastAsia="Calibri" w:hAnsi="Calibri"/>
+                <w:b w:val="false"/>
+                <w:bCs w:val="false"/>
+                <w:sz w:val="19"/>
+                <w:szCs w:val="19"/>
+              </w:rPr>
+              <w:t xml:space="preserve">Online Bookings</w:t>
+            </w:r>
+          </w:p>
+        </w:tc>
+        <w:tc>
+          <w:tcPr>
+            <w:tcW w:type="dxa" w:w="3120"/>
+            <w:tcBorders>
+              <w:top w:val="single" w:color="D5DBE1" w:sz="4"/>
+              <w:left w:val="single" w:color="D5DBE1" w:sz="4"/>
+              <w:bottom w:val="single" w:color="D5DBE1" w:sz="4"/>
+              <w:right w:val="single" w:color="D5DBE1" w:sz="4"/>
+            </w:tcBorders>
+            <w:tcMar>
+              <w:top w:type="dxa" w:w="60"/>
+              <w:left w:type="dxa" w:w="100"/>
+              <w:bottom w:type="dxa" w:w="60"/>
+              <w:right w:type="dxa" w:w="100"/>
+            </w:tcMar>
+          </w:tcPr>
+          <w:p>
+            <w:pPr>
+              <w:jc w:val="left"/>
+            </w:pPr>
+            <w:r>
+              <w:rPr>
+                <w:rFonts w:ascii="Consolas" w:cs="Consolas" w:eastAsia="Consolas" w:hAnsi="Consolas"/>
+                <w:b w:val="false"/>
+                <w:bCs w:val="false"/>
+                <w:sz w:val="19"/>
+                <w:szCs w:val="19"/>
+                <w:shd w:fill="F1F3F5" w:val="clear"/>
+              </w:rPr>
+              <w:t xml:space="preserve">/booking</w:t>
+            </w:r>
+          </w:p>
+        </w:tc>
+        <w:tc>
+          <w:tcPr>
+            <w:tcW w:type="dxa" w:w="3120"/>
+            <w:tcBorders>
+              <w:top w:val="single" w:color="D5DBE1" w:sz="4"/>
+              <w:left w:val="single" w:color="D5DBE1" w:sz="4"/>
+              <w:bottom w:val="single" w:color="D5DBE1" w:sz="4"/>
+              <w:right w:val="single" w:color="D5DBE1" w:sz="4"/>
+            </w:tcBorders>
+            <w:tcMar>
+              <w:top w:type="dxa" w:w="60"/>
+              <w:left w:type="dxa" w:w="100"/>
+              <w:bottom w:type="dxa" w:w="60"/>
+              <w:right w:type="dxa" w:w="100"/>
+            </w:tcMar>
+          </w:tcPr>
+          <w:p>
+            <w:pPr>
+              <w:jc w:val="left"/>
+            </w:pPr>
+            <w:r>
+              <w:rPr>
+                <w:rFonts w:ascii="Calibri" w:cs="Calibri" w:eastAsia="Calibri" w:hAnsi="Calibri"/>
+                <w:b w:val="false"/>
+                <w:bCs w:val="false"/>
+                <w:sz w:val="19"/>
+                <w:szCs w:val="19"/>
+              </w:rPr>
+              <w:t xml:space="preserve">Preview only</w:t>
+            </w:r>
+          </w:p>
+        </w:tc>
+      </w:tr>
+      <w:tr>
+        <w:trPr>
+          <w:tblHeader w:val="off"/>
+        </w:trPr>
+        <w:tc>
+          <w:tcPr>
+            <w:tcW w:type="dxa" w:w="3120"/>
+            <w:tcBorders>
+              <w:top w:val="single" w:color="D5DBE1" w:sz="4"/>
+              <w:left w:val="single" w:color="D5DBE1" w:sz="4"/>
+              <w:bottom w:val="single" w:color="D5DBE1" w:sz="4"/>
+              <w:right w:val="single" w:color="D5DBE1" w:sz="4"/>
+            </w:tcBorders>
+            <w:tcMar>
+              <w:top w:type="dxa" w:w="60"/>
+              <w:left w:type="dxa" w:w="100"/>
+              <w:bottom w:type="dxa" w:w="60"/>
+              <w:right w:type="dxa" w:w="100"/>
+            </w:tcMar>
+          </w:tcPr>
+          <w:p>
+            <w:pPr>
+              <w:jc w:val="left"/>
+            </w:pPr>
+            <w:r>
+              <w:rPr>
+                <w:rFonts w:ascii="Calibri" w:cs="Calibri" w:eastAsia="Calibri" w:hAnsi="Calibri"/>
+                <w:b w:val="false"/>
+                <w:bCs w:val="false"/>
+                <w:sz w:val="19"/>
+                <w:szCs w:val="19"/>
+              </w:rPr>
               <w:t xml:space="preserve">Campaigns</w:t>
             </w:r>
           </w:p>
@@ -1641,7 +1845,7 @@
                 <w:sz w:val="19"/>
                 <w:szCs w:val="19"/>
               </w:rPr>
-              <w:t xml:space="preserve">Skeleton</w:t>
+              <w:t xml:space="preserve">Preview only</w:t>
             </w:r>
           </w:p>
         </w:tc>
@@ -1679,7 +1883,30 @@
           <w:sz w:val="22"/>
           <w:szCs w:val="22"/>
         </w:rPr>
-        <w:t xml:space="preserve"> and appear in the sidebar's "Platform" section when the role has a matching permission.</w:t>
+        <w:t xml:space="preserve"> and appear in the sidebar's "Growth &amp; Engagement" group (CRM in the account menu) when the module is switched on and the role has a matching permission.</w:t>
+      </w:r>
+    </w:p>
+    <w:p>
+      <w:pPr>
+        <w:spacing w:after="120"/>
+      </w:pPr>
+      <w:r>
+        <w:rPr>
+          <w:rFonts w:ascii="Calibri" w:cs="Calibri" w:eastAsia="Calibri" w:hAnsi="Calibri"/>
+          <w:b/>
+          <w:bCs/>
+          <w:sz w:val="22"/>
+          <w:szCs w:val="22"/>
+        </w:rPr>
+        <w:t xml:space="preserve">Sidebar:</w:t>
+      </w:r>
+      <w:r>
+        <w:rPr>
+          <w:rFonts w:ascii="Calibri" w:cs="Calibri" w:eastAsia="Calibri" w:hAnsi="Calibri"/>
+          <w:sz w:val="22"/>
+          <w:szCs w:val="22"/>
+        </w:rPr>
+        <w:t xml:space="preserve"> Clinic (Today, Calendar, Patients, Enquiries, Follow-ups, Reports), Practice (Team, Services &amp; treatments, Inventory, Locations &amp; rooms, Forms), Growth &amp; Engagement (Marketing Insights, Campaigns, Online Bookings). CRM, Online Bookings and Campaigns are optional and can be switched off in Practice &gt; Integrations.</w:t>
       </w:r>
     </w:p>
     <w:p>
@@ -1696,7 +1923,24 @@
           <w:sz w:val="28"/>
           <w:szCs w:val="28"/>
         </w:rPr>
-        <w:t xml:space="preserve">4. Features in the Practice (PMS) module</w:t>
+        <w:t xml:space="preserve">4. Features</w:t>
+      </w:r>
+    </w:p>
+    <w:p>
+      <w:pPr>
+        <w:pStyle w:val="Heading3"/>
+        <w:spacing w:after="120" w:before="280"/>
+      </w:pPr>
+      <w:r>
+        <w:rPr>
+          <w:rFonts w:ascii="Calibri" w:cs="Calibri" w:eastAsia="Calibri" w:hAnsi="Calibri"/>
+          <w:b/>
+          <w:bCs/>
+          <w:color w:val="26384B"/>
+          <w:sz w:val="24"/>
+          <w:szCs w:val="24"/>
+        </w:rPr>
+        <w:t xml:space="preserve">Enquiries and Marketing Insights</w:t>
       </w:r>
     </w:p>
     <w:p>
@@ -1716,32 +1960,15 @@
           <w:sz w:val="22"/>
           <w:szCs w:val="22"/>
         </w:rPr>
-        <w:t xml:space="preserve">Today (`/overview`)</w:t>
-      </w:r>
-      <w:r>
-        <w:rPr>
-          <w:rFonts w:ascii="Calibri" w:cs="Calibri" w:eastAsia="Calibri" w:hAnsi="Calibri"/>
-          <w:sz w:val="22"/>
-          <w:szCs w:val="22"/>
-        </w:rPr>
-        <w:t xml:space="preserve">: day schedule with filters, "needs attention" list, who is waiting, and a Patient flow (front desk) view. </w:t>
-      </w:r>
-      <w:r>
-        <w:rPr>
-          <w:rFonts w:ascii="Consolas" w:cs="Consolas" w:eastAsia="Consolas" w:hAnsi="Consolas"/>
-          <w:sz w:val="22"/>
-          <w:szCs w:val="22"/>
-          <w:shd w:fill="F1F3F5" w:val="clear"/>
-        </w:rPr>
-        <w:t xml:space="preserve">/front-desk</w:t>
-      </w:r>
-      <w:r>
-        <w:rPr>
-          <w:rFonts w:ascii="Calibri" w:cs="Calibri" w:eastAsia="Calibri" w:hAnsi="Calibri"/>
-          <w:sz w:val="22"/>
-          <w:szCs w:val="22"/>
-        </w:rPr>
-        <w:t xml:space="preserve"> redirects here.</w:t>
+        <w:t xml:space="preserve">Enquiries (`/enquiries`)</w:t>
+      </w:r>
+      <w:r>
+        <w:rPr>
+          <w:rFonts w:ascii="Calibri" w:cs="Calibri" w:eastAsia="Calibri" w:hAnsi="Calibri"/>
+          <w:sz w:val="22"/>
+          <w:szCs w:val="22"/>
+        </w:rPr>
+        <w:t xml:space="preserve">: list with status tabs (New, Contacted, Appointment booked, Closed, Not converted), search by name, phone or email, source and assigned-staff filters, pagination and a mobile card layout. 48 synthetic enquiries.</w:t>
       </w:r>
     </w:p>
     <w:p>
@@ -1761,15 +1988,15 @@
           <w:sz w:val="22"/>
           <w:szCs w:val="22"/>
         </w:rPr>
-        <w:t xml:space="preserve">Calendar</w:t>
-      </w:r>
-      <w:r>
-        <w:rPr>
-          <w:rFonts w:ascii="Calibri" w:cs="Calibri" w:eastAsia="Calibri" w:hAnsi="Calibri"/>
-          <w:sz w:val="22"/>
-          <w:szCs w:val="22"/>
-        </w:rPr>
-        <w:t xml:space="preserve">: day, week and month views of appointments by provider, room and location. Click an appointment for a side panel (change status, cancel, mark no-show, check out). Appointment statuses: scheduled, confirmed, arrived, waiting, in progress, completed, cancelled, no-show.</w:t>
+        <w:t xml:space="preserve">Enquiry detail panel</w:t>
+      </w:r>
+      <w:r>
+        <w:rPr>
+          <w:rFonts w:ascii="Calibri" w:cs="Calibri" w:eastAsia="Calibri" w:hAnsi="Calibri"/>
+          <w:sz w:val="22"/>
+          <w:szCs w:val="22"/>
+        </w:rPr>
+        <w:t xml:space="preserve">: contact details, requested service, source, status and assignee (editable), notes, follow-up tasks (add, mark done, overdue flag) and history.</w:t>
       </w:r>
     </w:p>
     <w:p>
@@ -1789,15 +2016,15 @@
           <w:sz w:val="22"/>
           <w:szCs w:val="22"/>
         </w:rPr>
-        <w:t xml:space="preserve">Patients</w:t>
-      </w:r>
-      <w:r>
-        <w:rPr>
-          <w:rFonts w:ascii="Calibri" w:cs="Calibri" w:eastAsia="Calibri" w:hAnsi="Calibri"/>
-          <w:sz w:val="22"/>
-          <w:szCs w:val="22"/>
-        </w:rPr>
-        <w:t xml:space="preserve">: searchable and filterable list (status, tag). Create patient. Patient record has five tabs: Summary, Care history, Photos, Documents &amp; forms, Financials. Includes alerts (allergy, medical), tags, referral source and marketing consent flag.</w:t>
+        <w:t xml:space="preserve">Actions</w:t>
+      </w:r>
+      <w:r>
+        <w:rPr>
+          <w:rFonts w:ascii="Calibri" w:cs="Calibri" w:eastAsia="Calibri" w:hAnsi="Calibri"/>
+          <w:sz w:val="22"/>
+          <w:szCs w:val="22"/>
+        </w:rPr>
+        <w:t xml:space="preserve">: create and edit an enquiry (validated; phone or email required; no clinical details collected), change status, assign staff, close or mark not converted, link to an existing patient (matches are suggested, never automatic) or create a patient (demo), and book an appointment using the existing appointment panel, prefilled from the enquiry. Booking marks the enquiry "Appointment booked".</w:t>
       </w:r>
     </w:p>
     <w:p>
@@ -1817,15 +2044,15 @@
           <w:sz w:val="22"/>
           <w:szCs w:val="22"/>
         </w:rPr>
-        <w:t xml:space="preserve">Visits</w:t>
-      </w:r>
-      <w:r>
-        <w:rPr>
-          <w:rFonts w:ascii="Calibri" w:cs="Calibri" w:eastAsia="Calibri" w:hAnsi="Calibri"/>
-          <w:sz w:val="22"/>
-          <w:szCs w:val="22"/>
-        </w:rPr>
-        <w:t xml:space="preserve">: documentation per visit with SOAP-style notes, treatments, forms and consent, follow-up instructions, treatment plan, billing. Tabs adapt to the clinic type and to what each service enables. Aesthetics extras: guided photo capture and an injection plotting map with product and units.</w:t>
+        <w:t xml:space="preserve">Marketing Insights (`/marketing-insights`)</w:t>
+      </w:r>
+      <w:r>
+        <w:rPr>
+          <w:rFonts w:ascii="Calibri" w:cs="Calibri" w:eastAsia="Calibri" w:hAnsi="Calibri"/>
+          <w:sz w:val="22"/>
+          <w:szCs w:val="22"/>
+        </w:rPr>
+        <w:t xml:space="preserve">: total enquiries, appointments from enquiries, enquiry-to-appointment rate, enquiries over time, by source, conversion by source and campaign attribution. Labelled demo data. No ad platform or analytics is connected.</w:t>
       </w:r>
     </w:p>
     <w:p>
@@ -1845,15 +2072,15 @@
           <w:sz w:val="22"/>
           <w:szCs w:val="22"/>
         </w:rPr>
-        <w:t xml:space="preserve">Follow-ups</w:t>
-      </w:r>
-      <w:r>
-        <w:rPr>
-          <w:rFonts w:ascii="Calibri" w:cs="Calibri" w:eastAsia="Calibri" w:hAnsi="Calibri"/>
-          <w:sz w:val="22"/>
-          <w:szCs w:val="22"/>
-        </w:rPr>
-        <w:t xml:space="preserve">: due today, overdue, upcoming, completed.</w:t>
+        <w:t xml:space="preserve">Today page</w:t>
+      </w:r>
+      <w:r>
+        <w:rPr>
+          <w:rFonts w:ascii="Calibri" w:cs="Calibri" w:eastAsia="Calibri" w:hAnsi="Calibri"/>
+          <w:sz w:val="22"/>
+          <w:szCs w:val="22"/>
+        </w:rPr>
+        <w:t xml:space="preserve">: an "Enquiries to follow up" panel and a "New enquiry" quick action, for roles with the Enquiries permission.</w:t>
       </w:r>
     </w:p>
     <w:p>
@@ -1873,15 +2100,32 @@
           <w:sz w:val="22"/>
           <w:szCs w:val="22"/>
         </w:rPr>
-        <w:t xml:space="preserve">Reports</w:t>
-      </w:r>
-      <w:r>
-        <w:rPr>
-          <w:rFonts w:ascii="Calibri" w:cs="Calibri" w:eastAsia="Calibri" w:hAnsi="Calibri"/>
-          <w:sz w:val="22"/>
-          <w:szCs w:val="22"/>
-        </w:rPr>
-        <w:t xml:space="preserve">: appointment and no-show trends, provider utilization, service volume, provider and patient activity, billing summary, inventory.</w:t>
+        <w:t xml:space="preserve">Previews</w:t>
+      </w:r>
+      <w:r>
+        <w:rPr>
+          <w:rFonts w:ascii="Calibri" w:cs="Calibri" w:eastAsia="Calibri" w:hAnsi="Calibri"/>
+          <w:sz w:val="22"/>
+          <w:szCs w:val="22"/>
+        </w:rPr>
+        <w:t xml:space="preserve">: CRM, Online Bookings and Campaigns pages explain what is planned and are labelled "Preview".</w:t>
+      </w:r>
+    </w:p>
+    <w:p>
+      <w:pPr>
+        <w:pStyle w:val="Heading3"/>
+        <w:spacing w:after="120" w:before="280"/>
+      </w:pPr>
+      <w:r>
+        <w:rPr>
+          <w:rFonts w:ascii="Calibri" w:cs="Calibri" w:eastAsia="Calibri" w:hAnsi="Calibri"/>
+          <w:b/>
+          <w:bCs/>
+          <w:color w:val="26384B"/>
+          <w:sz w:val="24"/>
+          <w:szCs w:val="24"/>
+        </w:rPr>
+        <w:t xml:space="preserve">Practice (PMS) module</w:t>
       </w:r>
     </w:p>
     <w:p>
@@ -1901,15 +2145,32 @@
           <w:sz w:val="22"/>
           <w:szCs w:val="22"/>
         </w:rPr>
-        <w:t xml:space="preserve">Agents and EVI</w:t>
-      </w:r>
-      <w:r>
-        <w:rPr>
-          <w:rFonts w:ascii="Calibri" w:cs="Calibri" w:eastAsia="Calibri" w:hAnsi="Calibri"/>
-          <w:sz w:val="22"/>
-          <w:szCs w:val="22"/>
-        </w:rPr>
-        <w:t xml:space="preserve">: "EVI" is a chat assistant (Ctrl+J) and agents page. Visit prep, follow-up, appointment, recall, no-show and insights agents produce findings from the mock data. They propose items for a person to approve and never act alone. Engagement, Scribe and Receptionist are shown as not live. This is rule-based logic over sample data, not a connected AI model.</w:t>
+        <w:t xml:space="preserve">Today (`/overview`)</w:t>
+      </w:r>
+      <w:r>
+        <w:rPr>
+          <w:rFonts w:ascii="Calibri" w:cs="Calibri" w:eastAsia="Calibri" w:hAnsi="Calibri"/>
+          <w:sz w:val="22"/>
+          <w:szCs w:val="22"/>
+        </w:rPr>
+        <w:t xml:space="preserve">: day schedule with filters, "needs attention" list, who is waiting, and a Patient flow (front desk) view with 8 patients per page. </w:t>
+      </w:r>
+      <w:r>
+        <w:rPr>
+          <w:rFonts w:ascii="Consolas" w:cs="Consolas" w:eastAsia="Consolas" w:hAnsi="Consolas"/>
+          <w:sz w:val="22"/>
+          <w:szCs w:val="22"/>
+          <w:shd w:fill="F1F3F5" w:val="clear"/>
+        </w:rPr>
+        <w:t xml:space="preserve">/front-desk</w:t>
+      </w:r>
+      <w:r>
+        <w:rPr>
+          <w:rFonts w:ascii="Calibri" w:cs="Calibri" w:eastAsia="Calibri" w:hAnsi="Calibri"/>
+          <w:sz w:val="22"/>
+          <w:szCs w:val="22"/>
+        </w:rPr>
+        <w:t xml:space="preserve"> redirects here.</w:t>
       </w:r>
     </w:p>
     <w:p>
@@ -1924,27 +2185,20 @@
       <w:r>
         <w:rPr>
           <w:rFonts w:ascii="Calibri" w:cs="Calibri" w:eastAsia="Calibri" w:hAnsi="Calibri"/>
-          <w:sz w:val="22"/>
-          <w:szCs w:val="22"/>
-        </w:rPr>
-        <w:t xml:space="preserve">**Practice configuration (</w:t>
-      </w:r>
-      <w:r>
-        <w:rPr>
-          <w:rFonts w:ascii="Consolas" w:cs="Consolas" w:eastAsia="Consolas" w:hAnsi="Consolas"/>
-          <w:sz w:val="22"/>
-          <w:szCs w:val="22"/>
-          <w:shd w:fill="F1F3F5" w:val="clear"/>
-        </w:rPr>
-        <w:t xml:space="preserve">/practice/*</w:t>
-      </w:r>
-      <w:r>
-        <w:rPr>
-          <w:rFonts w:ascii="Calibri" w:cs="Calibri" w:eastAsia="Calibri" w:hAnsi="Calibri"/>
-          <w:sz w:val="22"/>
-          <w:szCs w:val="22"/>
-        </w:rPr>
-        <w:t xml:space="preserve">)**: Team (providers and users), Services and treatments (with per-service capability toggles), Inventory, Locations and rooms, Forms (templates), Integrations (EVOQ Campaigns, Billing, Messaging toggles, demo only), Settings (clinic type, scheduling, patient rules, photos, billing, notifications, agents on/off, security, roles and permissions, audit log).</w:t>
+          <w:b/>
+          <w:bCs/>
+          <w:sz w:val="22"/>
+          <w:szCs w:val="22"/>
+        </w:rPr>
+        <w:t xml:space="preserve">Calendar</w:t>
+      </w:r>
+      <w:r>
+        <w:rPr>
+          <w:rFonts w:ascii="Calibri" w:cs="Calibri" w:eastAsia="Calibri" w:hAnsi="Calibri"/>
+          <w:sz w:val="22"/>
+          <w:szCs w:val="22"/>
+        </w:rPr>
+        <w:t xml:space="preserve">: day, week and month views of appointments by provider, room and location. Click an appointment for a side panel (change status, cancel, mark no-show, check out). Appointment statuses: scheduled, confirmed, arrived, waiting, in progress, completed, cancelled, no-show.</w:t>
       </w:r>
     </w:p>
     <w:p>
@@ -1964,15 +2218,15 @@
           <w:sz w:val="22"/>
           <w:szCs w:val="22"/>
         </w:rPr>
-        <w:t xml:space="preserve">Clinic type switch</w:t>
-      </w:r>
-      <w:r>
-        <w:rPr>
-          <w:rFonts w:ascii="Calibri" w:cs="Calibri" w:eastAsia="Calibri" w:hAnsi="Calibri"/>
-          <w:sz w:val="22"/>
-          <w:szCs w:val="22"/>
-        </w:rPr>
-        <w:t xml:space="preserve">: Medical aesthetics, Dermatology, Dental, Physiotherapy, Wellness, General medical, Other. It changes visit tabs, labels and photo checklists.</w:t>
+        <w:t xml:space="preserve">Patients</w:t>
+      </w:r>
+      <w:r>
+        <w:rPr>
+          <w:rFonts w:ascii="Calibri" w:cs="Calibri" w:eastAsia="Calibri" w:hAnsi="Calibri"/>
+          <w:sz w:val="22"/>
+          <w:szCs w:val="22"/>
+        </w:rPr>
+        <w:t xml:space="preserve">: searchable and filterable list (status, tag). Create patient. Patient record has five tabs: Summary, Care history, Photos, Documents &amp; forms, Financials. Includes alerts (allergy, medical), tags, referral source and marketing consent flag.</w:t>
       </w:r>
     </w:p>
     <w:p>
@@ -1992,15 +2246,15 @@
           <w:sz w:val="22"/>
           <w:szCs w:val="22"/>
         </w:rPr>
-        <w:t xml:space="preserve">Billing</w:t>
-      </w:r>
-      <w:r>
-        <w:rPr>
-          <w:rFonts w:ascii="Calibri" w:cs="Calibri" w:eastAsia="Calibri" w:hAnsi="Calibri"/>
-          <w:sz w:val="22"/>
-          <w:szCs w:val="22"/>
-        </w:rPr>
-        <w:t xml:space="preserve">: invoices, estimates, payments, deposits, refunds, checkout dialog.</w:t>
+        <w:t xml:space="preserve">Visits</w:t>
+      </w:r>
+      <w:r>
+        <w:rPr>
+          <w:rFonts w:ascii="Calibri" w:cs="Calibri" w:eastAsia="Calibri" w:hAnsi="Calibri"/>
+          <w:sz w:val="22"/>
+          <w:szCs w:val="22"/>
+        </w:rPr>
+        <w:t xml:space="preserve">: documentation per visit with SOAP-style notes, treatments, forms and consent, follow-up instructions, treatment plan, billing. Tabs adapt to the clinic type and to what each service enables. Aesthetics extras: guided photo capture and an injection plotting map with product and units.</w:t>
       </w:r>
     </w:p>
     <w:p>
@@ -2020,15 +2274,15 @@
           <w:sz w:val="22"/>
           <w:szCs w:val="22"/>
         </w:rPr>
-        <w:t xml:space="preserve">Shell</w:t>
-      </w:r>
-      <w:r>
-        <w:rPr>
-          <w:rFonts w:ascii="Calibri" w:cs="Calibri" w:eastAsia="Calibri" w:hAnsi="Calibri"/>
-          <w:sz w:val="22"/>
-          <w:szCs w:val="22"/>
-        </w:rPr>
-        <w:t xml:space="preserve">: collapsible sidebar, global search (Ctrl+K), notifications, "New" menu, role switcher for demos, guided tour and help panel, mobile bottom navigation, skip-to-content link.</w:t>
+        <w:t xml:space="preserve">Follow-ups</w:t>
+      </w:r>
+      <w:r>
+        <w:rPr>
+          <w:rFonts w:ascii="Calibri" w:cs="Calibri" w:eastAsia="Calibri" w:hAnsi="Calibri"/>
+          <w:sz w:val="22"/>
+          <w:szCs w:val="22"/>
+        </w:rPr>
+        <w:t xml:space="preserve">: due today, overdue, upcoming, completed.</w:t>
       </w:r>
     </w:p>
     <w:p>
@@ -2048,6 +2302,181 @@
           <w:sz w:val="22"/>
           <w:szCs w:val="22"/>
         </w:rPr>
+        <w:t xml:space="preserve">Reports</w:t>
+      </w:r>
+      <w:r>
+        <w:rPr>
+          <w:rFonts w:ascii="Calibri" w:cs="Calibri" w:eastAsia="Calibri" w:hAnsi="Calibri"/>
+          <w:sz w:val="22"/>
+          <w:szCs w:val="22"/>
+        </w:rPr>
+        <w:t xml:space="preserve">: appointment and no-show trends, provider utilization, service volume, provider and patient activity, billing summary, inventory.</w:t>
+      </w:r>
+    </w:p>
+    <w:p>
+      <w:pPr>
+        <w:pStyle w:val="ListParagraph"/>
+        <w:numPr>
+          <w:ilvl w:val="0"/>
+          <w:numId w:val="2"/>
+        </w:numPr>
+        <w:spacing w:after="60"/>
+      </w:pPr>
+      <w:r>
+        <w:rPr>
+          <w:rFonts w:ascii="Calibri" w:cs="Calibri" w:eastAsia="Calibri" w:hAnsi="Calibri"/>
+          <w:b/>
+          <w:bCs/>
+          <w:sz w:val="22"/>
+          <w:szCs w:val="22"/>
+        </w:rPr>
+        <w:t xml:space="preserve">Agents and EVI</w:t>
+      </w:r>
+      <w:r>
+        <w:rPr>
+          <w:rFonts w:ascii="Calibri" w:cs="Calibri" w:eastAsia="Calibri" w:hAnsi="Calibri"/>
+          <w:sz w:val="22"/>
+          <w:szCs w:val="22"/>
+        </w:rPr>
+        <w:t xml:space="preserve">: "EVI" is a chat assistant (Ctrl+J) and agents page. Visit prep, follow-up, appointment, recall, no-show and insights agents produce findings from the mock data. They propose items for a person to approve and never act alone. Engagement, Scribe and Receptionist are shown as not live. This is rule-based logic over sample data, not a connected AI model.</w:t>
+      </w:r>
+    </w:p>
+    <w:p>
+      <w:pPr>
+        <w:pStyle w:val="ListParagraph"/>
+        <w:numPr>
+          <w:ilvl w:val="0"/>
+          <w:numId w:val="2"/>
+        </w:numPr>
+        <w:spacing w:after="60"/>
+      </w:pPr>
+      <w:r>
+        <w:rPr>
+          <w:rFonts w:ascii="Calibri" w:cs="Calibri" w:eastAsia="Calibri" w:hAnsi="Calibri"/>
+          <w:sz w:val="22"/>
+          <w:szCs w:val="22"/>
+        </w:rPr>
+        <w:t xml:space="preserve">**Practice configuration (</w:t>
+      </w:r>
+      <w:r>
+        <w:rPr>
+          <w:rFonts w:ascii="Consolas" w:cs="Consolas" w:eastAsia="Consolas" w:hAnsi="Consolas"/>
+          <w:sz w:val="22"/>
+          <w:szCs w:val="22"/>
+          <w:shd w:fill="F1F3F5" w:val="clear"/>
+        </w:rPr>
+        <w:t xml:space="preserve">/practice/*</w:t>
+      </w:r>
+      <w:r>
+        <w:rPr>
+          <w:rFonts w:ascii="Calibri" w:cs="Calibri" w:eastAsia="Calibri" w:hAnsi="Calibri"/>
+          <w:sz w:val="22"/>
+          <w:szCs w:val="22"/>
+        </w:rPr>
+        <w:t xml:space="preserve">)**: Team (providers and users), Services and treatments (with per-service capability toggles), Inventory, Locations and rooms, Forms (templates), Integrations (EVOQ Campaigns, Billing, Messaging toggles, demo only), Settings (clinic type, scheduling, patient rules, photos, billing, notifications, agents on/off, security, roles and permissions, audit log).</w:t>
+      </w:r>
+    </w:p>
+    <w:p>
+      <w:pPr>
+        <w:pStyle w:val="ListParagraph"/>
+        <w:numPr>
+          <w:ilvl w:val="0"/>
+          <w:numId w:val="2"/>
+        </w:numPr>
+        <w:spacing w:after="60"/>
+      </w:pPr>
+      <w:r>
+        <w:rPr>
+          <w:rFonts w:ascii="Calibri" w:cs="Calibri" w:eastAsia="Calibri" w:hAnsi="Calibri"/>
+          <w:b/>
+          <w:bCs/>
+          <w:sz w:val="22"/>
+          <w:szCs w:val="22"/>
+        </w:rPr>
+        <w:t xml:space="preserve">Clinic type switch</w:t>
+      </w:r>
+      <w:r>
+        <w:rPr>
+          <w:rFonts w:ascii="Calibri" w:cs="Calibri" w:eastAsia="Calibri" w:hAnsi="Calibri"/>
+          <w:sz w:val="22"/>
+          <w:szCs w:val="22"/>
+        </w:rPr>
+        <w:t xml:space="preserve">: Medical aesthetics, Dermatology, Dental, Physiotherapy, Wellness, General medical, Other. It changes visit tabs, labels and photo checklists.</w:t>
+      </w:r>
+    </w:p>
+    <w:p>
+      <w:pPr>
+        <w:pStyle w:val="ListParagraph"/>
+        <w:numPr>
+          <w:ilvl w:val="0"/>
+          <w:numId w:val="2"/>
+        </w:numPr>
+        <w:spacing w:after="60"/>
+      </w:pPr>
+      <w:r>
+        <w:rPr>
+          <w:rFonts w:ascii="Calibri" w:cs="Calibri" w:eastAsia="Calibri" w:hAnsi="Calibri"/>
+          <w:b/>
+          <w:bCs/>
+          <w:sz w:val="22"/>
+          <w:szCs w:val="22"/>
+        </w:rPr>
+        <w:t xml:space="preserve">Billing</w:t>
+      </w:r>
+      <w:r>
+        <w:rPr>
+          <w:rFonts w:ascii="Calibri" w:cs="Calibri" w:eastAsia="Calibri" w:hAnsi="Calibri"/>
+          <w:sz w:val="22"/>
+          <w:szCs w:val="22"/>
+        </w:rPr>
+        <w:t xml:space="preserve">: invoices, estimates, payments, deposits, refunds, checkout dialog.</w:t>
+      </w:r>
+    </w:p>
+    <w:p>
+      <w:pPr>
+        <w:pStyle w:val="ListParagraph"/>
+        <w:numPr>
+          <w:ilvl w:val="0"/>
+          <w:numId w:val="2"/>
+        </w:numPr>
+        <w:spacing w:after="60"/>
+      </w:pPr>
+      <w:r>
+        <w:rPr>
+          <w:rFonts w:ascii="Calibri" w:cs="Calibri" w:eastAsia="Calibri" w:hAnsi="Calibri"/>
+          <w:b/>
+          <w:bCs/>
+          <w:sz w:val="22"/>
+          <w:szCs w:val="22"/>
+        </w:rPr>
+        <w:t xml:space="preserve">Shell</w:t>
+      </w:r>
+      <w:r>
+        <w:rPr>
+          <w:rFonts w:ascii="Calibri" w:cs="Calibri" w:eastAsia="Calibri" w:hAnsi="Calibri"/>
+          <w:sz w:val="22"/>
+          <w:szCs w:val="22"/>
+        </w:rPr>
+        <w:t xml:space="preserve">: collapsible sidebar, global search (Ctrl+K), notifications, "New" menu, role switcher for demos, guided tour and help panel, mobile bottom navigation, skip-to-content link.</w:t>
+      </w:r>
+    </w:p>
+    <w:p>
+      <w:pPr>
+        <w:pStyle w:val="ListParagraph"/>
+        <w:numPr>
+          <w:ilvl w:val="0"/>
+          <w:numId w:val="2"/>
+        </w:numPr>
+        <w:spacing w:after="60"/>
+      </w:pPr>
+      <w:r>
+        <w:rPr>
+          <w:rFonts w:ascii="Calibri" w:cs="Calibri" w:eastAsia="Calibri" w:hAnsi="Calibri"/>
+          <w:b/>
+          <w:bCs/>
+          <w:sz w:val="22"/>
+          <w:szCs w:val="22"/>
+        </w:rPr>
         <w:t xml:space="preserve">Onboarding</w:t>
       </w:r>
       <w:r>
@@ -2086,7 +2515,7 @@
           <w:sz w:val="22"/>
           <w:szCs w:val="22"/>
         </w:rPr>
-        <w:t xml:space="preserve">Six roles. Permissions can be edited per role in Practice &gt; Settings. Owner is fixed. Permissions saved in a browser replace the defaults (a known limitation after adding new ones).</w:t>
+        <w:t xml:space="preserve">Six roles. Permissions can be edited per role in Practice &gt; Settings. Owner is fixed. Permissions saved earlier in a browser are kept, and the newer defaults are merged in once.</w:t>
       </w:r>
     </w:p>
     <w:tbl>
@@ -4358,7 +4787,7 @@
                 <w:sz w:val="19"/>
                 <w:szCs w:val="19"/>
               </w:rPr>
-              <w:t xml:space="preserve">CRM and enquiries</w:t>
+              <w:t xml:space="preserve">CRM</w:t>
             </w:r>
           </w:p>
         </w:tc>
@@ -4532,6 +4961,205 @@
               </w:rPr>
               <w:t xml:space="preserve">✓</w:t>
             </w:r>
+          </w:p>
+        </w:tc>
+      </w:tr>
+      <w:tr>
+        <w:trPr>
+          <w:tblHeader w:val="off"/>
+        </w:trPr>
+        <w:tc>
+          <w:tcPr>
+            <w:tcW w:type="dxa" w:w="3000"/>
+            <w:tcBorders>
+              <w:top w:val="single" w:color="D5DBE1" w:sz="4"/>
+              <w:left w:val="single" w:color="D5DBE1" w:sz="4"/>
+              <w:bottom w:val="single" w:color="D5DBE1" w:sz="4"/>
+              <w:right w:val="single" w:color="D5DBE1" w:sz="4"/>
+            </w:tcBorders>
+            <w:tcMar>
+              <w:top w:type="dxa" w:w="60"/>
+              <w:left w:type="dxa" w:w="100"/>
+              <w:bottom w:type="dxa" w:w="60"/>
+              <w:right w:type="dxa" w:w="100"/>
+            </w:tcMar>
+          </w:tcPr>
+          <w:p>
+            <w:pPr>
+              <w:jc w:val="left"/>
+            </w:pPr>
+            <w:r>
+              <w:rPr>
+                <w:rFonts w:ascii="Calibri" w:cs="Calibri" w:eastAsia="Calibri" w:hAnsi="Calibri"/>
+                <w:b w:val="false"/>
+                <w:bCs w:val="false"/>
+                <w:sz w:val="19"/>
+                <w:szCs w:val="19"/>
+              </w:rPr>
+              <w:t xml:space="preserve">Enquiries</w:t>
+            </w:r>
+          </w:p>
+        </w:tc>
+        <w:tc>
+          <w:tcPr>
+            <w:tcW w:type="dxa" w:w="1060"/>
+            <w:tcBorders>
+              <w:top w:val="single" w:color="D5DBE1" w:sz="4"/>
+              <w:left w:val="single" w:color="D5DBE1" w:sz="4"/>
+              <w:bottom w:val="single" w:color="D5DBE1" w:sz="4"/>
+              <w:right w:val="single" w:color="D5DBE1" w:sz="4"/>
+            </w:tcBorders>
+            <w:tcMar>
+              <w:top w:type="dxa" w:w="60"/>
+              <w:left w:type="dxa" w:w="100"/>
+              <w:bottom w:type="dxa" w:w="60"/>
+              <w:right w:type="dxa" w:w="100"/>
+            </w:tcMar>
+          </w:tcPr>
+          <w:p>
+            <w:pPr>
+              <w:jc w:val="center"/>
+            </w:pPr>
+            <w:r>
+              <w:rPr>
+                <w:rFonts w:ascii="Calibri" w:cs="Calibri" w:eastAsia="Calibri" w:hAnsi="Calibri"/>
+                <w:b w:val="false"/>
+                <w:bCs w:val="false"/>
+                <w:sz w:val="19"/>
+                <w:szCs w:val="19"/>
+              </w:rPr>
+              <w:t xml:space="preserve">✓</w:t>
+            </w:r>
+          </w:p>
+        </w:tc>
+        <w:tc>
+          <w:tcPr>
+            <w:tcW w:type="dxa" w:w="1060"/>
+            <w:tcBorders>
+              <w:top w:val="single" w:color="D5DBE1" w:sz="4"/>
+              <w:left w:val="single" w:color="D5DBE1" w:sz="4"/>
+              <w:bottom w:val="single" w:color="D5DBE1" w:sz="4"/>
+              <w:right w:val="single" w:color="D5DBE1" w:sz="4"/>
+            </w:tcBorders>
+            <w:tcMar>
+              <w:top w:type="dxa" w:w="60"/>
+              <w:left w:type="dxa" w:w="100"/>
+              <w:bottom w:type="dxa" w:w="60"/>
+              <w:right w:type="dxa" w:w="100"/>
+            </w:tcMar>
+          </w:tcPr>
+          <w:p>
+            <w:pPr>
+              <w:jc w:val="center"/>
+            </w:pPr>
+            <w:r>
+              <w:rPr>
+                <w:rFonts w:ascii="Calibri" w:cs="Calibri" w:eastAsia="Calibri" w:hAnsi="Calibri"/>
+                <w:b w:val="false"/>
+                <w:bCs w:val="false"/>
+                <w:sz w:val="19"/>
+                <w:szCs w:val="19"/>
+              </w:rPr>
+              <w:t xml:space="preserve">✓</w:t>
+            </w:r>
+          </w:p>
+        </w:tc>
+        <w:tc>
+          <w:tcPr>
+            <w:tcW w:type="dxa" w:w="1060"/>
+            <w:tcBorders>
+              <w:top w:val="single" w:color="D5DBE1" w:sz="4"/>
+              <w:left w:val="single" w:color="D5DBE1" w:sz="4"/>
+              <w:bottom w:val="single" w:color="D5DBE1" w:sz="4"/>
+              <w:right w:val="single" w:color="D5DBE1" w:sz="4"/>
+            </w:tcBorders>
+            <w:tcMar>
+              <w:top w:type="dxa" w:w="60"/>
+              <w:left w:type="dxa" w:w="100"/>
+              <w:bottom w:type="dxa" w:w="60"/>
+              <w:right w:type="dxa" w:w="100"/>
+            </w:tcMar>
+          </w:tcPr>
+          <w:p>
+            <w:pPr>
+              <w:jc w:val="center"/>
+            </w:pPr>
+          </w:p>
+        </w:tc>
+        <w:tc>
+          <w:tcPr>
+            <w:tcW w:type="dxa" w:w="1060"/>
+            <w:tcBorders>
+              <w:top w:val="single" w:color="D5DBE1" w:sz="4"/>
+              <w:left w:val="single" w:color="D5DBE1" w:sz="4"/>
+              <w:bottom w:val="single" w:color="D5DBE1" w:sz="4"/>
+              <w:right w:val="single" w:color="D5DBE1" w:sz="4"/>
+            </w:tcBorders>
+            <w:tcMar>
+              <w:top w:type="dxa" w:w="60"/>
+              <w:left w:type="dxa" w:w="100"/>
+              <w:bottom w:type="dxa" w:w="60"/>
+              <w:right w:type="dxa" w:w="100"/>
+            </w:tcMar>
+          </w:tcPr>
+          <w:p>
+            <w:pPr>
+              <w:jc w:val="center"/>
+            </w:pPr>
+            <w:r>
+              <w:rPr>
+                <w:rFonts w:ascii="Calibri" w:cs="Calibri" w:eastAsia="Calibri" w:hAnsi="Calibri"/>
+                <w:b w:val="false"/>
+                <w:bCs w:val="false"/>
+                <w:sz w:val="19"/>
+                <w:szCs w:val="19"/>
+              </w:rPr>
+              <w:t xml:space="preserve">✓</w:t>
+            </w:r>
+          </w:p>
+        </w:tc>
+        <w:tc>
+          <w:tcPr>
+            <w:tcW w:type="dxa" w:w="1060"/>
+            <w:tcBorders>
+              <w:top w:val="single" w:color="D5DBE1" w:sz="4"/>
+              <w:left w:val="single" w:color="D5DBE1" w:sz="4"/>
+              <w:bottom w:val="single" w:color="D5DBE1" w:sz="4"/>
+              <w:right w:val="single" w:color="D5DBE1" w:sz="4"/>
+            </w:tcBorders>
+            <w:tcMar>
+              <w:top w:type="dxa" w:w="60"/>
+              <w:left w:type="dxa" w:w="100"/>
+              <w:bottom w:type="dxa" w:w="60"/>
+              <w:right w:type="dxa" w:w="100"/>
+            </w:tcMar>
+          </w:tcPr>
+          <w:p>
+            <w:pPr>
+              <w:jc w:val="center"/>
+            </w:pPr>
+          </w:p>
+        </w:tc>
+        <w:tc>
+          <w:tcPr>
+            <w:tcW w:type="dxa" w:w="1060"/>
+            <w:tcBorders>
+              <w:top w:val="single" w:color="D5DBE1" w:sz="4"/>
+              <w:left w:val="single" w:color="D5DBE1" w:sz="4"/>
+              <w:bottom w:val="single" w:color="D5DBE1" w:sz="4"/>
+              <w:right w:val="single" w:color="D5DBE1" w:sz="4"/>
+            </w:tcBorders>
+            <w:tcMar>
+              <w:top w:type="dxa" w:w="60"/>
+              <w:left w:type="dxa" w:w="100"/>
+              <w:bottom w:type="dxa" w:w="60"/>
+              <w:right w:type="dxa" w:w="100"/>
+            </w:tcMar>
+          </w:tcPr>
+          <w:p>
+            <w:pPr>
+              <w:jc w:val="center"/>
+            </w:pPr>
           </w:p>
         </w:tc>
       </w:tr>
@@ -5411,24 +6039,7 @@
           <w:sz w:val="22"/>
           <w:szCs w:val="22"/>
         </w:rPr>
-        <w:t xml:space="preserve"> permission is defined but no screen checks it yet, so a Marketing user can still open </w:t>
-      </w:r>
-      <w:r>
-        <w:rPr>
-          <w:rFonts w:ascii="Consolas" w:cs="Consolas" w:eastAsia="Consolas" w:hAnsi="Consolas"/>
-          <w:sz w:val="22"/>
-          <w:szCs w:val="22"/>
-          <w:shd w:fill="F1F3F5" w:val="clear"/>
-        </w:rPr>
-        <w:t xml:space="preserve">/patients</w:t>
-      </w:r>
-      <w:r>
-        <w:rPr>
-          <w:rFonts w:ascii="Calibri" w:cs="Calibri" w:eastAsia="Calibri" w:hAnsi="Calibri"/>
-          <w:sz w:val="22"/>
-          <w:szCs w:val="22"/>
-        </w:rPr>
-        <w:t xml:space="preserve"> directly.</w:t>
+        <w:t xml:space="preserve"> permission now blocks the patient-facing pages (Today, Calendar, Patients, Visits, Follow-ups, Agents), including by direct URL. Marketing lands on Marketing Insights.</w:t>
       </w:r>
     </w:p>
     <w:p>
@@ -5446,7 +6057,7 @@
           <w:sz w:val="22"/>
           <w:szCs w:val="22"/>
         </w:rPr>
-        <w:t xml:space="preserve">CRM, booking and campaign permissions currently only decide whether the module shows in the nav and whether its skeleton page opens, because the modules have no features yet.</w:t>
+        <w:t xml:space="preserve">Enquiries and Marketing Insights check their permission on the page, not just in the menu. A switched-off optional module also blocks its direct URL.</w:t>
       </w:r>
     </w:p>
     <w:p>
@@ -5464,24 +6075,7 @@
           <w:sz w:val="22"/>
           <w:szCs w:val="22"/>
         </w:rPr>
-        <w:t xml:space="preserve">"View as role (demo)" in the account menu switches roles for testing. A real app must do this server-side.</w:t>
-      </w:r>
-    </w:p>
-    <w:p>
-      <w:pPr>
-        <w:pStyle w:val="Heading2"/>
-        <w:spacing w:after="120" w:before="280"/>
-      </w:pPr>
-      <w:r>
-        <w:rPr>
-          <w:rFonts w:ascii="Calibri" w:cs="Calibri" w:eastAsia="Calibri" w:hAnsi="Calibri"/>
-          <w:b/>
-          <w:bCs/>
-          <w:color w:val="26384B"/>
-          <w:sz w:val="28"/>
-          <w:szCs w:val="28"/>
-        </w:rPr>
-        <w:t xml:space="preserve">6. Data and the shared Contact idea</w:t>
+        <w:t xml:space="preserve">CRM, booking and campaign permissions only gate their preview pages, because those modules have no features yet.</w:t>
       </w:r>
     </w:p>
     <w:p>
@@ -5499,41 +6093,7 @@
           <w:sz w:val="22"/>
           <w:szCs w:val="22"/>
         </w:rPr>
-        <w:t xml:space="preserve">Sample data lives in </w:t>
-      </w:r>
-      <w:r>
-        <w:rPr>
-          <w:rFonts w:ascii="Consolas" w:cs="Consolas" w:eastAsia="Consolas" w:hAnsi="Consolas"/>
-          <w:sz w:val="22"/>
-          <w:szCs w:val="22"/>
-          <w:shd w:fill="F1F3F5" w:val="clear"/>
-        </w:rPr>
-        <w:t xml:space="preserve">src/lib/db.ts</w:t>
-      </w:r>
-      <w:r>
-        <w:rPr>
-          <w:rFonts w:ascii="Calibri" w:cs="Calibri" w:eastAsia="Calibri" w:hAnsi="Calibri"/>
-          <w:sz w:val="22"/>
-          <w:szCs w:val="22"/>
-        </w:rPr>
-        <w:t xml:space="preserve"> and </w:t>
-      </w:r>
-      <w:r>
-        <w:rPr>
-          <w:rFonts w:ascii="Consolas" w:cs="Consolas" w:eastAsia="Consolas" w:hAnsi="Consolas"/>
-          <w:sz w:val="22"/>
-          <w:szCs w:val="22"/>
-          <w:shd w:fill="F1F3F5" w:val="clear"/>
-        </w:rPr>
-        <w:t xml:space="preserve">src/lib/clinical.ts</w:t>
-      </w:r>
-      <w:r>
-        <w:rPr>
-          <w:rFonts w:ascii="Calibri" w:cs="Calibri" w:eastAsia="Calibri" w:hAnsi="Calibri"/>
-          <w:sz w:val="22"/>
-          <w:szCs w:val="22"/>
-        </w:rPr>
-        <w:t xml:space="preserve">: 12 patients, 3 providers, 7 services, 2 locations, 6 rooms, 6 users, appointments dated around 2026-10-07 (a fixed "today" and a demo clock), visits, photos, invoices, inventory, forms, treatment plans, audit entries.</w:t>
+        <w:t xml:space="preserve">Marketing can still open practice configuration pages (Team, Services, Locations, Forms), which had no permission before.</w:t>
       </w:r>
     </w:p>
     <w:p>
@@ -5551,7 +6111,24 @@
           <w:sz w:val="22"/>
           <w:szCs w:val="22"/>
         </w:rPr>
-        <w:t xml:space="preserve">Changes during a session are held in memory and lost on reload.</w:t>
+        <w:t xml:space="preserve">"View as role (demo)" in the account menu switches roles for testing. A real app must do this server-side.</w:t>
+      </w:r>
+    </w:p>
+    <w:p>
+      <w:pPr>
+        <w:pStyle w:val="Heading2"/>
+        <w:spacing w:after="120" w:before="280"/>
+      </w:pPr>
+      <w:r>
+        <w:rPr>
+          <w:rFonts w:ascii="Calibri" w:cs="Calibri" w:eastAsia="Calibri" w:hAnsi="Calibri"/>
+          <w:b/>
+          <w:bCs/>
+          <w:color w:val="26384B"/>
+          <w:sz w:val="28"/>
+          <w:szCs w:val="28"/>
+        </w:rPr>
+        <w:t xml:space="preserve">6. Data and the shared Contact idea</w:t>
       </w:r>
     </w:p>
     <w:p>
@@ -5565,20 +6142,28 @@
       </w:pPr>
       <w:r>
         <w:rPr>
+          <w:rFonts w:ascii="Calibri" w:cs="Calibri" w:eastAsia="Calibri" w:hAnsi="Calibri"/>
+          <w:sz w:val="22"/>
+          <w:szCs w:val="22"/>
+        </w:rPr>
+        <w:t xml:space="preserve">Sample data lives in </w:t>
+      </w:r>
+      <w:r>
+        <w:rPr>
           <w:rFonts w:ascii="Consolas" w:cs="Consolas" w:eastAsia="Consolas" w:hAnsi="Consolas"/>
           <w:sz w:val="22"/>
           <w:szCs w:val="22"/>
           <w:shd w:fill="F1F3F5" w:val="clear"/>
         </w:rPr>
-        <w:t xml:space="preserve">Contact</w:t>
-      </w:r>
-      <w:r>
-        <w:rPr>
-          <w:rFonts w:ascii="Calibri" w:cs="Calibri" w:eastAsia="Calibri" w:hAnsi="Calibri"/>
-          <w:sz w:val="22"/>
-          <w:szCs w:val="22"/>
-        </w:rPr>
-        <w:t xml:space="preserve"> (</w:t>
+        <w:t xml:space="preserve">src/lib/db.ts</w:t>
+      </w:r>
+      <w:r>
+        <w:rPr>
+          <w:rFonts w:ascii="Calibri" w:cs="Calibri" w:eastAsia="Calibri" w:hAnsi="Calibri"/>
+          <w:sz w:val="22"/>
+          <w:szCs w:val="22"/>
+        </w:rPr>
+        <w:t xml:space="preserve"> and </w:t>
       </w:r>
       <w:r>
         <w:rPr>
@@ -5587,32 +6172,15 @@
           <w:szCs w:val="22"/>
           <w:shd w:fill="F1F3F5" w:val="clear"/>
         </w:rPr>
-        <w:t xml:space="preserve">src/platform/contact.ts</w:t>
-      </w:r>
-      <w:r>
-        <w:rPr>
-          <w:rFonts w:ascii="Calibri" w:cs="Calibri" w:eastAsia="Calibri" w:hAnsi="Calibri"/>
-          <w:sz w:val="22"/>
-          <w:szCs w:val="22"/>
-        </w:rPr>
-        <w:t xml:space="preserve">) is a proposed shared person record with per-channel, per-purpose consent. It is not wired into PMS data. CRM shows contacts derived from patients as an interim demo. Ownership between Patient, CRM and Contact is a decision still to agree with the backend developer (see ARCHITECTURE.md).</w:t>
-      </w:r>
-    </w:p>
-    <w:p>
-      <w:pPr>
-        <w:pStyle w:val="Heading2"/>
-        <w:spacing w:after="120" w:before="280"/>
-      </w:pPr>
-      <w:r>
-        <w:rPr>
-          <w:rFonts w:ascii="Calibri" w:cs="Calibri" w:eastAsia="Calibri" w:hAnsi="Calibri"/>
-          <w:b/>
-          <w:bCs/>
-          <w:color w:val="26384B"/>
-          <w:sz w:val="28"/>
-          <w:szCs w:val="28"/>
-        </w:rPr>
-        <w:t xml:space="preserve">7. Not built or not real</w:t>
+        <w:t xml:space="preserve">src/lib/clinical.ts</w:t>
+      </w:r>
+      <w:r>
+        <w:rPr>
+          <w:rFonts w:ascii="Calibri" w:cs="Calibri" w:eastAsia="Calibri" w:hAnsi="Calibri"/>
+          <w:sz w:val="22"/>
+          <w:szCs w:val="22"/>
+        </w:rPr>
+        <w:t xml:space="preserve">: 12 patients, 3 providers, 7 services, 2 locations, 6 rooms, 6 users, appointments dated around 2026-10-07 (a fixed "today" and a demo clock), visits, photos, invoices, inventory, forms, treatment plans, audit entries.</w:t>
       </w:r>
     </w:p>
     <w:p>
@@ -5630,7 +6198,7 @@
           <w:sz w:val="22"/>
           <w:szCs w:val="22"/>
         </w:rPr>
-        <w:t xml:space="preserve">Backend, database, real authentication (sessions, MFA, email verification are simulated).</w:t>
+        <w:t xml:space="preserve">Changes during a session are held in memory and lost on reload.</w:t>
       </w:r>
     </w:p>
     <w:p>
@@ -5644,11 +6212,54 @@
       </w:pPr>
       <w:r>
         <w:rPr>
-          <w:rFonts w:ascii="Calibri" w:cs="Calibri" w:eastAsia="Calibri" w:hAnsi="Calibri"/>
-          <w:sz w:val="22"/>
-          <w:szCs w:val="22"/>
-        </w:rPr>
-        <w:t xml:space="preserve">CRM, Booking and Campaigns features. Messaging, email/SMS sending, online booking page, payment processing, EVOQ Billing and Campaigns connections.</w:t>
+          <w:rFonts w:ascii="Consolas" w:cs="Consolas" w:eastAsia="Consolas" w:hAnsi="Consolas"/>
+          <w:sz w:val="22"/>
+          <w:szCs w:val="22"/>
+          <w:shd w:fill="F1F3F5" w:val="clear"/>
+        </w:rPr>
+        <w:t xml:space="preserve">Contact</w:t>
+      </w:r>
+      <w:r>
+        <w:rPr>
+          <w:rFonts w:ascii="Calibri" w:cs="Calibri" w:eastAsia="Calibri" w:hAnsi="Calibri"/>
+          <w:sz w:val="22"/>
+          <w:szCs w:val="22"/>
+        </w:rPr>
+        <w:t xml:space="preserve"> (</w:t>
+      </w:r>
+      <w:r>
+        <w:rPr>
+          <w:rFonts w:ascii="Consolas" w:cs="Consolas" w:eastAsia="Consolas" w:hAnsi="Consolas"/>
+          <w:sz w:val="22"/>
+          <w:szCs w:val="22"/>
+          <w:shd w:fill="F1F3F5" w:val="clear"/>
+        </w:rPr>
+        <w:t xml:space="preserve">src/platform/contact.ts</w:t>
+      </w:r>
+      <w:r>
+        <w:rPr>
+          <w:rFonts w:ascii="Calibri" w:cs="Calibri" w:eastAsia="Calibri" w:hAnsi="Calibri"/>
+          <w:sz w:val="22"/>
+          <w:szCs w:val="22"/>
+        </w:rPr>
+        <w:t xml:space="preserve">) is a proposed shared person record with per-channel, per-purpose consent. It is not wired into PMS data. CRM shows contacts derived from patients as an interim demo. Ownership between Patient, CRM and Contact is a decision still to agree with the backend developer (see ARCHITECTURE.md).</w:t>
+      </w:r>
+    </w:p>
+    <w:p>
+      <w:pPr>
+        <w:pStyle w:val="Heading2"/>
+        <w:spacing w:after="120" w:before="280"/>
+      </w:pPr>
+      <w:r>
+        <w:rPr>
+          <w:rFonts w:ascii="Calibri" w:cs="Calibri" w:eastAsia="Calibri" w:hAnsi="Calibri"/>
+          <w:b/>
+          <w:bCs/>
+          <w:color w:val="26384B"/>
+          <w:sz w:val="28"/>
+          <w:szCs w:val="28"/>
+        </w:rPr>
+        <w:t xml:space="preserve">7. Not built or not real</w:t>
       </w:r>
     </w:p>
     <w:p>
@@ -5666,7 +6277,7 @@
           <w:sz w:val="22"/>
           <w:szCs w:val="22"/>
         </w:rPr>
-        <w:t xml:space="preserve">Real AI. File storage (uploaded photos and documents are not persisted).</w:t>
+        <w:t xml:space="preserve">Backend, database, real authentication (sessions, MFA, email verification are simulated).</w:t>
       </w:r>
     </w:p>
     <w:p>
@@ -5684,7 +6295,7 @@
           <w:sz w:val="22"/>
           <w:szCs w:val="22"/>
         </w:rPr>
-        <w:t xml:space="preserve">Automated tests, accessibility audit, audit-log persistence, data export beyond the audit-log CSV.</w:t>
+        <w:t xml:space="preserve">CRM, Online Bookings and Campaigns features. Messaging, email/SMS sending, online booking page, payment processing, EVOQ Billing and Campaigns connections.</w:t>
       </w:r>
     </w:p>
     <w:p>
@@ -5702,24 +6313,7 @@
           <w:sz w:val="22"/>
           <w:szCs w:val="22"/>
         </w:rPr>
-        <w:t xml:space="preserve">Multi-clinic tenancy: one practice per browser.</w:t>
-      </w:r>
-    </w:p>
-    <w:p>
-      <w:pPr>
-        <w:pStyle w:val="Heading2"/>
-        <w:spacing w:after="120" w:before="280"/>
-      </w:pPr>
-      <w:r>
-        <w:rPr>
-          <w:rFonts w:ascii="Calibri" w:cs="Calibri" w:eastAsia="Calibri" w:hAnsi="Calibri"/>
-          <w:b/>
-          <w:bCs/>
-          <w:color w:val="26384B"/>
-          <w:sz w:val="28"/>
-          <w:szCs w:val="28"/>
-        </w:rPr>
-        <w:t xml:space="preserve">8. Risks to know before building further</w:t>
+        <w:t xml:space="preserve">Enquiries are not yet part of Reports or EVI agents, and enquiry follow-up tasks are separate from patient Follow-ups.</w:t>
       </w:r>
     </w:p>
     <w:p>
@@ -5737,7 +6331,7 @@
           <w:sz w:val="22"/>
           <w:szCs w:val="22"/>
         </w:rPr>
-        <w:t xml:space="preserve">Roles and permissions are only enforced in the browser, so they must be enforced by the backend.</w:t>
+        <w:t xml:space="preserve">Real AI. File storage (uploaded photos and documents are not persisted).</w:t>
       </w:r>
     </w:p>
     <w:p>
@@ -5755,7 +6349,7 @@
           <w:sz w:val="22"/>
           <w:szCs w:val="22"/>
         </w:rPr>
-        <w:t xml:space="preserve">Patient data is clinical data. A real backend needs encryption, access logging and consent enforcement before any real records are used.</w:t>
+        <w:t xml:space="preserve">Automated tests, accessibility audit, audit-log persistence, data export beyond the audit-log CSV.</w:t>
       </w:r>
     </w:p>
     <w:p>
@@ -5773,24 +6367,24 @@
           <w:sz w:val="22"/>
           <w:szCs w:val="22"/>
         </w:rPr>
-        <w:t xml:space="preserve">Internal storage keys and some names still say </w:t>
-      </w:r>
-      <w:r>
-        <w:rPr>
-          <w:rFonts w:ascii="Consolas" w:cs="Consolas" w:eastAsia="Consolas" w:hAnsi="Consolas"/>
-          <w:sz w:val="22"/>
-          <w:szCs w:val="22"/>
-          <w:shd w:fill="F1F3F5" w:val="clear"/>
-        </w:rPr>
-        <w:t xml:space="preserve">pms.*</w:t>
-      </w:r>
-      <w:r>
-        <w:rPr>
-          <w:rFonts w:ascii="Calibri" w:cs="Calibri" w:eastAsia="Calibri" w:hAnsi="Calibri"/>
-          <w:sz w:val="22"/>
-          <w:szCs w:val="22"/>
-        </w:rPr>
-        <w:t xml:space="preserve">. Safe to leave, costly to rename later without migration.</w:t>
+        <w:t xml:space="preserve">Multi-clinic tenancy: one practice per browser.</w:t>
+      </w:r>
+    </w:p>
+    <w:p>
+      <w:pPr>
+        <w:pStyle w:val="Heading2"/>
+        <w:spacing w:after="120" w:before="280"/>
+      </w:pPr>
+      <w:r>
+        <w:rPr>
+          <w:rFonts w:ascii="Calibri" w:cs="Calibri" w:eastAsia="Calibri" w:hAnsi="Calibri"/>
+          <w:b/>
+          <w:bCs/>
+          <w:color w:val="26384B"/>
+          <w:sz w:val="28"/>
+          <w:szCs w:val="28"/>
+        </w:rPr>
+        <w:t xml:space="preserve">8. Risks to know before building further</w:t>
       </w:r>
     </w:p>
     <w:p>
@@ -5808,6 +6402,77 @@
           <w:sz w:val="22"/>
           <w:szCs w:val="22"/>
         </w:rPr>
+        <w:t xml:space="preserve">Roles and permissions are only enforced in the browser, so they must be enforced by the backend.</w:t>
+      </w:r>
+    </w:p>
+    <w:p>
+      <w:pPr>
+        <w:pStyle w:val="ListParagraph"/>
+        <w:numPr>
+          <w:ilvl w:val="0"/>
+          <w:numId w:val="2"/>
+        </w:numPr>
+        <w:spacing w:after="60"/>
+      </w:pPr>
+      <w:r>
+        <w:rPr>
+          <w:rFonts w:ascii="Calibri" w:cs="Calibri" w:eastAsia="Calibri" w:hAnsi="Calibri"/>
+          <w:sz w:val="22"/>
+          <w:szCs w:val="22"/>
+        </w:rPr>
+        <w:t xml:space="preserve">Patient data is clinical data. A real backend needs encryption, access logging and consent enforcement before any real records are used.</w:t>
+      </w:r>
+    </w:p>
+    <w:p>
+      <w:pPr>
+        <w:pStyle w:val="ListParagraph"/>
+        <w:numPr>
+          <w:ilvl w:val="0"/>
+          <w:numId w:val="2"/>
+        </w:numPr>
+        <w:spacing w:after="60"/>
+      </w:pPr>
+      <w:r>
+        <w:rPr>
+          <w:rFonts w:ascii="Calibri" w:cs="Calibri" w:eastAsia="Calibri" w:hAnsi="Calibri"/>
+          <w:sz w:val="22"/>
+          <w:szCs w:val="22"/>
+        </w:rPr>
+        <w:t xml:space="preserve">Internal storage keys and some names still say </w:t>
+      </w:r>
+      <w:r>
+        <w:rPr>
+          <w:rFonts w:ascii="Consolas" w:cs="Consolas" w:eastAsia="Consolas" w:hAnsi="Consolas"/>
+          <w:sz w:val="22"/>
+          <w:szCs w:val="22"/>
+          <w:shd w:fill="F1F3F5" w:val="clear"/>
+        </w:rPr>
+        <w:t xml:space="preserve">pms.*</w:t>
+      </w:r>
+      <w:r>
+        <w:rPr>
+          <w:rFonts w:ascii="Calibri" w:cs="Calibri" w:eastAsia="Calibri" w:hAnsi="Calibri"/>
+          <w:sz w:val="22"/>
+          <w:szCs w:val="22"/>
+        </w:rPr>
+        <w:t xml:space="preserve">. Safe to leave, costly to rename later without migration.</w:t>
+      </w:r>
+    </w:p>
+    <w:p>
+      <w:pPr>
+        <w:pStyle w:val="ListParagraph"/>
+        <w:numPr>
+          <w:ilvl w:val="0"/>
+          <w:numId w:val="2"/>
+        </w:numPr>
+        <w:spacing w:after="60"/>
+      </w:pPr>
+      <w:r>
+        <w:rPr>
+          <w:rFonts w:ascii="Calibri" w:cs="Calibri" w:eastAsia="Calibri" w:hAnsi="Calibri"/>
+          <w:sz w:val="22"/>
+          <w:szCs w:val="22"/>
+        </w:rPr>
         <w:t xml:space="preserve">Patient identity is stored on </w:t>
       </w:r>
       <w:r>
@@ -5890,15 +6555,15 @@
           <w:sz w:val="22"/>
           <w:szCs w:val="22"/>
         </w:rPr>
-        <w:t xml:space="preserve">Build one module's UI next</w:t>
-      </w:r>
-      <w:r>
-        <w:rPr>
-          <w:rFonts w:ascii="Calibri" w:cs="Calibri" w:eastAsia="Calibri" w:hAnsi="Calibri"/>
-          <w:sz w:val="22"/>
-          <w:szCs w:val="22"/>
-        </w:rPr>
-        <w:t xml:space="preserve">, most reuse first: Booking (can reuse providers, services, rooms and availability), then CRM (enquiries and pipeline), then Campaigns (audiences and consent).</w:t>
+        <w:t xml:space="preserve">Build the next module's UI</w:t>
+      </w:r>
+      <w:r>
+        <w:rPr>
+          <w:rFonts w:ascii="Calibri" w:cs="Calibri" w:eastAsia="Calibri" w:hAnsi="Calibri"/>
+          <w:sz w:val="22"/>
+          <w:szCs w:val="22"/>
+        </w:rPr>
+        <w:t xml:space="preserve">, most reuse first: Online Bookings (can reuse providers, services, rooms and availability), then CRM, then Campaigns (audiences and consent).</w:t>
       </w:r>
     </w:p>
     <w:p>
@@ -5918,15 +6583,15 @@
           <w:sz w:val="22"/>
           <w:szCs w:val="22"/>
         </w:rPr>
-        <w:t xml:space="preserve">Close the permission gaps</w:t>
-      </w:r>
-      <w:r>
-        <w:rPr>
-          <w:rFonts w:ascii="Calibri" w:cs="Calibri" w:eastAsia="Calibri" w:hAnsi="Calibri"/>
-          <w:sz w:val="22"/>
-          <w:szCs w:val="22"/>
-        </w:rPr>
-        <w:t xml:space="preserve"> in the frontend: enforce Patient data, add view-only booking and insights behaviors.</w:t>
+        <w:t xml:space="preserve">Close remaining permission gaps</w:t>
+      </w:r>
+      <w:r>
+        <w:rPr>
+          <w:rFonts w:ascii="Calibri" w:cs="Calibri" w:eastAsia="Calibri" w:hAnsi="Calibri"/>
+          <w:sz w:val="22"/>
+          <w:szCs w:val="22"/>
+        </w:rPr>
+        <w:t xml:space="preserve">: view-only booking behavior and permissions for the practice configuration pages.</w:t>
       </w:r>
     </w:p>
     <w:p>

</xml_diff>

<commit_message>
Stabilize enquiries, permissions and views
- Enquiries link to real appointments and patients; cancelled or missed
  appointments reopen the enquiry and keep its history
- Marketing Insights counts linked appointments (logic moved to insights.ts)
- Practice configuration and read-only enquiry permissions; role
  permissions stored as overrides on top of defaults
- Board and Flow views (Flow fits phones), detail panel footer redesign
- Unit tests (npm test) and updated architecture and overview docs

Co-Authored-By: Claude Sonnet 5.5 <noreply@anthropic.com>
</commit_message>
<xml_diff>
--- a/docs/APP_OVERVIEW.docx
+++ b/docs/APP_OVERVIEW.docx
@@ -29,24 +29,7 @@
           <w:sz w:val="22"/>
           <w:szCs w:val="22"/>
         </w:rPr>
-        <w:t xml:space="preserve">Status snapshot of the frontend after the Enquiries, Marketing Insights and navigation work (commit </w:t>
-      </w:r>
-      <w:r>
-        <w:rPr>
-          <w:rFonts w:ascii="Consolas" w:cs="Consolas" w:eastAsia="Consolas" w:hAnsi="Consolas"/>
-          <w:sz w:val="22"/>
-          <w:szCs w:val="22"/>
-          <w:shd w:fill="F1F3F5" w:val="clear"/>
-        </w:rPr>
-        <w:t xml:space="preserve">af261dd</w:t>
-      </w:r>
-      <w:r>
-        <w:rPr>
-          <w:rFonts w:ascii="Calibri" w:cs="Calibri" w:eastAsia="Calibri" w:hAnsi="Calibri"/>
-          <w:sz w:val="22"/>
-          <w:szCs w:val="22"/>
-        </w:rPr>
-        <w:t xml:space="preserve">). For the target structure see </w:t>
+        <w:t xml:space="preserve">Status snapshot of the frontend after the Enquiries, Marketing Insights and navigation work (after the stabilization pass). For the target structure see </w:t>
       </w:r>
       <w:r>
         <w:rPr>
@@ -767,13 +750,24 @@
             </w:pPr>
             <w:r>
               <w:rPr>
-                <w:rFonts w:ascii="Calibri" w:cs="Calibri" w:eastAsia="Calibri" w:hAnsi="Calibri"/>
-                <w:b w:val="false"/>
-                <w:bCs w:val="false"/>
-                <w:sz w:val="19"/>
-                <w:szCs w:val="19"/>
-              </w:rPr>
-              <w:t xml:space="preserve">None</w:t>
+                <w:rFonts w:ascii="Consolas" w:cs="Consolas" w:eastAsia="Consolas" w:hAnsi="Consolas"/>
+                <w:b w:val="false"/>
+                <w:bCs w:val="false"/>
+                <w:sz w:val="19"/>
+                <w:szCs w:val="19"/>
+                <w:shd w:fill="F1F3F5" w:val="clear"/>
+              </w:rPr>
+              <w:t xml:space="preserve">npm test</w:t>
+            </w:r>
+            <w:r>
+              <w:rPr>
+                <w:rFonts w:ascii="Calibri" w:cs="Calibri" w:eastAsia="Calibri" w:hAnsi="Calibri"/>
+                <w:b w:val="false"/>
+                <w:bCs w:val="false"/>
+                <w:sz w:val="19"/>
+                <w:szCs w:val="19"/>
+              </w:rPr>
+              <w:t xml:space="preserve">: 12 unit tests for permissions, appointment/insights logic and the Flow layout. No UI test suite</w:t>
             </w:r>
           </w:p>
         </w:tc>
@@ -1988,15 +1982,15 @@
           <w:sz w:val="22"/>
           <w:szCs w:val="22"/>
         </w:rPr>
-        <w:t xml:space="preserve">Enquiry detail panel</w:t>
-      </w:r>
-      <w:r>
-        <w:rPr>
-          <w:rFonts w:ascii="Calibri" w:cs="Calibri" w:eastAsia="Calibri" w:hAnsi="Calibri"/>
-          <w:sz w:val="22"/>
-          <w:szCs w:val="22"/>
-        </w:rPr>
-        <w:t xml:space="preserve">: contact details, requested service, source, status and assignee (editable), notes, follow-up tasks (add, mark done, overdue flag) and history.</w:t>
+        <w:t xml:space="preserve">Three views</w:t>
+      </w:r>
+      <w:r>
+        <w:rPr>
+          <w:rFonts w:ascii="Calibri" w:cs="Calibri" w:eastAsia="Calibri" w:hAnsi="Calibri"/>
+          <w:sz w:val="22"/>
+          <w:szCs w:val="22"/>
+        </w:rPr>
+        <w:t xml:space="preserve">: List, Board (stage columns with drag between stages and quick buttons) and Flow (Source to Stage ribbon diagram with a side panel; fits phone screens without sideways scrolling). The choice is remembered per browser.</w:t>
       </w:r>
     </w:p>
     <w:p>
@@ -2016,15 +2010,15 @@
           <w:sz w:val="22"/>
           <w:szCs w:val="22"/>
         </w:rPr>
-        <w:t xml:space="preserve">Actions</w:t>
-      </w:r>
-      <w:r>
-        <w:rPr>
-          <w:rFonts w:ascii="Calibri" w:cs="Calibri" w:eastAsia="Calibri" w:hAnsi="Calibri"/>
-          <w:sz w:val="22"/>
-          <w:szCs w:val="22"/>
-        </w:rPr>
-        <w:t xml:space="preserve">: create and edit an enquiry (validated; phone or email required; no clinical details collected), change status, assign staff, close or mark not converted, link to an existing patient (matches are suggested, never automatic) or create a patient (demo), and book an appointment using the existing appointment panel, prefilled from the enquiry. Booking marks the enquiry "Appointment booked".</w:t>
+        <w:t xml:space="preserve">Enquiry detail panel</w:t>
+      </w:r>
+      <w:r>
+        <w:rPr>
+          <w:rFonts w:ascii="Calibri" w:cs="Calibri" w:eastAsia="Calibri" w:hAnsi="Calibri"/>
+          <w:sz w:val="22"/>
+          <w:szCs w:val="22"/>
+        </w:rPr>
+        <w:t xml:space="preserve">: contact details, requested service, source, status and assignee (editable), notes, follow-up tasks (add, mark done, overdue flag) and history.</w:t>
       </w:r>
     </w:p>
     <w:p>
@@ -2044,15 +2038,15 @@
           <w:sz w:val="22"/>
           <w:szCs w:val="22"/>
         </w:rPr>
-        <w:t xml:space="preserve">Marketing Insights (`/marketing-insights`)</w:t>
-      </w:r>
-      <w:r>
-        <w:rPr>
-          <w:rFonts w:ascii="Calibri" w:cs="Calibri" w:eastAsia="Calibri" w:hAnsi="Calibri"/>
-          <w:sz w:val="22"/>
-          <w:szCs w:val="22"/>
-        </w:rPr>
-        <w:t xml:space="preserve">: total enquiries, appointments from enquiries, enquiry-to-appointment rate, enquiries over time, by source, conversion by source and campaign attribution. Labelled demo data. No ad platform or analytics is connected.</w:t>
+        <w:t xml:space="preserve">Appointments</w:t>
+      </w:r>
+      <w:r>
+        <w:rPr>
+          <w:rFonts w:ascii="Calibri" w:cs="Calibri" w:eastAsia="Calibri" w:hAnsi="Calibri"/>
+          <w:sz w:val="22"/>
+          <w:szCs w:val="22"/>
+        </w:rPr>
+        <w:t xml:space="preserve">: an enquiry links to a real appointment. Cancelled or missed appointments reopen the enquiry, keep its history and show a rebook prompt. Marketing Insights counts linked appointments, not statuses.</w:t>
       </w:r>
     </w:p>
     <w:p>
@@ -2072,15 +2066,15 @@
           <w:sz w:val="22"/>
           <w:szCs w:val="22"/>
         </w:rPr>
-        <w:t xml:space="preserve">Today page</w:t>
-      </w:r>
-      <w:r>
-        <w:rPr>
-          <w:rFonts w:ascii="Calibri" w:cs="Calibri" w:eastAsia="Calibri" w:hAnsi="Calibri"/>
-          <w:sz w:val="22"/>
-          <w:szCs w:val="22"/>
-        </w:rPr>
-        <w:t xml:space="preserve">: an "Enquiries to follow up" panel and a "New enquiry" quick action, for roles with the Enquiries permission.</w:t>
+        <w:t xml:space="preserve">Actions</w:t>
+      </w:r>
+      <w:r>
+        <w:rPr>
+          <w:rFonts w:ascii="Calibri" w:cs="Calibri" w:eastAsia="Calibri" w:hAnsi="Calibri"/>
+          <w:sz w:val="22"/>
+          <w:szCs w:val="22"/>
+        </w:rPr>
+        <w:t xml:space="preserve">: create and edit an enquiry (validated; phone or email required; no clinical details collected), change status, assign staff, close or mark not converted, link to an existing patient (matches are suggested, never automatic) or create a patient (demo), and book an appointment using the existing appointment panel, prefilled from the enquiry. Booking marks the enquiry "Appointment booked".</w:t>
       </w:r>
     </w:p>
     <w:p>
@@ -2100,32 +2094,15 @@
           <w:sz w:val="22"/>
           <w:szCs w:val="22"/>
         </w:rPr>
-        <w:t xml:space="preserve">Previews</w:t>
-      </w:r>
-      <w:r>
-        <w:rPr>
-          <w:rFonts w:ascii="Calibri" w:cs="Calibri" w:eastAsia="Calibri" w:hAnsi="Calibri"/>
-          <w:sz w:val="22"/>
-          <w:szCs w:val="22"/>
-        </w:rPr>
-        <w:t xml:space="preserve">: CRM, Online Bookings and Campaigns pages explain what is planned and are labelled "Preview".</w:t>
-      </w:r>
-    </w:p>
-    <w:p>
-      <w:pPr>
-        <w:pStyle w:val="Heading3"/>
-        <w:spacing w:after="120" w:before="280"/>
-      </w:pPr>
-      <w:r>
-        <w:rPr>
-          <w:rFonts w:ascii="Calibri" w:cs="Calibri" w:eastAsia="Calibri" w:hAnsi="Calibri"/>
-          <w:b/>
-          <w:bCs/>
-          <w:color w:val="26384B"/>
-          <w:sz w:val="24"/>
-          <w:szCs w:val="24"/>
-        </w:rPr>
-        <w:t xml:space="preserve">Practice (PMS) module</w:t>
+        <w:t xml:space="preserve">Marketing Insights (`/marketing-insights`)</w:t>
+      </w:r>
+      <w:r>
+        <w:rPr>
+          <w:rFonts w:ascii="Calibri" w:cs="Calibri" w:eastAsia="Calibri" w:hAnsi="Calibri"/>
+          <w:sz w:val="22"/>
+          <w:szCs w:val="22"/>
+        </w:rPr>
+        <w:t xml:space="preserve">: total enquiries, appointments from enquiries, enquiry-to-appointment rate, enquiries over time, by source, conversion by source and campaign attribution. Labelled demo data. No ad platform or analytics is connected.</w:t>
       </w:r>
     </w:p>
     <w:p>
@@ -2145,32 +2122,15 @@
           <w:sz w:val="22"/>
           <w:szCs w:val="22"/>
         </w:rPr>
-        <w:t xml:space="preserve">Today (`/overview`)</w:t>
-      </w:r>
-      <w:r>
-        <w:rPr>
-          <w:rFonts w:ascii="Calibri" w:cs="Calibri" w:eastAsia="Calibri" w:hAnsi="Calibri"/>
-          <w:sz w:val="22"/>
-          <w:szCs w:val="22"/>
-        </w:rPr>
-        <w:t xml:space="preserve">: day schedule with filters, "needs attention" list, who is waiting, and a Patient flow (front desk) view with 8 patients per page. </w:t>
-      </w:r>
-      <w:r>
-        <w:rPr>
-          <w:rFonts w:ascii="Consolas" w:cs="Consolas" w:eastAsia="Consolas" w:hAnsi="Consolas"/>
-          <w:sz w:val="22"/>
-          <w:szCs w:val="22"/>
-          <w:shd w:fill="F1F3F5" w:val="clear"/>
-        </w:rPr>
-        <w:t xml:space="preserve">/front-desk</w:t>
-      </w:r>
-      <w:r>
-        <w:rPr>
-          <w:rFonts w:ascii="Calibri" w:cs="Calibri" w:eastAsia="Calibri" w:hAnsi="Calibri"/>
-          <w:sz w:val="22"/>
-          <w:szCs w:val="22"/>
-        </w:rPr>
-        <w:t xml:space="preserve"> redirects here.</w:t>
+        <w:t xml:space="preserve">Today page</w:t>
+      </w:r>
+      <w:r>
+        <w:rPr>
+          <w:rFonts w:ascii="Calibri" w:cs="Calibri" w:eastAsia="Calibri" w:hAnsi="Calibri"/>
+          <w:sz w:val="22"/>
+          <w:szCs w:val="22"/>
+        </w:rPr>
+        <w:t xml:space="preserve">: an "Enquiries to follow up" panel and a "New enquiry" quick action, for roles with the Enquiries permission.</w:t>
       </w:r>
     </w:p>
     <w:p>
@@ -2190,15 +2150,32 @@
           <w:sz w:val="22"/>
           <w:szCs w:val="22"/>
         </w:rPr>
-        <w:t xml:space="preserve">Calendar</w:t>
-      </w:r>
-      <w:r>
-        <w:rPr>
-          <w:rFonts w:ascii="Calibri" w:cs="Calibri" w:eastAsia="Calibri" w:hAnsi="Calibri"/>
-          <w:sz w:val="22"/>
-          <w:szCs w:val="22"/>
-        </w:rPr>
-        <w:t xml:space="preserve">: day, week and month views of appointments by provider, room and location. Click an appointment for a side panel (change status, cancel, mark no-show, check out). Appointment statuses: scheduled, confirmed, arrived, waiting, in progress, completed, cancelled, no-show.</w:t>
+        <w:t xml:space="preserve">Previews</w:t>
+      </w:r>
+      <w:r>
+        <w:rPr>
+          <w:rFonts w:ascii="Calibri" w:cs="Calibri" w:eastAsia="Calibri" w:hAnsi="Calibri"/>
+          <w:sz w:val="22"/>
+          <w:szCs w:val="22"/>
+        </w:rPr>
+        <w:t xml:space="preserve">: CRM, Online Bookings and Campaigns pages explain what is planned and are labelled "Preview".</w:t>
+      </w:r>
+    </w:p>
+    <w:p>
+      <w:pPr>
+        <w:pStyle w:val="Heading3"/>
+        <w:spacing w:after="120" w:before="280"/>
+      </w:pPr>
+      <w:r>
+        <w:rPr>
+          <w:rFonts w:ascii="Calibri" w:cs="Calibri" w:eastAsia="Calibri" w:hAnsi="Calibri"/>
+          <w:b/>
+          <w:bCs/>
+          <w:color w:val="26384B"/>
+          <w:sz w:val="24"/>
+          <w:szCs w:val="24"/>
+        </w:rPr>
+        <w:t xml:space="preserve">Practice (PMS) module</w:t>
       </w:r>
     </w:p>
     <w:p>
@@ -2218,15 +2195,32 @@
           <w:sz w:val="22"/>
           <w:szCs w:val="22"/>
         </w:rPr>
-        <w:t xml:space="preserve">Patients</w:t>
-      </w:r>
-      <w:r>
-        <w:rPr>
-          <w:rFonts w:ascii="Calibri" w:cs="Calibri" w:eastAsia="Calibri" w:hAnsi="Calibri"/>
-          <w:sz w:val="22"/>
-          <w:szCs w:val="22"/>
-        </w:rPr>
-        <w:t xml:space="preserve">: searchable and filterable list (status, tag). Create patient. Patient record has five tabs: Summary, Care history, Photos, Documents &amp; forms, Financials. Includes alerts (allergy, medical), tags, referral source and marketing consent flag.</w:t>
+        <w:t xml:space="preserve">Today (`/overview`)</w:t>
+      </w:r>
+      <w:r>
+        <w:rPr>
+          <w:rFonts w:ascii="Calibri" w:cs="Calibri" w:eastAsia="Calibri" w:hAnsi="Calibri"/>
+          <w:sz w:val="22"/>
+          <w:szCs w:val="22"/>
+        </w:rPr>
+        <w:t xml:space="preserve">: day schedule with filters, "needs attention" list, who is waiting, and a Patient flow (front desk) view with 8 patients per page. </w:t>
+      </w:r>
+      <w:r>
+        <w:rPr>
+          <w:rFonts w:ascii="Consolas" w:cs="Consolas" w:eastAsia="Consolas" w:hAnsi="Consolas"/>
+          <w:sz w:val="22"/>
+          <w:szCs w:val="22"/>
+          <w:shd w:fill="F1F3F5" w:val="clear"/>
+        </w:rPr>
+        <w:t xml:space="preserve">/front-desk</w:t>
+      </w:r>
+      <w:r>
+        <w:rPr>
+          <w:rFonts w:ascii="Calibri" w:cs="Calibri" w:eastAsia="Calibri" w:hAnsi="Calibri"/>
+          <w:sz w:val="22"/>
+          <w:szCs w:val="22"/>
+        </w:rPr>
+        <w:t xml:space="preserve"> redirects here.</w:t>
       </w:r>
     </w:p>
     <w:p>
@@ -2246,15 +2240,15 @@
           <w:sz w:val="22"/>
           <w:szCs w:val="22"/>
         </w:rPr>
-        <w:t xml:space="preserve">Visits</w:t>
-      </w:r>
-      <w:r>
-        <w:rPr>
-          <w:rFonts w:ascii="Calibri" w:cs="Calibri" w:eastAsia="Calibri" w:hAnsi="Calibri"/>
-          <w:sz w:val="22"/>
-          <w:szCs w:val="22"/>
-        </w:rPr>
-        <w:t xml:space="preserve">: documentation per visit with SOAP-style notes, treatments, forms and consent, follow-up instructions, treatment plan, billing. Tabs adapt to the clinic type and to what each service enables. Aesthetics extras: guided photo capture and an injection plotting map with product and units.</w:t>
+        <w:t xml:space="preserve">Calendar</w:t>
+      </w:r>
+      <w:r>
+        <w:rPr>
+          <w:rFonts w:ascii="Calibri" w:cs="Calibri" w:eastAsia="Calibri" w:hAnsi="Calibri"/>
+          <w:sz w:val="22"/>
+          <w:szCs w:val="22"/>
+        </w:rPr>
+        <w:t xml:space="preserve">: day, week and month views of appointments by provider, room and location. Click an appointment for a side panel (change status, cancel, mark no-show, check out). Appointment statuses: scheduled, confirmed, arrived, waiting, in progress, completed, cancelled, no-show.</w:t>
       </w:r>
     </w:p>
     <w:p>
@@ -2274,15 +2268,15 @@
           <w:sz w:val="22"/>
           <w:szCs w:val="22"/>
         </w:rPr>
-        <w:t xml:space="preserve">Follow-ups</w:t>
-      </w:r>
-      <w:r>
-        <w:rPr>
-          <w:rFonts w:ascii="Calibri" w:cs="Calibri" w:eastAsia="Calibri" w:hAnsi="Calibri"/>
-          <w:sz w:val="22"/>
-          <w:szCs w:val="22"/>
-        </w:rPr>
-        <w:t xml:space="preserve">: due today, overdue, upcoming, completed.</w:t>
+        <w:t xml:space="preserve">Patients</w:t>
+      </w:r>
+      <w:r>
+        <w:rPr>
+          <w:rFonts w:ascii="Calibri" w:cs="Calibri" w:eastAsia="Calibri" w:hAnsi="Calibri"/>
+          <w:sz w:val="22"/>
+          <w:szCs w:val="22"/>
+        </w:rPr>
+        <w:t xml:space="preserve">: searchable and filterable list (status, tag). Create patient. Patient record has five tabs: Summary, Care history, Photos, Documents &amp; forms, Financials. Includes alerts (allergy, medical), tags, referral source and marketing consent flag.</w:t>
       </w:r>
     </w:p>
     <w:p>
@@ -2302,15 +2296,15 @@
           <w:sz w:val="22"/>
           <w:szCs w:val="22"/>
         </w:rPr>
-        <w:t xml:space="preserve">Reports</w:t>
-      </w:r>
-      <w:r>
-        <w:rPr>
-          <w:rFonts w:ascii="Calibri" w:cs="Calibri" w:eastAsia="Calibri" w:hAnsi="Calibri"/>
-          <w:sz w:val="22"/>
-          <w:szCs w:val="22"/>
-        </w:rPr>
-        <w:t xml:space="preserve">: appointment and no-show trends, provider utilization, service volume, provider and patient activity, billing summary, inventory.</w:t>
+        <w:t xml:space="preserve">Visits</w:t>
+      </w:r>
+      <w:r>
+        <w:rPr>
+          <w:rFonts w:ascii="Calibri" w:cs="Calibri" w:eastAsia="Calibri" w:hAnsi="Calibri"/>
+          <w:sz w:val="22"/>
+          <w:szCs w:val="22"/>
+        </w:rPr>
+        <w:t xml:space="preserve">: documentation per visit with SOAP-style notes, treatments, forms and consent, follow-up instructions, treatment plan, billing. Tabs adapt to the clinic type and to what each service enables. Aesthetics extras: guided photo capture and an injection plotting map with product and units.</w:t>
       </w:r>
     </w:p>
     <w:p>
@@ -2330,15 +2324,15 @@
           <w:sz w:val="22"/>
           <w:szCs w:val="22"/>
         </w:rPr>
-        <w:t xml:space="preserve">Agents and EVI</w:t>
-      </w:r>
-      <w:r>
-        <w:rPr>
-          <w:rFonts w:ascii="Calibri" w:cs="Calibri" w:eastAsia="Calibri" w:hAnsi="Calibri"/>
-          <w:sz w:val="22"/>
-          <w:szCs w:val="22"/>
-        </w:rPr>
-        <w:t xml:space="preserve">: "EVI" is a chat assistant (Ctrl+J) and agents page. Visit prep, follow-up, appointment, recall, no-show and insights agents produce findings from the mock data. They propose items for a person to approve and never act alone. Engagement, Scribe and Receptionist are shown as not live. This is rule-based logic over sample data, not a connected AI model.</w:t>
+        <w:t xml:space="preserve">Follow-ups</w:t>
+      </w:r>
+      <w:r>
+        <w:rPr>
+          <w:rFonts w:ascii="Calibri" w:cs="Calibri" w:eastAsia="Calibri" w:hAnsi="Calibri"/>
+          <w:sz w:val="22"/>
+          <w:szCs w:val="22"/>
+        </w:rPr>
+        <w:t xml:space="preserve">: due today, overdue, upcoming, completed.</w:t>
       </w:r>
     </w:p>
     <w:p>
@@ -2353,27 +2347,20 @@
       <w:r>
         <w:rPr>
           <w:rFonts w:ascii="Calibri" w:cs="Calibri" w:eastAsia="Calibri" w:hAnsi="Calibri"/>
-          <w:sz w:val="22"/>
-          <w:szCs w:val="22"/>
-        </w:rPr>
-        <w:t xml:space="preserve">**Practice configuration (</w:t>
-      </w:r>
-      <w:r>
-        <w:rPr>
-          <w:rFonts w:ascii="Consolas" w:cs="Consolas" w:eastAsia="Consolas" w:hAnsi="Consolas"/>
-          <w:sz w:val="22"/>
-          <w:szCs w:val="22"/>
-          <w:shd w:fill="F1F3F5" w:val="clear"/>
-        </w:rPr>
-        <w:t xml:space="preserve">/practice/*</w:t>
-      </w:r>
-      <w:r>
-        <w:rPr>
-          <w:rFonts w:ascii="Calibri" w:cs="Calibri" w:eastAsia="Calibri" w:hAnsi="Calibri"/>
-          <w:sz w:val="22"/>
-          <w:szCs w:val="22"/>
-        </w:rPr>
-        <w:t xml:space="preserve">)**: Team (providers and users), Services and treatments (with per-service capability toggles), Inventory, Locations and rooms, Forms (templates), Integrations (EVOQ Campaigns, Billing, Messaging toggles, demo only), Settings (clinic type, scheduling, patient rules, photos, billing, notifications, agents on/off, security, roles and permissions, audit log).</w:t>
+          <w:b/>
+          <w:bCs/>
+          <w:sz w:val="22"/>
+          <w:szCs w:val="22"/>
+        </w:rPr>
+        <w:t xml:space="preserve">Reports</w:t>
+      </w:r>
+      <w:r>
+        <w:rPr>
+          <w:rFonts w:ascii="Calibri" w:cs="Calibri" w:eastAsia="Calibri" w:hAnsi="Calibri"/>
+          <w:sz w:val="22"/>
+          <w:szCs w:val="22"/>
+        </w:rPr>
+        <w:t xml:space="preserve">: appointment and no-show trends, provider utilization, service volume, provider and patient activity, billing summary, inventory.</w:t>
       </w:r>
     </w:p>
     <w:p>
@@ -2393,15 +2380,15 @@
           <w:sz w:val="22"/>
           <w:szCs w:val="22"/>
         </w:rPr>
-        <w:t xml:space="preserve">Clinic type switch</w:t>
-      </w:r>
-      <w:r>
-        <w:rPr>
-          <w:rFonts w:ascii="Calibri" w:cs="Calibri" w:eastAsia="Calibri" w:hAnsi="Calibri"/>
-          <w:sz w:val="22"/>
-          <w:szCs w:val="22"/>
-        </w:rPr>
-        <w:t xml:space="preserve">: Medical aesthetics, Dermatology, Dental, Physiotherapy, Wellness, General medical, Other. It changes visit tabs, labels and photo checklists.</w:t>
+        <w:t xml:space="preserve">Agents and EVI</w:t>
+      </w:r>
+      <w:r>
+        <w:rPr>
+          <w:rFonts w:ascii="Calibri" w:cs="Calibri" w:eastAsia="Calibri" w:hAnsi="Calibri"/>
+          <w:sz w:val="22"/>
+          <w:szCs w:val="22"/>
+        </w:rPr>
+        <w:t xml:space="preserve">: "EVI" is a chat assistant (Ctrl+J) and agents page. Visit prep, follow-up, appointment, recall, no-show and insights agents produce findings from the mock data. They propose items for a person to approve and never act alone. Engagement, Scribe and Receptionist are shown as not live. This is rule-based logic over sample data, not a connected AI model.</w:t>
       </w:r>
     </w:p>
     <w:p>
@@ -2416,20 +2403,27 @@
       <w:r>
         <w:rPr>
           <w:rFonts w:ascii="Calibri" w:cs="Calibri" w:eastAsia="Calibri" w:hAnsi="Calibri"/>
-          <w:b/>
-          <w:bCs/>
-          <w:sz w:val="22"/>
-          <w:szCs w:val="22"/>
-        </w:rPr>
-        <w:t xml:space="preserve">Billing</w:t>
-      </w:r>
-      <w:r>
-        <w:rPr>
-          <w:rFonts w:ascii="Calibri" w:cs="Calibri" w:eastAsia="Calibri" w:hAnsi="Calibri"/>
-          <w:sz w:val="22"/>
-          <w:szCs w:val="22"/>
-        </w:rPr>
-        <w:t xml:space="preserve">: invoices, estimates, payments, deposits, refunds, checkout dialog.</w:t>
+          <w:sz w:val="22"/>
+          <w:szCs w:val="22"/>
+        </w:rPr>
+        <w:t xml:space="preserve">**Practice configuration (</w:t>
+      </w:r>
+      <w:r>
+        <w:rPr>
+          <w:rFonts w:ascii="Consolas" w:cs="Consolas" w:eastAsia="Consolas" w:hAnsi="Consolas"/>
+          <w:sz w:val="22"/>
+          <w:szCs w:val="22"/>
+          <w:shd w:fill="F1F3F5" w:val="clear"/>
+        </w:rPr>
+        <w:t xml:space="preserve">/practice/*</w:t>
+      </w:r>
+      <w:r>
+        <w:rPr>
+          <w:rFonts w:ascii="Calibri" w:cs="Calibri" w:eastAsia="Calibri" w:hAnsi="Calibri"/>
+          <w:sz w:val="22"/>
+          <w:szCs w:val="22"/>
+        </w:rPr>
+        <w:t xml:space="preserve">)**: Team (providers and users), Services and treatments (with per-service capability toggles), Inventory, Locations and rooms, Forms (templates), Integrations (EVOQ Campaigns, Billing, Messaging toggles, demo only), Settings (clinic type, scheduling, patient rules, photos, billing, notifications, agents on/off, security, roles and permissions, audit log).</w:t>
       </w:r>
     </w:p>
     <w:p>
@@ -2449,15 +2443,15 @@
           <w:sz w:val="22"/>
           <w:szCs w:val="22"/>
         </w:rPr>
-        <w:t xml:space="preserve">Shell</w:t>
-      </w:r>
-      <w:r>
-        <w:rPr>
-          <w:rFonts w:ascii="Calibri" w:cs="Calibri" w:eastAsia="Calibri" w:hAnsi="Calibri"/>
-          <w:sz w:val="22"/>
-          <w:szCs w:val="22"/>
-        </w:rPr>
-        <w:t xml:space="preserve">: collapsible sidebar, global search (Ctrl+K), notifications, "New" menu, role switcher for demos, guided tour and help panel, mobile bottom navigation, skip-to-content link.</w:t>
+        <w:t xml:space="preserve">Clinic type switch</w:t>
+      </w:r>
+      <w:r>
+        <w:rPr>
+          <w:rFonts w:ascii="Calibri" w:cs="Calibri" w:eastAsia="Calibri" w:hAnsi="Calibri"/>
+          <w:sz w:val="22"/>
+          <w:szCs w:val="22"/>
+        </w:rPr>
+        <w:t xml:space="preserve">: Medical aesthetics, Dermatology, Dental, Physiotherapy, Wellness, General medical, Other. It changes visit tabs, labels and photo checklists.</w:t>
       </w:r>
     </w:p>
     <w:p>
@@ -2477,6 +2471,62 @@
           <w:sz w:val="22"/>
           <w:szCs w:val="22"/>
         </w:rPr>
+        <w:t xml:space="preserve">Billing</w:t>
+      </w:r>
+      <w:r>
+        <w:rPr>
+          <w:rFonts w:ascii="Calibri" w:cs="Calibri" w:eastAsia="Calibri" w:hAnsi="Calibri"/>
+          <w:sz w:val="22"/>
+          <w:szCs w:val="22"/>
+        </w:rPr>
+        <w:t xml:space="preserve">: invoices, estimates, payments, deposits, refunds, checkout dialog.</w:t>
+      </w:r>
+    </w:p>
+    <w:p>
+      <w:pPr>
+        <w:pStyle w:val="ListParagraph"/>
+        <w:numPr>
+          <w:ilvl w:val="0"/>
+          <w:numId w:val="2"/>
+        </w:numPr>
+        <w:spacing w:after="60"/>
+      </w:pPr>
+      <w:r>
+        <w:rPr>
+          <w:rFonts w:ascii="Calibri" w:cs="Calibri" w:eastAsia="Calibri" w:hAnsi="Calibri"/>
+          <w:b/>
+          <w:bCs/>
+          <w:sz w:val="22"/>
+          <w:szCs w:val="22"/>
+        </w:rPr>
+        <w:t xml:space="preserve">Shell</w:t>
+      </w:r>
+      <w:r>
+        <w:rPr>
+          <w:rFonts w:ascii="Calibri" w:cs="Calibri" w:eastAsia="Calibri" w:hAnsi="Calibri"/>
+          <w:sz w:val="22"/>
+          <w:szCs w:val="22"/>
+        </w:rPr>
+        <w:t xml:space="preserve">: collapsible sidebar, global search (Ctrl+K), notifications, "New" menu, role switcher for demos, guided tour and help panel, mobile bottom navigation, skip-to-content link.</w:t>
+      </w:r>
+    </w:p>
+    <w:p>
+      <w:pPr>
+        <w:pStyle w:val="ListParagraph"/>
+        <w:numPr>
+          <w:ilvl w:val="0"/>
+          <w:numId w:val="2"/>
+        </w:numPr>
+        <w:spacing w:after="60"/>
+      </w:pPr>
+      <w:r>
+        <w:rPr>
+          <w:rFonts w:ascii="Calibri" w:cs="Calibri" w:eastAsia="Calibri" w:hAnsi="Calibri"/>
+          <w:b/>
+          <w:bCs/>
+          <w:sz w:val="22"/>
+          <w:szCs w:val="22"/>
+        </w:rPr>
         <w:t xml:space="preserve">Onboarding</w:t>
       </w:r>
       <w:r>
@@ -2515,7 +2565,7 @@
           <w:sz w:val="22"/>
           <w:szCs w:val="22"/>
         </w:rPr>
-        <w:t xml:space="preserve">Six roles. Permissions can be edited per role in Practice &gt; Settings. Owner is fixed. Permissions saved earlier in a browser are kept, and the newer defaults are merged in once.</w:t>
+        <w:t xml:space="preserve">Six roles. Permissions can be edited per role in Practice &gt; Settings. Owner is fixed. Only a role's changes are stored, on top of the code defaults, so new defaults reach roles that did not customize that permission and custom choices are never overwritten.</w:t>
       </w:r>
     </w:p>
     <w:tbl>
@@ -4996,7 +5046,7 @@
                 <w:sz w:val="19"/>
                 <w:szCs w:val="19"/>
               </w:rPr>
-              <w:t xml:space="preserve">Enquiries</w:t>
+              <w:t xml:space="preserve">Manage enquiries</w:t>
             </w:r>
           </w:p>
         </w:tc>
@@ -5138,6 +5188,434 @@
             <w:pPr>
               <w:jc w:val="center"/>
             </w:pPr>
+          </w:p>
+        </w:tc>
+        <w:tc>
+          <w:tcPr>
+            <w:tcW w:type="dxa" w:w="1060"/>
+            <w:tcBorders>
+              <w:top w:val="single" w:color="D5DBE1" w:sz="4"/>
+              <w:left w:val="single" w:color="D5DBE1" w:sz="4"/>
+              <w:bottom w:val="single" w:color="D5DBE1" w:sz="4"/>
+              <w:right w:val="single" w:color="D5DBE1" w:sz="4"/>
+            </w:tcBorders>
+            <w:tcMar>
+              <w:top w:type="dxa" w:w="60"/>
+              <w:left w:type="dxa" w:w="100"/>
+              <w:bottom w:type="dxa" w:w="60"/>
+              <w:right w:type="dxa" w:w="100"/>
+            </w:tcMar>
+          </w:tcPr>
+          <w:p>
+            <w:pPr>
+              <w:jc w:val="center"/>
+            </w:pPr>
+          </w:p>
+        </w:tc>
+      </w:tr>
+      <w:tr>
+        <w:trPr>
+          <w:tblHeader w:val="off"/>
+        </w:trPr>
+        <w:tc>
+          <w:tcPr>
+            <w:tcW w:type="dxa" w:w="3000"/>
+            <w:tcBorders>
+              <w:top w:val="single" w:color="D5DBE1" w:sz="4"/>
+              <w:left w:val="single" w:color="D5DBE1" w:sz="4"/>
+              <w:bottom w:val="single" w:color="D5DBE1" w:sz="4"/>
+              <w:right w:val="single" w:color="D5DBE1" w:sz="4"/>
+            </w:tcBorders>
+            <w:tcMar>
+              <w:top w:type="dxa" w:w="60"/>
+              <w:left w:type="dxa" w:w="100"/>
+              <w:bottom w:type="dxa" w:w="60"/>
+              <w:right w:type="dxa" w:w="100"/>
+            </w:tcMar>
+          </w:tcPr>
+          <w:p>
+            <w:pPr>
+              <w:jc w:val="left"/>
+            </w:pPr>
+            <w:r>
+              <w:rPr>
+                <w:rFonts w:ascii="Calibri" w:cs="Calibri" w:eastAsia="Calibri" w:hAnsi="Calibri"/>
+                <w:b w:val="false"/>
+                <w:bCs w:val="false"/>
+                <w:sz w:val="19"/>
+                <w:szCs w:val="19"/>
+              </w:rPr>
+              <w:t xml:space="preserve">View enquiries (read-only)</w:t>
+            </w:r>
+          </w:p>
+        </w:tc>
+        <w:tc>
+          <w:tcPr>
+            <w:tcW w:type="dxa" w:w="1060"/>
+            <w:tcBorders>
+              <w:top w:val="single" w:color="D5DBE1" w:sz="4"/>
+              <w:left w:val="single" w:color="D5DBE1" w:sz="4"/>
+              <w:bottom w:val="single" w:color="D5DBE1" w:sz="4"/>
+              <w:right w:val="single" w:color="D5DBE1" w:sz="4"/>
+            </w:tcBorders>
+            <w:tcMar>
+              <w:top w:type="dxa" w:w="60"/>
+              <w:left w:type="dxa" w:w="100"/>
+              <w:bottom w:type="dxa" w:w="60"/>
+              <w:right w:type="dxa" w:w="100"/>
+            </w:tcMar>
+          </w:tcPr>
+          <w:p>
+            <w:pPr>
+              <w:jc w:val="center"/>
+            </w:pPr>
+            <w:r>
+              <w:rPr>
+                <w:rFonts w:ascii="Calibri" w:cs="Calibri" w:eastAsia="Calibri" w:hAnsi="Calibri"/>
+                <w:b w:val="false"/>
+                <w:bCs w:val="false"/>
+                <w:sz w:val="19"/>
+                <w:szCs w:val="19"/>
+              </w:rPr>
+              <w:t xml:space="preserve">✓</w:t>
+            </w:r>
+          </w:p>
+        </w:tc>
+        <w:tc>
+          <w:tcPr>
+            <w:tcW w:type="dxa" w:w="1060"/>
+            <w:tcBorders>
+              <w:top w:val="single" w:color="D5DBE1" w:sz="4"/>
+              <w:left w:val="single" w:color="D5DBE1" w:sz="4"/>
+              <w:bottom w:val="single" w:color="D5DBE1" w:sz="4"/>
+              <w:right w:val="single" w:color="D5DBE1" w:sz="4"/>
+            </w:tcBorders>
+            <w:tcMar>
+              <w:top w:type="dxa" w:w="60"/>
+              <w:left w:type="dxa" w:w="100"/>
+              <w:bottom w:type="dxa" w:w="60"/>
+              <w:right w:type="dxa" w:w="100"/>
+            </w:tcMar>
+          </w:tcPr>
+          <w:p>
+            <w:pPr>
+              <w:jc w:val="center"/>
+            </w:pPr>
+            <w:r>
+              <w:rPr>
+                <w:rFonts w:ascii="Calibri" w:cs="Calibri" w:eastAsia="Calibri" w:hAnsi="Calibri"/>
+                <w:b w:val="false"/>
+                <w:bCs w:val="false"/>
+                <w:sz w:val="19"/>
+                <w:szCs w:val="19"/>
+              </w:rPr>
+              <w:t xml:space="preserve">✓</w:t>
+            </w:r>
+          </w:p>
+        </w:tc>
+        <w:tc>
+          <w:tcPr>
+            <w:tcW w:type="dxa" w:w="1060"/>
+            <w:tcBorders>
+              <w:top w:val="single" w:color="D5DBE1" w:sz="4"/>
+              <w:left w:val="single" w:color="D5DBE1" w:sz="4"/>
+              <w:bottom w:val="single" w:color="D5DBE1" w:sz="4"/>
+              <w:right w:val="single" w:color="D5DBE1" w:sz="4"/>
+            </w:tcBorders>
+            <w:tcMar>
+              <w:top w:type="dxa" w:w="60"/>
+              <w:left w:type="dxa" w:w="100"/>
+              <w:bottom w:type="dxa" w:w="60"/>
+              <w:right w:type="dxa" w:w="100"/>
+            </w:tcMar>
+          </w:tcPr>
+          <w:p>
+            <w:pPr>
+              <w:jc w:val="center"/>
+            </w:pPr>
+          </w:p>
+        </w:tc>
+        <w:tc>
+          <w:tcPr>
+            <w:tcW w:type="dxa" w:w="1060"/>
+            <w:tcBorders>
+              <w:top w:val="single" w:color="D5DBE1" w:sz="4"/>
+              <w:left w:val="single" w:color="D5DBE1" w:sz="4"/>
+              <w:bottom w:val="single" w:color="D5DBE1" w:sz="4"/>
+              <w:right w:val="single" w:color="D5DBE1" w:sz="4"/>
+            </w:tcBorders>
+            <w:tcMar>
+              <w:top w:type="dxa" w:w="60"/>
+              <w:left w:type="dxa" w:w="100"/>
+              <w:bottom w:type="dxa" w:w="60"/>
+              <w:right w:type="dxa" w:w="100"/>
+            </w:tcMar>
+          </w:tcPr>
+          <w:p>
+            <w:pPr>
+              <w:jc w:val="center"/>
+            </w:pPr>
+            <w:r>
+              <w:rPr>
+                <w:rFonts w:ascii="Calibri" w:cs="Calibri" w:eastAsia="Calibri" w:hAnsi="Calibri"/>
+                <w:b w:val="false"/>
+                <w:bCs w:val="false"/>
+                <w:sz w:val="19"/>
+                <w:szCs w:val="19"/>
+              </w:rPr>
+              <w:t xml:space="preserve">✓</w:t>
+            </w:r>
+          </w:p>
+        </w:tc>
+        <w:tc>
+          <w:tcPr>
+            <w:tcW w:type="dxa" w:w="1060"/>
+            <w:tcBorders>
+              <w:top w:val="single" w:color="D5DBE1" w:sz="4"/>
+              <w:left w:val="single" w:color="D5DBE1" w:sz="4"/>
+              <w:bottom w:val="single" w:color="D5DBE1" w:sz="4"/>
+              <w:right w:val="single" w:color="D5DBE1" w:sz="4"/>
+            </w:tcBorders>
+            <w:tcMar>
+              <w:top w:type="dxa" w:w="60"/>
+              <w:left w:type="dxa" w:w="100"/>
+              <w:bottom w:type="dxa" w:w="60"/>
+              <w:right w:type="dxa" w:w="100"/>
+            </w:tcMar>
+          </w:tcPr>
+          <w:p>
+            <w:pPr>
+              <w:jc w:val="center"/>
+            </w:pPr>
+          </w:p>
+        </w:tc>
+        <w:tc>
+          <w:tcPr>
+            <w:tcW w:type="dxa" w:w="1060"/>
+            <w:tcBorders>
+              <w:top w:val="single" w:color="D5DBE1" w:sz="4"/>
+              <w:left w:val="single" w:color="D5DBE1" w:sz="4"/>
+              <w:bottom w:val="single" w:color="D5DBE1" w:sz="4"/>
+              <w:right w:val="single" w:color="D5DBE1" w:sz="4"/>
+            </w:tcBorders>
+            <w:tcMar>
+              <w:top w:type="dxa" w:w="60"/>
+              <w:left w:type="dxa" w:w="100"/>
+              <w:bottom w:type="dxa" w:w="60"/>
+              <w:right w:type="dxa" w:w="100"/>
+            </w:tcMar>
+          </w:tcPr>
+          <w:p>
+            <w:pPr>
+              <w:jc w:val="center"/>
+            </w:pPr>
+            <w:r>
+              <w:rPr>
+                <w:rFonts w:ascii="Calibri" w:cs="Calibri" w:eastAsia="Calibri" w:hAnsi="Calibri"/>
+                <w:b w:val="false"/>
+                <w:bCs w:val="false"/>
+                <w:sz w:val="19"/>
+                <w:szCs w:val="19"/>
+              </w:rPr>
+              <w:t xml:space="preserve">✓</w:t>
+            </w:r>
+          </w:p>
+        </w:tc>
+      </w:tr>
+      <w:tr>
+        <w:trPr>
+          <w:tblHeader w:val="off"/>
+        </w:trPr>
+        <w:tc>
+          <w:tcPr>
+            <w:tcW w:type="dxa" w:w="3000"/>
+            <w:tcBorders>
+              <w:top w:val="single" w:color="D5DBE1" w:sz="4"/>
+              <w:left w:val="single" w:color="D5DBE1" w:sz="4"/>
+              <w:bottom w:val="single" w:color="D5DBE1" w:sz="4"/>
+              <w:right w:val="single" w:color="D5DBE1" w:sz="4"/>
+            </w:tcBorders>
+            <w:tcMar>
+              <w:top w:type="dxa" w:w="60"/>
+              <w:left w:type="dxa" w:w="100"/>
+              <w:bottom w:type="dxa" w:w="60"/>
+              <w:right w:type="dxa" w:w="100"/>
+            </w:tcMar>
+          </w:tcPr>
+          <w:p>
+            <w:pPr>
+              <w:jc w:val="left"/>
+            </w:pPr>
+            <w:r>
+              <w:rPr>
+                <w:rFonts w:ascii="Calibri" w:cs="Calibri" w:eastAsia="Calibri" w:hAnsi="Calibri"/>
+                <w:b w:val="false"/>
+                <w:bCs w:val="false"/>
+                <w:sz w:val="19"/>
+                <w:szCs w:val="19"/>
+              </w:rPr>
+              <w:t xml:space="preserve">Practice configuration</w:t>
+            </w:r>
+          </w:p>
+        </w:tc>
+        <w:tc>
+          <w:tcPr>
+            <w:tcW w:type="dxa" w:w="1060"/>
+            <w:tcBorders>
+              <w:top w:val="single" w:color="D5DBE1" w:sz="4"/>
+              <w:left w:val="single" w:color="D5DBE1" w:sz="4"/>
+              <w:bottom w:val="single" w:color="D5DBE1" w:sz="4"/>
+              <w:right w:val="single" w:color="D5DBE1" w:sz="4"/>
+            </w:tcBorders>
+            <w:tcMar>
+              <w:top w:type="dxa" w:w="60"/>
+              <w:left w:type="dxa" w:w="100"/>
+              <w:bottom w:type="dxa" w:w="60"/>
+              <w:right w:type="dxa" w:w="100"/>
+            </w:tcMar>
+          </w:tcPr>
+          <w:p>
+            <w:pPr>
+              <w:jc w:val="center"/>
+            </w:pPr>
+            <w:r>
+              <w:rPr>
+                <w:rFonts w:ascii="Calibri" w:cs="Calibri" w:eastAsia="Calibri" w:hAnsi="Calibri"/>
+                <w:b w:val="false"/>
+                <w:bCs w:val="false"/>
+                <w:sz w:val="19"/>
+                <w:szCs w:val="19"/>
+              </w:rPr>
+              <w:t xml:space="preserve">✓</w:t>
+            </w:r>
+          </w:p>
+        </w:tc>
+        <w:tc>
+          <w:tcPr>
+            <w:tcW w:type="dxa" w:w="1060"/>
+            <w:tcBorders>
+              <w:top w:val="single" w:color="D5DBE1" w:sz="4"/>
+              <w:left w:val="single" w:color="D5DBE1" w:sz="4"/>
+              <w:bottom w:val="single" w:color="D5DBE1" w:sz="4"/>
+              <w:right w:val="single" w:color="D5DBE1" w:sz="4"/>
+            </w:tcBorders>
+            <w:tcMar>
+              <w:top w:type="dxa" w:w="60"/>
+              <w:left w:type="dxa" w:w="100"/>
+              <w:bottom w:type="dxa" w:w="60"/>
+              <w:right w:type="dxa" w:w="100"/>
+            </w:tcMar>
+          </w:tcPr>
+          <w:p>
+            <w:pPr>
+              <w:jc w:val="center"/>
+            </w:pPr>
+            <w:r>
+              <w:rPr>
+                <w:rFonts w:ascii="Calibri" w:cs="Calibri" w:eastAsia="Calibri" w:hAnsi="Calibri"/>
+                <w:b w:val="false"/>
+                <w:bCs w:val="false"/>
+                <w:sz w:val="19"/>
+                <w:szCs w:val="19"/>
+              </w:rPr>
+              <w:t xml:space="preserve">✓</w:t>
+            </w:r>
+          </w:p>
+        </w:tc>
+        <w:tc>
+          <w:tcPr>
+            <w:tcW w:type="dxa" w:w="1060"/>
+            <w:tcBorders>
+              <w:top w:val="single" w:color="D5DBE1" w:sz="4"/>
+              <w:left w:val="single" w:color="D5DBE1" w:sz="4"/>
+              <w:bottom w:val="single" w:color="D5DBE1" w:sz="4"/>
+              <w:right w:val="single" w:color="D5DBE1" w:sz="4"/>
+            </w:tcBorders>
+            <w:tcMar>
+              <w:top w:type="dxa" w:w="60"/>
+              <w:left w:type="dxa" w:w="100"/>
+              <w:bottom w:type="dxa" w:w="60"/>
+              <w:right w:type="dxa" w:w="100"/>
+            </w:tcMar>
+          </w:tcPr>
+          <w:p>
+            <w:pPr>
+              <w:jc w:val="center"/>
+            </w:pPr>
+            <w:r>
+              <w:rPr>
+                <w:rFonts w:ascii="Calibri" w:cs="Calibri" w:eastAsia="Calibri" w:hAnsi="Calibri"/>
+                <w:b w:val="false"/>
+                <w:bCs w:val="false"/>
+                <w:sz w:val="19"/>
+                <w:szCs w:val="19"/>
+              </w:rPr>
+              <w:t xml:space="preserve">✓</w:t>
+            </w:r>
+          </w:p>
+        </w:tc>
+        <w:tc>
+          <w:tcPr>
+            <w:tcW w:type="dxa" w:w="1060"/>
+            <w:tcBorders>
+              <w:top w:val="single" w:color="D5DBE1" w:sz="4"/>
+              <w:left w:val="single" w:color="D5DBE1" w:sz="4"/>
+              <w:bottom w:val="single" w:color="D5DBE1" w:sz="4"/>
+              <w:right w:val="single" w:color="D5DBE1" w:sz="4"/>
+            </w:tcBorders>
+            <w:tcMar>
+              <w:top w:type="dxa" w:w="60"/>
+              <w:left w:type="dxa" w:w="100"/>
+              <w:bottom w:type="dxa" w:w="60"/>
+              <w:right w:type="dxa" w:w="100"/>
+            </w:tcMar>
+          </w:tcPr>
+          <w:p>
+            <w:pPr>
+              <w:jc w:val="center"/>
+            </w:pPr>
+            <w:r>
+              <w:rPr>
+                <w:rFonts w:ascii="Calibri" w:cs="Calibri" w:eastAsia="Calibri" w:hAnsi="Calibri"/>
+                <w:b w:val="false"/>
+                <w:bCs w:val="false"/>
+                <w:sz w:val="19"/>
+                <w:szCs w:val="19"/>
+              </w:rPr>
+              <w:t xml:space="preserve">✓</w:t>
+            </w:r>
+          </w:p>
+        </w:tc>
+        <w:tc>
+          <w:tcPr>
+            <w:tcW w:type="dxa" w:w="1060"/>
+            <w:tcBorders>
+              <w:top w:val="single" w:color="D5DBE1" w:sz="4"/>
+              <w:left w:val="single" w:color="D5DBE1" w:sz="4"/>
+              <w:bottom w:val="single" w:color="D5DBE1" w:sz="4"/>
+              <w:right w:val="single" w:color="D5DBE1" w:sz="4"/>
+            </w:tcBorders>
+            <w:tcMar>
+              <w:top w:type="dxa" w:w="60"/>
+              <w:left w:type="dxa" w:w="100"/>
+              <w:bottom w:type="dxa" w:w="60"/>
+              <w:right w:type="dxa" w:w="100"/>
+            </w:tcMar>
+          </w:tcPr>
+          <w:p>
+            <w:pPr>
+              <w:jc w:val="center"/>
+            </w:pPr>
+            <w:r>
+              <w:rPr>
+                <w:rFonts w:ascii="Calibri" w:cs="Calibri" w:eastAsia="Calibri" w:hAnsi="Calibri"/>
+                <w:b w:val="false"/>
+                <w:bCs w:val="false"/>
+                <w:sz w:val="19"/>
+                <w:szCs w:val="19"/>
+              </w:rPr>
+              <w:t xml:space="preserve">✓</w:t>
+            </w:r>
           </w:p>
         </w:tc>
         <w:tc>
@@ -6093,7 +6571,7 @@
           <w:sz w:val="22"/>
           <w:szCs w:val="22"/>
         </w:rPr>
-        <w:t xml:space="preserve">Marketing can still open practice configuration pages (Team, Services, Locations, Forms), which had no permission before.</w:t>
+        <w:t xml:space="preserve">Practice configuration (Team, Services, Locations, Forms, Integrations) needs the new Practice configuration permission, so Marketing is blocked by menu and direct URL. Inventory and Settings keep their own permissions.</w:t>
       </w:r>
     </w:p>
     <w:p>
@@ -6111,24 +6589,7 @@
           <w:sz w:val="22"/>
           <w:szCs w:val="22"/>
         </w:rPr>
-        <w:t xml:space="preserve">"View as role (demo)" in the account menu switches roles for testing. A real app must do this server-side.</w:t>
-      </w:r>
-    </w:p>
-    <w:p>
-      <w:pPr>
-        <w:pStyle w:val="Heading2"/>
-        <w:spacing w:after="120" w:before="280"/>
-      </w:pPr>
-      <w:r>
-        <w:rPr>
-          <w:rFonts w:ascii="Calibri" w:cs="Calibri" w:eastAsia="Calibri" w:hAnsi="Calibri"/>
-          <w:b/>
-          <w:bCs/>
-          <w:color w:val="26384B"/>
-          <w:sz w:val="28"/>
-          <w:szCs w:val="28"/>
-        </w:rPr>
-        <w:t xml:space="preserve">6. Data and the shared Contact idea</w:t>
+        <w:t xml:space="preserve">Read-only enquiry access (Marketing): the enquiry views hide phone and email and turn off every change.</w:t>
       </w:r>
     </w:p>
     <w:p>
@@ -6146,41 +6607,24 @@
           <w:sz w:val="22"/>
           <w:szCs w:val="22"/>
         </w:rPr>
-        <w:t xml:space="preserve">Sample data lives in </w:t>
-      </w:r>
-      <w:r>
-        <w:rPr>
-          <w:rFonts w:ascii="Consolas" w:cs="Consolas" w:eastAsia="Consolas" w:hAnsi="Consolas"/>
-          <w:sz w:val="22"/>
-          <w:szCs w:val="22"/>
-          <w:shd w:fill="F1F3F5" w:val="clear"/>
-        </w:rPr>
-        <w:t xml:space="preserve">src/lib/db.ts</w:t>
-      </w:r>
-      <w:r>
-        <w:rPr>
-          <w:rFonts w:ascii="Calibri" w:cs="Calibri" w:eastAsia="Calibri" w:hAnsi="Calibri"/>
-          <w:sz w:val="22"/>
-          <w:szCs w:val="22"/>
-        </w:rPr>
-        <w:t xml:space="preserve"> and </w:t>
-      </w:r>
-      <w:r>
-        <w:rPr>
-          <w:rFonts w:ascii="Consolas" w:cs="Consolas" w:eastAsia="Consolas" w:hAnsi="Consolas"/>
-          <w:sz w:val="22"/>
-          <w:szCs w:val="22"/>
-          <w:shd w:fill="F1F3F5" w:val="clear"/>
-        </w:rPr>
-        <w:t xml:space="preserve">src/lib/clinical.ts</w:t>
-      </w:r>
-      <w:r>
-        <w:rPr>
-          <w:rFonts w:ascii="Calibri" w:cs="Calibri" w:eastAsia="Calibri" w:hAnsi="Calibri"/>
-          <w:sz w:val="22"/>
-          <w:szCs w:val="22"/>
-        </w:rPr>
-        <w:t xml:space="preserve">: 12 patients, 3 providers, 7 services, 2 locations, 6 rooms, 6 users, appointments dated around 2026-10-07 (a fixed "today" and a demo clock), visits, photos, invoices, inventory, forms, treatment plans, audit entries.</w:t>
+        <w:t xml:space="preserve">"View as role (demo)" in the account menu switches roles for testing. A real app must do this server-side.</w:t>
+      </w:r>
+    </w:p>
+    <w:p>
+      <w:pPr>
+        <w:pStyle w:val="Heading2"/>
+        <w:spacing w:after="120" w:before="280"/>
+      </w:pPr>
+      <w:r>
+        <w:rPr>
+          <w:rFonts w:ascii="Calibri" w:cs="Calibri" w:eastAsia="Calibri" w:hAnsi="Calibri"/>
+          <w:b/>
+          <w:bCs/>
+          <w:color w:val="26384B"/>
+          <w:sz w:val="28"/>
+          <w:szCs w:val="28"/>
+        </w:rPr>
+        <w:t xml:space="preserve">6. Data and the shared Contact idea</w:t>
       </w:r>
     </w:p>
     <w:p>
@@ -6198,7 +6642,41 @@
           <w:sz w:val="22"/>
           <w:szCs w:val="22"/>
         </w:rPr>
-        <w:t xml:space="preserve">Changes during a session are held in memory and lost on reload.</w:t>
+        <w:t xml:space="preserve">Sample data lives in </w:t>
+      </w:r>
+      <w:r>
+        <w:rPr>
+          <w:rFonts w:ascii="Consolas" w:cs="Consolas" w:eastAsia="Consolas" w:hAnsi="Consolas"/>
+          <w:sz w:val="22"/>
+          <w:szCs w:val="22"/>
+          <w:shd w:fill="F1F3F5" w:val="clear"/>
+        </w:rPr>
+        <w:t xml:space="preserve">src/lib/db.ts</w:t>
+      </w:r>
+      <w:r>
+        <w:rPr>
+          <w:rFonts w:ascii="Calibri" w:cs="Calibri" w:eastAsia="Calibri" w:hAnsi="Calibri"/>
+          <w:sz w:val="22"/>
+          <w:szCs w:val="22"/>
+        </w:rPr>
+        <w:t xml:space="preserve"> and </w:t>
+      </w:r>
+      <w:r>
+        <w:rPr>
+          <w:rFonts w:ascii="Consolas" w:cs="Consolas" w:eastAsia="Consolas" w:hAnsi="Consolas"/>
+          <w:sz w:val="22"/>
+          <w:szCs w:val="22"/>
+          <w:shd w:fill="F1F3F5" w:val="clear"/>
+        </w:rPr>
+        <w:t xml:space="preserve">src/lib/clinical.ts</w:t>
+      </w:r>
+      <w:r>
+        <w:rPr>
+          <w:rFonts w:ascii="Calibri" w:cs="Calibri" w:eastAsia="Calibri" w:hAnsi="Calibri"/>
+          <w:sz w:val="22"/>
+          <w:szCs w:val="22"/>
+        </w:rPr>
+        <w:t xml:space="preserve">: 25 patients (12 original plus 13 created from converted enquiries), 3 providers, 7 services, 2 locations, 6 rooms, 6 users, appointments dated around 2026-10-07 (a fixed "today" and a demo clock), visits, photos, invoices, inventory, forms, treatment plans, audit entries.</w:t>
       </w:r>
     </w:p>
     <w:p>
@@ -6212,54 +6690,11 @@
       </w:pPr>
       <w:r>
         <w:rPr>
-          <w:rFonts w:ascii="Consolas" w:cs="Consolas" w:eastAsia="Consolas" w:hAnsi="Consolas"/>
-          <w:sz w:val="22"/>
-          <w:szCs w:val="22"/>
-          <w:shd w:fill="F1F3F5" w:val="clear"/>
-        </w:rPr>
-        <w:t xml:space="preserve">Contact</w:t>
-      </w:r>
-      <w:r>
-        <w:rPr>
-          <w:rFonts w:ascii="Calibri" w:cs="Calibri" w:eastAsia="Calibri" w:hAnsi="Calibri"/>
-          <w:sz w:val="22"/>
-          <w:szCs w:val="22"/>
-        </w:rPr>
-        <w:t xml:space="preserve"> (</w:t>
-      </w:r>
-      <w:r>
-        <w:rPr>
-          <w:rFonts w:ascii="Consolas" w:cs="Consolas" w:eastAsia="Consolas" w:hAnsi="Consolas"/>
-          <w:sz w:val="22"/>
-          <w:szCs w:val="22"/>
-          <w:shd w:fill="F1F3F5" w:val="clear"/>
-        </w:rPr>
-        <w:t xml:space="preserve">src/platform/contact.ts</w:t>
-      </w:r>
-      <w:r>
-        <w:rPr>
-          <w:rFonts w:ascii="Calibri" w:cs="Calibri" w:eastAsia="Calibri" w:hAnsi="Calibri"/>
-          <w:sz w:val="22"/>
-          <w:szCs w:val="22"/>
-        </w:rPr>
-        <w:t xml:space="preserve">) is a proposed shared person record with per-channel, per-purpose consent. It is not wired into PMS data. CRM shows contacts derived from patients as an interim demo. Ownership between Patient, CRM and Contact is a decision still to agree with the backend developer (see ARCHITECTURE.md).</w:t>
-      </w:r>
-    </w:p>
-    <w:p>
-      <w:pPr>
-        <w:pStyle w:val="Heading2"/>
-        <w:spacing w:after="120" w:before="280"/>
-      </w:pPr>
-      <w:r>
-        <w:rPr>
-          <w:rFonts w:ascii="Calibri" w:cs="Calibri" w:eastAsia="Calibri" w:hAnsi="Calibri"/>
-          <w:b/>
-          <w:bCs/>
-          <w:color w:val="26384B"/>
-          <w:sz w:val="28"/>
-          <w:szCs w:val="28"/>
-        </w:rPr>
-        <w:t xml:space="preserve">7. Not built or not real</w:t>
+          <w:rFonts w:ascii="Calibri" w:cs="Calibri" w:eastAsia="Calibri" w:hAnsi="Calibri"/>
+          <w:sz w:val="22"/>
+          <w:szCs w:val="22"/>
+        </w:rPr>
+        <w:t xml:space="preserve">Changes during a session are held in memory and lost on reload.</w:t>
       </w:r>
     </w:p>
     <w:p>
@@ -6273,11 +6708,54 @@
       </w:pPr>
       <w:r>
         <w:rPr>
-          <w:rFonts w:ascii="Calibri" w:cs="Calibri" w:eastAsia="Calibri" w:hAnsi="Calibri"/>
-          <w:sz w:val="22"/>
-          <w:szCs w:val="22"/>
-        </w:rPr>
-        <w:t xml:space="preserve">Backend, database, real authentication (sessions, MFA, email verification are simulated).</w:t>
+          <w:rFonts w:ascii="Consolas" w:cs="Consolas" w:eastAsia="Consolas" w:hAnsi="Consolas"/>
+          <w:sz w:val="22"/>
+          <w:szCs w:val="22"/>
+          <w:shd w:fill="F1F3F5" w:val="clear"/>
+        </w:rPr>
+        <w:t xml:space="preserve">Contact</w:t>
+      </w:r>
+      <w:r>
+        <w:rPr>
+          <w:rFonts w:ascii="Calibri" w:cs="Calibri" w:eastAsia="Calibri" w:hAnsi="Calibri"/>
+          <w:sz w:val="22"/>
+          <w:szCs w:val="22"/>
+        </w:rPr>
+        <w:t xml:space="preserve"> (</w:t>
+      </w:r>
+      <w:r>
+        <w:rPr>
+          <w:rFonts w:ascii="Consolas" w:cs="Consolas" w:eastAsia="Consolas" w:hAnsi="Consolas"/>
+          <w:sz w:val="22"/>
+          <w:szCs w:val="22"/>
+          <w:shd w:fill="F1F3F5" w:val="clear"/>
+        </w:rPr>
+        <w:t xml:space="preserve">src/platform/contact.ts</w:t>
+      </w:r>
+      <w:r>
+        <w:rPr>
+          <w:rFonts w:ascii="Calibri" w:cs="Calibri" w:eastAsia="Calibri" w:hAnsi="Calibri"/>
+          <w:sz w:val="22"/>
+          <w:szCs w:val="22"/>
+        </w:rPr>
+        <w:t xml:space="preserve">) is a proposed shared person record with per-channel, per-purpose consent. It is not wired into PMS data. CRM shows contacts derived from patients as an interim demo. Ownership between Patient, CRM and Contact is a decision still to agree with the backend developer (see ARCHITECTURE.md).</w:t>
+      </w:r>
+    </w:p>
+    <w:p>
+      <w:pPr>
+        <w:pStyle w:val="Heading2"/>
+        <w:spacing w:after="120" w:before="280"/>
+      </w:pPr>
+      <w:r>
+        <w:rPr>
+          <w:rFonts w:ascii="Calibri" w:cs="Calibri" w:eastAsia="Calibri" w:hAnsi="Calibri"/>
+          <w:b/>
+          <w:bCs/>
+          <w:color w:val="26384B"/>
+          <w:sz w:val="28"/>
+          <w:szCs w:val="28"/>
+        </w:rPr>
+        <w:t xml:space="preserve">7. Not built or not real</w:t>
       </w:r>
     </w:p>
     <w:p>
@@ -6295,7 +6773,7 @@
           <w:sz w:val="22"/>
           <w:szCs w:val="22"/>
         </w:rPr>
-        <w:t xml:space="preserve">CRM, Online Bookings and Campaigns features. Messaging, email/SMS sending, online booking page, payment processing, EVOQ Billing and Campaigns connections.</w:t>
+        <w:t xml:space="preserve">Backend, database, real authentication (sessions, MFA, email verification are simulated).</w:t>
       </w:r>
     </w:p>
     <w:p>
@@ -6313,7 +6791,7 @@
           <w:sz w:val="22"/>
           <w:szCs w:val="22"/>
         </w:rPr>
-        <w:t xml:space="preserve">Enquiries are not yet part of Reports or EVI agents, and enquiry follow-up tasks are separate from patient Follow-ups.</w:t>
+        <w:t xml:space="preserve">CRM, Online Bookings and Campaigns features. Messaging, email/SMS sending, online booking page, payment processing, EVOQ Billing and Campaigns connections.</w:t>
       </w:r>
     </w:p>
     <w:p>
@@ -6331,7 +6809,7 @@
           <w:sz w:val="22"/>
           <w:szCs w:val="22"/>
         </w:rPr>
-        <w:t xml:space="preserve">Real AI. File storage (uploaded photos and documents are not persisted).</w:t>
+        <w:t xml:space="preserve">Enquiries are not yet part of Reports or EVI agents, and enquiry follow-up tasks are separate from patient Follow-ups.</w:t>
       </w:r>
     </w:p>
     <w:p>
@@ -6349,7 +6827,7 @@
           <w:sz w:val="22"/>
           <w:szCs w:val="22"/>
         </w:rPr>
-        <w:t xml:space="preserve">Automated tests, accessibility audit, audit-log persistence, data export beyond the audit-log CSV.</w:t>
+        <w:t xml:space="preserve">Real AI. File storage (uploaded photos and documents are not persisted).</w:t>
       </w:r>
     </w:p>
     <w:p>
@@ -6367,24 +6845,7 @@
           <w:sz w:val="22"/>
           <w:szCs w:val="22"/>
         </w:rPr>
-        <w:t xml:space="preserve">Multi-clinic tenancy: one practice per browser.</w:t>
-      </w:r>
-    </w:p>
-    <w:p>
-      <w:pPr>
-        <w:pStyle w:val="Heading2"/>
-        <w:spacing w:after="120" w:before="280"/>
-      </w:pPr>
-      <w:r>
-        <w:rPr>
-          <w:rFonts w:ascii="Calibri" w:cs="Calibri" w:eastAsia="Calibri" w:hAnsi="Calibri"/>
-          <w:b/>
-          <w:bCs/>
-          <w:color w:val="26384B"/>
-          <w:sz w:val="28"/>
-          <w:szCs w:val="28"/>
-        </w:rPr>
-        <w:t xml:space="preserve">8. Risks to know before building further</w:t>
+        <w:t xml:space="preserve">UI-level automated tests, accessibility audit, audit-log persistence, data export beyond the audit-log CSV.</w:t>
       </w:r>
     </w:p>
     <w:p>
@@ -6402,7 +6863,24 @@
           <w:sz w:val="22"/>
           <w:szCs w:val="22"/>
         </w:rPr>
-        <w:t xml:space="preserve">Roles and permissions are only enforced in the browser, so they must be enforced by the backend.</w:t>
+        <w:t xml:space="preserve">Multi-clinic tenancy: one practice per browser.</w:t>
+      </w:r>
+    </w:p>
+    <w:p>
+      <w:pPr>
+        <w:pStyle w:val="Heading2"/>
+        <w:spacing w:after="120" w:before="280"/>
+      </w:pPr>
+      <w:r>
+        <w:rPr>
+          <w:rFonts w:ascii="Calibri" w:cs="Calibri" w:eastAsia="Calibri" w:hAnsi="Calibri"/>
+          <w:b/>
+          <w:bCs/>
+          <w:color w:val="26384B"/>
+          <w:sz w:val="28"/>
+          <w:szCs w:val="28"/>
+        </w:rPr>
+        <w:t xml:space="preserve">8. Risks to know before building further</w:t>
       </w:r>
     </w:p>
     <w:p>
@@ -6420,7 +6898,7 @@
           <w:sz w:val="22"/>
           <w:szCs w:val="22"/>
         </w:rPr>
-        <w:t xml:space="preserve">Patient data is clinical data. A real backend needs encryption, access logging and consent enforcement before any real records are used.</w:t>
+        <w:t xml:space="preserve">Roles and permissions are only enforced in the browser, so they must be enforced by the backend.</w:t>
       </w:r>
     </w:p>
     <w:p>
@@ -6438,24 +6916,7 @@
           <w:sz w:val="22"/>
           <w:szCs w:val="22"/>
         </w:rPr>
-        <w:t xml:space="preserve">Internal storage keys and some names still say </w:t>
-      </w:r>
-      <w:r>
-        <w:rPr>
-          <w:rFonts w:ascii="Consolas" w:cs="Consolas" w:eastAsia="Consolas" w:hAnsi="Consolas"/>
-          <w:sz w:val="22"/>
-          <w:szCs w:val="22"/>
-          <w:shd w:fill="F1F3F5" w:val="clear"/>
-        </w:rPr>
-        <w:t xml:space="preserve">pms.*</w:t>
-      </w:r>
-      <w:r>
-        <w:rPr>
-          <w:rFonts w:ascii="Calibri" w:cs="Calibri" w:eastAsia="Calibri" w:hAnsi="Calibri"/>
-          <w:sz w:val="22"/>
-          <w:szCs w:val="22"/>
-        </w:rPr>
-        <w:t xml:space="preserve">. Safe to leave, costly to rename later without migration.</w:t>
+        <w:t xml:space="preserve">Patient data is clinical data. A real backend needs encryption, access logging and consent enforcement before any real records are used.</w:t>
       </w:r>
     </w:p>
     <w:p>
@@ -6473,6 +6934,41 @@
           <w:sz w:val="22"/>
           <w:szCs w:val="22"/>
         </w:rPr>
+        <w:t xml:space="preserve">Internal storage keys and some names still say </w:t>
+      </w:r>
+      <w:r>
+        <w:rPr>
+          <w:rFonts w:ascii="Consolas" w:cs="Consolas" w:eastAsia="Consolas" w:hAnsi="Consolas"/>
+          <w:sz w:val="22"/>
+          <w:szCs w:val="22"/>
+          <w:shd w:fill="F1F3F5" w:val="clear"/>
+        </w:rPr>
+        <w:t xml:space="preserve">pms.*</w:t>
+      </w:r>
+      <w:r>
+        <w:rPr>
+          <w:rFonts w:ascii="Calibri" w:cs="Calibri" w:eastAsia="Calibri" w:hAnsi="Calibri"/>
+          <w:sz w:val="22"/>
+          <w:szCs w:val="22"/>
+        </w:rPr>
+        <w:t xml:space="preserve">. Safe to leave, costly to rename later without migration.</w:t>
+      </w:r>
+    </w:p>
+    <w:p>
+      <w:pPr>
+        <w:pStyle w:val="ListParagraph"/>
+        <w:numPr>
+          <w:ilvl w:val="0"/>
+          <w:numId w:val="2"/>
+        </w:numPr>
+        <w:spacing w:after="60"/>
+      </w:pPr>
+      <w:r>
+        <w:rPr>
+          <w:rFonts w:ascii="Calibri" w:cs="Calibri" w:eastAsia="Calibri" w:hAnsi="Calibri"/>
+          <w:sz w:val="22"/>
+          <w:szCs w:val="22"/>
+        </w:rPr>
         <w:t xml:space="preserve">Patient identity is stored on </w:t>
       </w:r>
       <w:r>
@@ -6591,7 +7087,7 @@
           <w:sz w:val="22"/>
           <w:szCs w:val="22"/>
         </w:rPr>
-        <w:t xml:space="preserve">: view-only booking behavior and permissions for the practice configuration pages.</w:t>
+        <w:t xml:space="preserve">: view-only booking behavior, and field-level rules for what read-only roles may see.</w:t>
       </w:r>
     </w:p>
     <w:p>

</xml_diff>

<commit_message>
feat(crm): add unified contact directory
Co-Authored-By: Claude Sonnet 5.5 <noreply@anthropic.com>
</commit_message>
<xml_diff>
--- a/docs/APP_OVERVIEW.docx
+++ b/docs/APP_OVERVIEW.docx
@@ -114,6 +114,7 @@
       </w:tblGrid>
       <w:tr>
         <w:trPr>
+          <w:cantSplit/>
           <w:tblHeader/>
         </w:trPr>
         <w:tc>
@@ -185,6 +186,7 @@
       </w:tr>
       <w:tr>
         <w:trPr>
+          <w:cantSplit/>
           <w:tblHeader w:val="off"/>
         </w:trPr>
         <w:tc>
@@ -254,6 +256,7 @@
       </w:tr>
       <w:tr>
         <w:trPr>
+          <w:cantSplit/>
           <w:tblHeader w:val="off"/>
         </w:trPr>
         <w:tc>
@@ -323,8 +326,8 @@
                 <w:rFonts w:ascii="Consolas" w:cs="Consolas" w:eastAsia="Consolas" w:hAnsi="Consolas"/>
                 <w:b w:val="false"/>
                 <w:bCs w:val="false"/>
-                <w:sz w:val="19"/>
-                <w:szCs w:val="19"/>
+                <w:sz w:val="17"/>
+                <w:szCs w:val="17"/>
                 <w:shd w:fill="F1F3F5" w:val="clear"/>
               </w:rPr>
               <w:t xml:space="preserve">class-variance-authority</w:t>
@@ -344,8 +347,8 @@
                 <w:rFonts w:ascii="Consolas" w:cs="Consolas" w:eastAsia="Consolas" w:hAnsi="Consolas"/>
                 <w:b w:val="false"/>
                 <w:bCs w:val="false"/>
-                <w:sz w:val="19"/>
-                <w:szCs w:val="19"/>
+                <w:sz w:val="17"/>
+                <w:szCs w:val="17"/>
                 <w:shd w:fill="F1F3F5" w:val="clear"/>
               </w:rPr>
               <w:t xml:space="preserve">tailwind-merge</w:t>
@@ -355,6 +358,7 @@
       </w:tr>
       <w:tr>
         <w:trPr>
+          <w:cantSplit/>
           <w:tblHeader w:val="off"/>
         </w:trPr>
         <w:tc>
@@ -424,8 +428,8 @@
                 <w:rFonts w:ascii="Consolas" w:cs="Consolas" w:eastAsia="Consolas" w:hAnsi="Consolas"/>
                 <w:b w:val="false"/>
                 <w:bCs w:val="false"/>
-                <w:sz w:val="19"/>
-                <w:szCs w:val="19"/>
+                <w:sz w:val="17"/>
+                <w:szCs w:val="17"/>
                 <w:shd w:fill="F1F3F5" w:val="clear"/>
               </w:rPr>
               <w:t xml:space="preserve">src/lib/db.ts</w:t>
@@ -445,8 +449,8 @@
                 <w:rFonts w:ascii="Consolas" w:cs="Consolas" w:eastAsia="Consolas" w:hAnsi="Consolas"/>
                 <w:b w:val="false"/>
                 <w:bCs w:val="false"/>
-                <w:sz w:val="19"/>
-                <w:szCs w:val="19"/>
+                <w:sz w:val="17"/>
+                <w:szCs w:val="17"/>
                 <w:shd w:fill="F1F3F5" w:val="clear"/>
               </w:rPr>
               <w:t xml:space="preserve">src/lib/clinical.ts</w:t>
@@ -466,6 +470,7 @@
       </w:tr>
       <w:tr>
         <w:trPr>
+          <w:cantSplit/>
           <w:tblHeader w:val="off"/>
         </w:trPr>
         <w:tc>
@@ -535,6 +540,7 @@
       </w:tr>
       <w:tr>
         <w:trPr>
+          <w:cantSplit/>
           <w:tblHeader w:val="off"/>
         </w:trPr>
         <w:tc>
@@ -604,6 +610,7 @@
       </w:tr>
       <w:tr>
         <w:trPr>
+          <w:cantSplit/>
           <w:tblHeader w:val="off"/>
         </w:trPr>
         <w:tc>
@@ -673,8 +680,8 @@
                 <w:rFonts w:ascii="Consolas" w:cs="Consolas" w:eastAsia="Consolas" w:hAnsi="Consolas"/>
                 <w:b w:val="false"/>
                 <w:bCs w:val="false"/>
-                <w:sz w:val="19"/>
-                <w:szCs w:val="19"/>
+                <w:sz w:val="17"/>
+                <w:szCs w:val="17"/>
                 <w:shd w:fill="F1F3F5" w:val="clear"/>
               </w:rPr>
               <w:t xml:space="preserve">localStorage</w:t>
@@ -694,6 +701,7 @@
       </w:tr>
       <w:tr>
         <w:trPr>
+          <w:cantSplit/>
           <w:tblHeader w:val="off"/>
         </w:trPr>
         <w:tc>
@@ -753,8 +761,8 @@
                 <w:rFonts w:ascii="Consolas" w:cs="Consolas" w:eastAsia="Consolas" w:hAnsi="Consolas"/>
                 <w:b w:val="false"/>
                 <w:bCs w:val="false"/>
-                <w:sz w:val="19"/>
-                <w:szCs w:val="19"/>
+                <w:sz w:val="17"/>
+                <w:szCs w:val="17"/>
                 <w:shd w:fill="F1F3F5" w:val="clear"/>
               </w:rPr>
               <w:t xml:space="preserve">npm test</w:t>
@@ -767,13 +775,14 @@
                 <w:sz w:val="19"/>
                 <w:szCs w:val="19"/>
               </w:rPr>
-              <w:t xml:space="preserve">: 12 unit tests for permissions, appointment/insights logic and the Flow layout. No UI test suite</w:t>
+              <w:t xml:space="preserve">: 28 unit tests for permissions, the shared seed, appointment/insights logic, the Flow layout and CRM contact derivation. No UI test suite</w:t>
             </w:r>
           </w:p>
         </w:tc>
       </w:tr>
       <w:tr>
         <w:trPr>
+          <w:cantSplit/>
           <w:tblHeader w:val="off"/>
         </w:trPr>
         <w:tc>
@@ -833,8 +842,8 @@
                 <w:rFonts w:ascii="Consolas" w:cs="Consolas" w:eastAsia="Consolas" w:hAnsi="Consolas"/>
                 <w:b w:val="false"/>
                 <w:bCs w:val="false"/>
-                <w:sz w:val="19"/>
-                <w:szCs w:val="19"/>
+                <w:sz w:val="17"/>
+                <w:szCs w:val="17"/>
                 <w:shd w:fill="F1F3F5" w:val="clear"/>
               </w:rPr>
               <w:t xml:space="preserve">npm run dev</w:t>
@@ -854,8 +863,8 @@
                 <w:rFonts w:ascii="Consolas" w:cs="Consolas" w:eastAsia="Consolas" w:hAnsi="Consolas"/>
                 <w:b w:val="false"/>
                 <w:bCs w:val="false"/>
-                <w:sz w:val="19"/>
-                <w:szCs w:val="19"/>
+                <w:sz w:val="17"/>
+                <w:szCs w:val="17"/>
                 <w:shd w:fill="F1F3F5" w:val="clear"/>
               </w:rPr>
               <w:t xml:space="preserve">npm run build</w:t>
@@ -875,8 +884,8 @@
                 <w:rFonts w:ascii="Consolas" w:cs="Consolas" w:eastAsia="Consolas" w:hAnsi="Consolas"/>
                 <w:b w:val="false"/>
                 <w:bCs w:val="false"/>
-                <w:sz w:val="19"/>
-                <w:szCs w:val="19"/>
+                <w:sz w:val="17"/>
+                <w:szCs w:val="17"/>
                 <w:shd w:fill="F1F3F5" w:val="clear"/>
               </w:rPr>
               <w:t xml:space="preserve">npm run start</w:t>
@@ -932,8 +941,8 @@
       <w:r>
         <w:rPr>
           <w:rFonts w:ascii="Consolas" w:cs="Consolas" w:eastAsia="Consolas" w:hAnsi="Consolas"/>
-          <w:sz w:val="22"/>
-          <w:szCs w:val="22"/>
+          <w:sz w:val="20"/>
+          <w:szCs w:val="20"/>
           <w:shd w:fill="F1F3F5" w:val="clear"/>
         </w:rPr>
         <w:t xml:space="preserve">node_modules/next/dist/docs/</w:t>
@@ -983,6 +992,7 @@
       </w:tblGrid>
       <w:tr>
         <w:trPr>
+          <w:cantSplit/>
           <w:tblHeader/>
         </w:trPr>
         <w:tc>
@@ -1087,6 +1097,7 @@
       </w:tr>
       <w:tr>
         <w:trPr>
+          <w:cantSplit/>
           <w:tblHeader w:val="off"/>
         </w:trPr>
         <w:tc>
@@ -1146,8 +1157,8 @@
                 <w:rFonts w:ascii="Consolas" w:cs="Consolas" w:eastAsia="Consolas" w:hAnsi="Consolas"/>
                 <w:b w:val="false"/>
                 <w:bCs w:val="false"/>
-                <w:sz w:val="19"/>
-                <w:szCs w:val="19"/>
+                <w:sz w:val="17"/>
+                <w:szCs w:val="17"/>
                 <w:shd w:fill="F1F3F5" w:val="clear"/>
               </w:rPr>
               <w:t xml:space="preserve">/overview</w:t>
@@ -1167,8 +1178,8 @@
                 <w:rFonts w:ascii="Consolas" w:cs="Consolas" w:eastAsia="Consolas" w:hAnsi="Consolas"/>
                 <w:b w:val="false"/>
                 <w:bCs w:val="false"/>
-                <w:sz w:val="19"/>
-                <w:szCs w:val="19"/>
+                <w:sz w:val="17"/>
+                <w:szCs w:val="17"/>
                 <w:shd w:fill="F1F3F5" w:val="clear"/>
               </w:rPr>
               <w:t xml:space="preserve">/calendar</w:t>
@@ -1188,8 +1199,8 @@
                 <w:rFonts w:ascii="Consolas" w:cs="Consolas" w:eastAsia="Consolas" w:hAnsi="Consolas"/>
                 <w:b w:val="false"/>
                 <w:bCs w:val="false"/>
-                <w:sz w:val="19"/>
-                <w:szCs w:val="19"/>
+                <w:sz w:val="17"/>
+                <w:szCs w:val="17"/>
                 <w:shd w:fill="F1F3F5" w:val="clear"/>
               </w:rPr>
               <w:t xml:space="preserve">/patients</w:t>
@@ -1209,8 +1220,8 @@
                 <w:rFonts w:ascii="Consolas" w:cs="Consolas" w:eastAsia="Consolas" w:hAnsi="Consolas"/>
                 <w:b w:val="false"/>
                 <w:bCs w:val="false"/>
-                <w:sz w:val="19"/>
-                <w:szCs w:val="19"/>
+                <w:sz w:val="17"/>
+                <w:szCs w:val="17"/>
                 <w:shd w:fill="F1F3F5" w:val="clear"/>
               </w:rPr>
               <w:t xml:space="preserve">/visits</w:t>
@@ -1230,8 +1241,8 @@
                 <w:rFonts w:ascii="Consolas" w:cs="Consolas" w:eastAsia="Consolas" w:hAnsi="Consolas"/>
                 <w:b w:val="false"/>
                 <w:bCs w:val="false"/>
-                <w:sz w:val="19"/>
-                <w:szCs w:val="19"/>
+                <w:sz w:val="17"/>
+                <w:szCs w:val="17"/>
                 <w:shd w:fill="F1F3F5" w:val="clear"/>
               </w:rPr>
               <w:t xml:space="preserve">/follow-ups</w:t>
@@ -1251,8 +1262,8 @@
                 <w:rFonts w:ascii="Consolas" w:cs="Consolas" w:eastAsia="Consolas" w:hAnsi="Consolas"/>
                 <w:b w:val="false"/>
                 <w:bCs w:val="false"/>
-                <w:sz w:val="19"/>
-                <w:szCs w:val="19"/>
+                <w:sz w:val="17"/>
+                <w:szCs w:val="17"/>
                 <w:shd w:fill="F1F3F5" w:val="clear"/>
               </w:rPr>
               <w:t xml:space="preserve">/reports</w:t>
@@ -1272,8 +1283,8 @@
                 <w:rFonts w:ascii="Consolas" w:cs="Consolas" w:eastAsia="Consolas" w:hAnsi="Consolas"/>
                 <w:b w:val="false"/>
                 <w:bCs w:val="false"/>
-                <w:sz w:val="19"/>
-                <w:szCs w:val="19"/>
+                <w:sz w:val="17"/>
+                <w:szCs w:val="17"/>
                 <w:shd w:fill="F1F3F5" w:val="clear"/>
               </w:rPr>
               <w:t xml:space="preserve">/agents</w:t>
@@ -1293,8 +1304,8 @@
                 <w:rFonts w:ascii="Consolas" w:cs="Consolas" w:eastAsia="Consolas" w:hAnsi="Consolas"/>
                 <w:b w:val="false"/>
                 <w:bCs w:val="false"/>
-                <w:sz w:val="19"/>
-                <w:szCs w:val="19"/>
+                <w:sz w:val="17"/>
+                <w:szCs w:val="17"/>
                 <w:shd w:fill="F1F3F5" w:val="clear"/>
               </w:rPr>
               <w:t xml:space="preserve">/practice/*</w:t>
@@ -1336,6 +1347,7 @@
       </w:tr>
       <w:tr>
         <w:trPr>
+          <w:cantSplit/>
           <w:tblHeader w:val="off"/>
         </w:trPr>
         <w:tc>
@@ -1395,8 +1407,8 @@
                 <w:rFonts w:ascii="Consolas" w:cs="Consolas" w:eastAsia="Consolas" w:hAnsi="Consolas"/>
                 <w:b w:val="false"/>
                 <w:bCs w:val="false"/>
-                <w:sz w:val="19"/>
-                <w:szCs w:val="19"/>
+                <w:sz w:val="17"/>
+                <w:szCs w:val="17"/>
                 <w:shd w:fill="F1F3F5" w:val="clear"/>
               </w:rPr>
               <w:t xml:space="preserve">/enquiries</w:t>
@@ -1438,6 +1450,7 @@
       </w:tr>
       <w:tr>
         <w:trPr>
+          <w:cantSplit/>
           <w:tblHeader w:val="off"/>
         </w:trPr>
         <w:tc>
@@ -1497,8 +1510,8 @@
                 <w:rFonts w:ascii="Consolas" w:cs="Consolas" w:eastAsia="Consolas" w:hAnsi="Consolas"/>
                 <w:b w:val="false"/>
                 <w:bCs w:val="false"/>
-                <w:sz w:val="19"/>
-                <w:szCs w:val="19"/>
+                <w:sz w:val="17"/>
+                <w:szCs w:val="17"/>
                 <w:shd w:fill="F1F3F5" w:val="clear"/>
               </w:rPr>
               <w:t xml:space="preserve">/marketing-insights</w:t>
@@ -1540,6 +1553,7 @@
       </w:tr>
       <w:tr>
         <w:trPr>
+          <w:cantSplit/>
           <w:tblHeader w:val="off"/>
         </w:trPr>
         <w:tc>
@@ -1599,8 +1613,8 @@
                 <w:rFonts w:ascii="Consolas" w:cs="Consolas" w:eastAsia="Consolas" w:hAnsi="Consolas"/>
                 <w:b w:val="false"/>
                 <w:bCs w:val="false"/>
-                <w:sz w:val="19"/>
-                <w:szCs w:val="19"/>
+                <w:sz w:val="17"/>
+                <w:szCs w:val="17"/>
                 <w:shd w:fill="F1F3F5" w:val="clear"/>
               </w:rPr>
               <w:t xml:space="preserve">/crm</w:t>
@@ -1635,13 +1649,14 @@
                 <w:sz w:val="19"/>
                 <w:szCs w:val="19"/>
               </w:rPr>
-              <w:t xml:space="preserve">Preview. Lists contacts derived from patients. Reached from the account menu</w:t>
+              <w:t xml:space="preserve">Working read-only contact directory (preview). Patients plus enquiry-only people, with search, stage and source filters and a detail panel. Reached from the account menu</w:t>
             </w:r>
           </w:p>
         </w:tc>
       </w:tr>
       <w:tr>
         <w:trPr>
+          <w:cantSplit/>
           <w:tblHeader w:val="off"/>
         </w:trPr>
         <w:tc>
@@ -1701,8 +1716,8 @@
                 <w:rFonts w:ascii="Consolas" w:cs="Consolas" w:eastAsia="Consolas" w:hAnsi="Consolas"/>
                 <w:b w:val="false"/>
                 <w:bCs w:val="false"/>
-                <w:sz w:val="19"/>
-                <w:szCs w:val="19"/>
+                <w:sz w:val="17"/>
+                <w:szCs w:val="17"/>
                 <w:shd w:fill="F1F3F5" w:val="clear"/>
               </w:rPr>
               <w:t xml:space="preserve">/booking</w:t>
@@ -1744,6 +1759,7 @@
       </w:tr>
       <w:tr>
         <w:trPr>
+          <w:cantSplit/>
           <w:tblHeader w:val="off"/>
         </w:trPr>
         <w:tc>
@@ -1803,8 +1819,8 @@
                 <w:rFonts w:ascii="Consolas" w:cs="Consolas" w:eastAsia="Consolas" w:hAnsi="Consolas"/>
                 <w:b w:val="false"/>
                 <w:bCs w:val="false"/>
-                <w:sz w:val="19"/>
-                <w:szCs w:val="19"/>
+                <w:sz w:val="17"/>
+                <w:szCs w:val="17"/>
                 <w:shd w:fill="F1F3F5" w:val="clear"/>
               </w:rPr>
               <w:t xml:space="preserve">/campaigns</w:t>
@@ -1865,8 +1881,8 @@
       <w:r>
         <w:rPr>
           <w:rFonts w:ascii="Consolas" w:cs="Consolas" w:eastAsia="Consolas" w:hAnsi="Consolas"/>
-          <w:sz w:val="22"/>
-          <w:szCs w:val="22"/>
+          <w:sz w:val="20"/>
+          <w:szCs w:val="20"/>
           <w:shd w:fill="F1F3F5" w:val="clear"/>
         </w:rPr>
         <w:t xml:space="preserve">src/platform/modules.ts</w:t>
@@ -1954,7 +1970,28 @@
           <w:sz w:val="22"/>
           <w:szCs w:val="22"/>
         </w:rPr>
-        <w:t xml:space="preserve">Enquiries (`/enquiries`)</w:t>
+        <w:t xml:space="preserve">Enquiries (</w:t>
+      </w:r>
+      <w:r>
+        <w:rPr>
+          <w:rFonts w:ascii="Consolas" w:cs="Consolas" w:eastAsia="Consolas" w:hAnsi="Consolas"/>
+          <w:b/>
+          <w:bCs/>
+          <w:sz w:val="20"/>
+          <w:szCs w:val="20"/>
+          <w:shd w:fill="F1F3F5" w:val="clear"/>
+        </w:rPr>
+        <w:t xml:space="preserve">/enquiries</w:t>
+      </w:r>
+      <w:r>
+        <w:rPr>
+          <w:rFonts w:ascii="Calibri" w:cs="Calibri" w:eastAsia="Calibri" w:hAnsi="Calibri"/>
+          <w:b/>
+          <w:bCs/>
+          <w:sz w:val="22"/>
+          <w:szCs w:val="22"/>
+        </w:rPr>
+        <w:t xml:space="preserve">)</w:t>
       </w:r>
       <w:r>
         <w:rPr>
@@ -2094,7 +2131,28 @@
           <w:sz w:val="22"/>
           <w:szCs w:val="22"/>
         </w:rPr>
-        <w:t xml:space="preserve">Marketing Insights (`/marketing-insights`)</w:t>
+        <w:t xml:space="preserve">Marketing Insights (</w:t>
+      </w:r>
+      <w:r>
+        <w:rPr>
+          <w:rFonts w:ascii="Consolas" w:cs="Consolas" w:eastAsia="Consolas" w:hAnsi="Consolas"/>
+          <w:b/>
+          <w:bCs/>
+          <w:sz w:val="20"/>
+          <w:szCs w:val="20"/>
+          <w:shd w:fill="F1F3F5" w:val="clear"/>
+        </w:rPr>
+        <w:t xml:space="preserve">/marketing-insights</w:t>
+      </w:r>
+      <w:r>
+        <w:rPr>
+          <w:rFonts w:ascii="Calibri" w:cs="Calibri" w:eastAsia="Calibri" w:hAnsi="Calibri"/>
+          <w:b/>
+          <w:bCs/>
+          <w:sz w:val="22"/>
+          <w:szCs w:val="22"/>
+        </w:rPr>
+        <w:t xml:space="preserve">)</w:t>
       </w:r>
       <w:r>
         <w:rPr>
@@ -2150,32 +2208,36 @@
           <w:sz w:val="22"/>
           <w:szCs w:val="22"/>
         </w:rPr>
-        <w:t xml:space="preserve">Previews</w:t>
-      </w:r>
-      <w:r>
-        <w:rPr>
-          <w:rFonts w:ascii="Calibri" w:cs="Calibri" w:eastAsia="Calibri" w:hAnsi="Calibri"/>
-          <w:sz w:val="22"/>
-          <w:szCs w:val="22"/>
-        </w:rPr>
-        <w:t xml:space="preserve">: CRM, Online Bookings and Campaigns pages explain what is planned and are labelled "Preview".</w:t>
-      </w:r>
-    </w:p>
-    <w:p>
-      <w:pPr>
-        <w:pStyle w:val="Heading3"/>
-        <w:spacing w:after="120" w:before="280"/>
-      </w:pPr>
-      <w:r>
-        <w:rPr>
-          <w:rFonts w:ascii="Calibri" w:cs="Calibri" w:eastAsia="Calibri" w:hAnsi="Calibri"/>
+        <w:t xml:space="preserve">CRM (</w:t>
+      </w:r>
+      <w:r>
+        <w:rPr>
+          <w:rFonts w:ascii="Consolas" w:cs="Consolas" w:eastAsia="Consolas" w:hAnsi="Consolas"/>
           <w:b/>
           <w:bCs/>
-          <w:color w:val="26384B"/>
-          <w:sz w:val="24"/>
-          <w:szCs w:val="24"/>
-        </w:rPr>
-        <w:t xml:space="preserve">Practice (PMS) module</w:t>
+          <w:sz w:val="20"/>
+          <w:szCs w:val="20"/>
+          <w:shd w:fill="F1F3F5" w:val="clear"/>
+        </w:rPr>
+        <w:t xml:space="preserve">/crm</w:t>
+      </w:r>
+      <w:r>
+        <w:rPr>
+          <w:rFonts w:ascii="Calibri" w:cs="Calibri" w:eastAsia="Calibri" w:hAnsi="Calibri"/>
+          <w:b/>
+          <w:bCs/>
+          <w:sz w:val="22"/>
+          <w:szCs w:val="22"/>
+        </w:rPr>
+        <w:t xml:space="preserve">)</w:t>
+      </w:r>
+      <w:r>
+        <w:rPr>
+          <w:rFonts w:ascii="Calibri" w:cs="Calibri" w:eastAsia="Calibri" w:hAnsi="Calibri"/>
+          <w:sz w:val="22"/>
+          <w:szCs w:val="22"/>
+        </w:rPr>
+        <w:t xml:space="preserve">: a read-only directory of every patient and every enquiry-only person (25 patients plus 35 enquiry-only people in the demo). Search by name, phone or email, filter by derived stage and first-touch source, and open a detail panel with the enquiries and appointments linked to the person and links to the patient, enquiry and appointment screens. People are never merged by name, phone or email. Consent shows "Not recorded" unless a decision is recorded on the patient (only two demo patients have one), and no consent date or source is ever shown because none is stored. Marketing sees names, stage, source and a date and status for appointments, but phone, email, date of birth, patient ids and appointment details are hidden, and it gets no links into patient records. Original demo patients show source "Unknown" because no referral is recorded for them.</w:t>
       </w:r>
     </w:p>
     <w:p>
@@ -2195,32 +2257,32 @@
           <w:sz w:val="22"/>
           <w:szCs w:val="22"/>
         </w:rPr>
-        <w:t xml:space="preserve">Today (`/overview`)</w:t>
-      </w:r>
-      <w:r>
-        <w:rPr>
-          <w:rFonts w:ascii="Calibri" w:cs="Calibri" w:eastAsia="Calibri" w:hAnsi="Calibri"/>
-          <w:sz w:val="22"/>
-          <w:szCs w:val="22"/>
-        </w:rPr>
-        <w:t xml:space="preserve">: day schedule with filters, "needs attention" list, who is waiting, and a Patient flow (front desk) view with 8 patients per page. </w:t>
-      </w:r>
-      <w:r>
-        <w:rPr>
-          <w:rFonts w:ascii="Consolas" w:cs="Consolas" w:eastAsia="Consolas" w:hAnsi="Consolas"/>
-          <w:sz w:val="22"/>
-          <w:szCs w:val="22"/>
-          <w:shd w:fill="F1F3F5" w:val="clear"/>
-        </w:rPr>
-        <w:t xml:space="preserve">/front-desk</w:t>
-      </w:r>
-      <w:r>
-        <w:rPr>
-          <w:rFonts w:ascii="Calibri" w:cs="Calibri" w:eastAsia="Calibri" w:hAnsi="Calibri"/>
-          <w:sz w:val="22"/>
-          <w:szCs w:val="22"/>
-        </w:rPr>
-        <w:t xml:space="preserve"> redirects here.</w:t>
+        <w:t xml:space="preserve">Previews</w:t>
+      </w:r>
+      <w:r>
+        <w:rPr>
+          <w:rFonts w:ascii="Calibri" w:cs="Calibri" w:eastAsia="Calibri" w:hAnsi="Calibri"/>
+          <w:sz w:val="22"/>
+          <w:szCs w:val="22"/>
+        </w:rPr>
+        <w:t xml:space="preserve">: Online Bookings and Campaigns pages explain what is planned and are labelled "Preview".</w:t>
+      </w:r>
+    </w:p>
+    <w:p>
+      <w:pPr>
+        <w:pStyle w:val="Heading3"/>
+        <w:spacing w:after="120" w:before="280"/>
+      </w:pPr>
+      <w:r>
+        <w:rPr>
+          <w:rFonts w:ascii="Calibri" w:cs="Calibri" w:eastAsia="Calibri" w:hAnsi="Calibri"/>
+          <w:b/>
+          <w:bCs/>
+          <w:color w:val="26384B"/>
+          <w:sz w:val="24"/>
+          <w:szCs w:val="24"/>
+        </w:rPr>
+        <w:t xml:space="preserve">Practice (PMS) module</w:t>
       </w:r>
     </w:p>
     <w:p>
@@ -2240,15 +2302,53 @@
           <w:sz w:val="22"/>
           <w:szCs w:val="22"/>
         </w:rPr>
-        <w:t xml:space="preserve">Calendar</w:t>
-      </w:r>
-      <w:r>
-        <w:rPr>
-          <w:rFonts w:ascii="Calibri" w:cs="Calibri" w:eastAsia="Calibri" w:hAnsi="Calibri"/>
-          <w:sz w:val="22"/>
-          <w:szCs w:val="22"/>
-        </w:rPr>
-        <w:t xml:space="preserve">: day, week and month views of appointments by provider, room and location. Click an appointment for a side panel (change status, cancel, mark no-show, check out). Appointment statuses: scheduled, confirmed, arrived, waiting, in progress, completed, cancelled, no-show.</w:t>
+        <w:t xml:space="preserve">Today (</w:t>
+      </w:r>
+      <w:r>
+        <w:rPr>
+          <w:rFonts w:ascii="Consolas" w:cs="Consolas" w:eastAsia="Consolas" w:hAnsi="Consolas"/>
+          <w:b/>
+          <w:bCs/>
+          <w:sz w:val="20"/>
+          <w:szCs w:val="20"/>
+          <w:shd w:fill="F1F3F5" w:val="clear"/>
+        </w:rPr>
+        <w:t xml:space="preserve">/overview</w:t>
+      </w:r>
+      <w:r>
+        <w:rPr>
+          <w:rFonts w:ascii="Calibri" w:cs="Calibri" w:eastAsia="Calibri" w:hAnsi="Calibri"/>
+          <w:b/>
+          <w:bCs/>
+          <w:sz w:val="22"/>
+          <w:szCs w:val="22"/>
+        </w:rPr>
+        <w:t xml:space="preserve">)</w:t>
+      </w:r>
+      <w:r>
+        <w:rPr>
+          <w:rFonts w:ascii="Calibri" w:cs="Calibri" w:eastAsia="Calibri" w:hAnsi="Calibri"/>
+          <w:sz w:val="22"/>
+          <w:szCs w:val="22"/>
+        </w:rPr>
+        <w:t xml:space="preserve">: day schedule with filters, "needs attention" list, who is waiting, and a Patient flow (front desk) view with 8 patients per page. </w:t>
+      </w:r>
+      <w:r>
+        <w:rPr>
+          <w:rFonts w:ascii="Consolas" w:cs="Consolas" w:eastAsia="Consolas" w:hAnsi="Consolas"/>
+          <w:sz w:val="20"/>
+          <w:szCs w:val="20"/>
+          <w:shd w:fill="F1F3F5" w:val="clear"/>
+        </w:rPr>
+        <w:t xml:space="preserve">/front-desk</w:t>
+      </w:r>
+      <w:r>
+        <w:rPr>
+          <w:rFonts w:ascii="Calibri" w:cs="Calibri" w:eastAsia="Calibri" w:hAnsi="Calibri"/>
+          <w:sz w:val="22"/>
+          <w:szCs w:val="22"/>
+        </w:rPr>
+        <w:t xml:space="preserve"> redirects here.</w:t>
       </w:r>
     </w:p>
     <w:p>
@@ -2268,15 +2368,15 @@
           <w:sz w:val="22"/>
           <w:szCs w:val="22"/>
         </w:rPr>
-        <w:t xml:space="preserve">Patients</w:t>
-      </w:r>
-      <w:r>
-        <w:rPr>
-          <w:rFonts w:ascii="Calibri" w:cs="Calibri" w:eastAsia="Calibri" w:hAnsi="Calibri"/>
-          <w:sz w:val="22"/>
-          <w:szCs w:val="22"/>
-        </w:rPr>
-        <w:t xml:space="preserve">: searchable and filterable list (status, tag). Create patient. Patient record has five tabs: Summary, Care history, Photos, Documents &amp; forms, Financials. Includes alerts (allergy, medical), tags, referral source and marketing consent flag.</w:t>
+        <w:t xml:space="preserve">Calendar</w:t>
+      </w:r>
+      <w:r>
+        <w:rPr>
+          <w:rFonts w:ascii="Calibri" w:cs="Calibri" w:eastAsia="Calibri" w:hAnsi="Calibri"/>
+          <w:sz w:val="22"/>
+          <w:szCs w:val="22"/>
+        </w:rPr>
+        <w:t xml:space="preserve">: day, week and month views of appointments by provider, room and location. Click an appointment for a side panel (change status, cancel, mark no-show, check out). Appointment statuses: scheduled, confirmed, arrived, waiting, in progress, completed, cancelled, no-show.</w:t>
       </w:r>
     </w:p>
     <w:p>
@@ -2296,15 +2396,15 @@
           <w:sz w:val="22"/>
           <w:szCs w:val="22"/>
         </w:rPr>
-        <w:t xml:space="preserve">Visits</w:t>
-      </w:r>
-      <w:r>
-        <w:rPr>
-          <w:rFonts w:ascii="Calibri" w:cs="Calibri" w:eastAsia="Calibri" w:hAnsi="Calibri"/>
-          <w:sz w:val="22"/>
-          <w:szCs w:val="22"/>
-        </w:rPr>
-        <w:t xml:space="preserve">: documentation per visit with SOAP-style notes, treatments, forms and consent, follow-up instructions, treatment plan, billing. Tabs adapt to the clinic type and to what each service enables. Aesthetics extras: guided photo capture and an injection plotting map with product and units.</w:t>
+        <w:t xml:space="preserve">Patients</w:t>
+      </w:r>
+      <w:r>
+        <w:rPr>
+          <w:rFonts w:ascii="Calibri" w:cs="Calibri" w:eastAsia="Calibri" w:hAnsi="Calibri"/>
+          <w:sz w:val="22"/>
+          <w:szCs w:val="22"/>
+        </w:rPr>
+        <w:t xml:space="preserve">: searchable and filterable list (status, tag). Create patient. Patient record has five tabs: Summary, Care history, Photos, Documents &amp; forms, Financials. Includes alerts (allergy, medical), tags, referral source and marketing consent (Granted, Not granted or Not recorded).</w:t>
       </w:r>
     </w:p>
     <w:p>
@@ -2324,15 +2424,15 @@
           <w:sz w:val="22"/>
           <w:szCs w:val="22"/>
         </w:rPr>
-        <w:t xml:space="preserve">Follow-ups</w:t>
-      </w:r>
-      <w:r>
-        <w:rPr>
-          <w:rFonts w:ascii="Calibri" w:cs="Calibri" w:eastAsia="Calibri" w:hAnsi="Calibri"/>
-          <w:sz w:val="22"/>
-          <w:szCs w:val="22"/>
-        </w:rPr>
-        <w:t xml:space="preserve">: due today, overdue, upcoming, completed.</w:t>
+        <w:t xml:space="preserve">Visits</w:t>
+      </w:r>
+      <w:r>
+        <w:rPr>
+          <w:rFonts w:ascii="Calibri" w:cs="Calibri" w:eastAsia="Calibri" w:hAnsi="Calibri"/>
+          <w:sz w:val="22"/>
+          <w:szCs w:val="22"/>
+        </w:rPr>
+        <w:t xml:space="preserve">: documentation per visit with SOAP-style notes, treatments, forms and consent, follow-up instructions, treatment plan, billing. Tabs adapt to the clinic type and to what each service enables. Aesthetics extras: guided photo capture and an injection plotting map with product and units.</w:t>
       </w:r>
     </w:p>
     <w:p>
@@ -2352,15 +2452,15 @@
           <w:sz w:val="22"/>
           <w:szCs w:val="22"/>
         </w:rPr>
-        <w:t xml:space="preserve">Reports</w:t>
-      </w:r>
-      <w:r>
-        <w:rPr>
-          <w:rFonts w:ascii="Calibri" w:cs="Calibri" w:eastAsia="Calibri" w:hAnsi="Calibri"/>
-          <w:sz w:val="22"/>
-          <w:szCs w:val="22"/>
-        </w:rPr>
-        <w:t xml:space="preserve">: appointment and no-show trends, provider utilization, service volume, provider and patient activity, billing summary, inventory.</w:t>
+        <w:t xml:space="preserve">Follow-ups</w:t>
+      </w:r>
+      <w:r>
+        <w:rPr>
+          <w:rFonts w:ascii="Calibri" w:cs="Calibri" w:eastAsia="Calibri" w:hAnsi="Calibri"/>
+          <w:sz w:val="22"/>
+          <w:szCs w:val="22"/>
+        </w:rPr>
+        <w:t xml:space="preserve">: due today, overdue, upcoming, completed.</w:t>
       </w:r>
     </w:p>
     <w:p>
@@ -2380,15 +2480,15 @@
           <w:sz w:val="22"/>
           <w:szCs w:val="22"/>
         </w:rPr>
-        <w:t xml:space="preserve">Agents and EVI</w:t>
-      </w:r>
-      <w:r>
-        <w:rPr>
-          <w:rFonts w:ascii="Calibri" w:cs="Calibri" w:eastAsia="Calibri" w:hAnsi="Calibri"/>
-          <w:sz w:val="22"/>
-          <w:szCs w:val="22"/>
-        </w:rPr>
-        <w:t xml:space="preserve">: "EVI" is a chat assistant (Ctrl+J) and agents page. Visit prep, follow-up, appointment, recall, no-show and insights agents produce findings from the mock data. They propose items for a person to approve and never act alone. Engagement, Scribe and Receptionist are shown as not live. This is rule-based logic over sample data, not a connected AI model.</w:t>
+        <w:t xml:space="preserve">Reports</w:t>
+      </w:r>
+      <w:r>
+        <w:rPr>
+          <w:rFonts w:ascii="Calibri" w:cs="Calibri" w:eastAsia="Calibri" w:hAnsi="Calibri"/>
+          <w:sz w:val="22"/>
+          <w:szCs w:val="22"/>
+        </w:rPr>
+        <w:t xml:space="preserve">: appointment and no-show trends, provider utilization, service volume, provider and patient activity, billing summary, inventory.</w:t>
       </w:r>
     </w:p>
     <w:p>
@@ -2403,16 +2503,48 @@
       <w:r>
         <w:rPr>
           <w:rFonts w:ascii="Calibri" w:cs="Calibri" w:eastAsia="Calibri" w:hAnsi="Calibri"/>
-          <w:sz w:val="22"/>
-          <w:szCs w:val="22"/>
-        </w:rPr>
-        <w:t xml:space="preserve">**Practice configuration (</w:t>
+          <w:b/>
+          <w:bCs/>
+          <w:sz w:val="22"/>
+          <w:szCs w:val="22"/>
+        </w:rPr>
+        <w:t xml:space="preserve">Agents and EVI</w:t>
+      </w:r>
+      <w:r>
+        <w:rPr>
+          <w:rFonts w:ascii="Calibri" w:cs="Calibri" w:eastAsia="Calibri" w:hAnsi="Calibri"/>
+          <w:sz w:val="22"/>
+          <w:szCs w:val="22"/>
+        </w:rPr>
+        <w:t xml:space="preserve">: "EVI" is a chat assistant (Ctrl+J) and agents page. Visit prep, follow-up, appointment, recall, no-show and insights agents produce findings from the mock data. They propose items for a person to approve and never act alone. Engagement, Scribe and Receptionist are shown as not live. This is rule-based logic over sample data, not a connected AI model.</w:t>
+      </w:r>
+    </w:p>
+    <w:p>
+      <w:pPr>
+        <w:pStyle w:val="ListParagraph"/>
+        <w:numPr>
+          <w:ilvl w:val="0"/>
+          <w:numId w:val="2"/>
+        </w:numPr>
+        <w:spacing w:after="60"/>
+      </w:pPr>
+      <w:r>
+        <w:rPr>
+          <w:rFonts w:ascii="Calibri" w:cs="Calibri" w:eastAsia="Calibri" w:hAnsi="Calibri"/>
+          <w:b/>
+          <w:bCs/>
+          <w:sz w:val="22"/>
+          <w:szCs w:val="22"/>
+        </w:rPr>
+        <w:t xml:space="preserve">Practice configuration (</w:t>
       </w:r>
       <w:r>
         <w:rPr>
           <w:rFonts w:ascii="Consolas" w:cs="Consolas" w:eastAsia="Consolas" w:hAnsi="Consolas"/>
-          <w:sz w:val="22"/>
-          <w:szCs w:val="22"/>
+          <w:b/>
+          <w:bCs/>
+          <w:sz w:val="20"/>
+          <w:szCs w:val="20"/>
           <w:shd w:fill="F1F3F5" w:val="clear"/>
         </w:rPr>
         <w:t xml:space="preserve">/practice/*</w:t>
@@ -2420,10 +2552,20 @@
       <w:r>
         <w:rPr>
           <w:rFonts w:ascii="Calibri" w:cs="Calibri" w:eastAsia="Calibri" w:hAnsi="Calibri"/>
-          <w:sz w:val="22"/>
-          <w:szCs w:val="22"/>
-        </w:rPr>
-        <w:t xml:space="preserve">)**: Team (providers and users), Services and treatments (with per-service capability toggles), Inventory, Locations and rooms, Forms (templates), Integrations (EVOQ Campaigns, Billing, Messaging toggles, demo only), Settings (clinic type, scheduling, patient rules, photos, billing, notifications, agents on/off, security, roles and permissions, audit log).</w:t>
+          <w:b/>
+          <w:bCs/>
+          <w:sz w:val="22"/>
+          <w:szCs w:val="22"/>
+        </w:rPr>
+        <w:t xml:space="preserve">)</w:t>
+      </w:r>
+      <w:r>
+        <w:rPr>
+          <w:rFonts w:ascii="Calibri" w:cs="Calibri" w:eastAsia="Calibri" w:hAnsi="Calibri"/>
+          <w:sz w:val="22"/>
+          <w:szCs w:val="22"/>
+        </w:rPr>
+        <w:t xml:space="preserve">: Team (providers and users), Services and treatments (with per-service capability toggles), Inventory, Locations and rooms, Forms (templates), Integrations (EVOQ Campaigns, Billing, Messaging toggles, demo only), Settings (clinic type, scheduling, patient rules, photos, billing, notifications, agents on/off, security, roles and permissions, audit log).</w:t>
       </w:r>
     </w:p>
     <w:p>
@@ -2591,6 +2733,7 @@
       </w:tblGrid>
       <w:tr>
         <w:trPr>
+          <w:cantSplit/>
           <w:tblHeader/>
         </w:trPr>
         <w:tc>
@@ -2827,6 +2970,7 @@
       </w:tr>
       <w:tr>
         <w:trPr>
+          <w:cantSplit/>
           <w:tblHeader w:val="off"/>
         </w:trPr>
         <w:tc>
@@ -3046,6 +3190,7 @@
       </w:tr>
       <w:tr>
         <w:trPr>
+          <w:cantSplit/>
           <w:tblHeader w:val="off"/>
         </w:trPr>
         <w:tc>
@@ -3235,6 +3380,7 @@
       </w:tr>
       <w:tr>
         <w:trPr>
+          <w:cantSplit/>
           <w:tblHeader w:val="off"/>
         </w:trPr>
         <w:tc>
@@ -3434,6 +3580,7 @@
       </w:tr>
       <w:tr>
         <w:trPr>
+          <w:cantSplit/>
           <w:tblHeader w:val="off"/>
         </w:trPr>
         <w:tc>
@@ -3633,6 +3780,7 @@
       </w:tr>
       <w:tr>
         <w:trPr>
+          <w:cantSplit/>
           <w:tblHeader w:val="off"/>
         </w:trPr>
         <w:tc>
@@ -3822,6 +3970,7 @@
       </w:tr>
       <w:tr>
         <w:trPr>
+          <w:cantSplit/>
           <w:tblHeader w:val="off"/>
         </w:trPr>
         <w:tc>
@@ -4031,6 +4180,7 @@
       </w:tr>
       <w:tr>
         <w:trPr>
+          <w:cantSplit/>
           <w:tblHeader w:val="off"/>
         </w:trPr>
         <w:tc>
@@ -4230,6 +4380,7 @@
       </w:tr>
       <w:tr>
         <w:trPr>
+          <w:cantSplit/>
           <w:tblHeader w:val="off"/>
         </w:trPr>
         <w:tc>
@@ -4419,6 +4570,7 @@
       </w:tr>
       <w:tr>
         <w:trPr>
+          <w:cantSplit/>
           <w:tblHeader w:val="off"/>
         </w:trPr>
         <w:tc>
@@ -4608,6 +4760,7 @@
       </w:tr>
       <w:tr>
         <w:trPr>
+          <w:cantSplit/>
           <w:tblHeader w:val="off"/>
         </w:trPr>
         <w:tc>
@@ -4807,6 +4960,7 @@
       </w:tr>
       <w:tr>
         <w:trPr>
+          <w:cantSplit/>
           <w:tblHeader w:val="off"/>
         </w:trPr>
         <w:tc>
@@ -5016,6 +5170,7 @@
       </w:tr>
       <w:tr>
         <w:trPr>
+          <w:cantSplit/>
           <w:tblHeader w:val="off"/>
         </w:trPr>
         <w:tc>
@@ -5215,6 +5370,7 @@
       </w:tr>
       <w:tr>
         <w:trPr>
+          <w:cantSplit/>
           <w:tblHeader w:val="off"/>
         </w:trPr>
         <w:tc>
@@ -5424,6 +5580,7 @@
       </w:tr>
       <w:tr>
         <w:trPr>
+          <w:cantSplit/>
           <w:tblHeader w:val="off"/>
         </w:trPr>
         <w:tc>
@@ -5643,6 +5800,7 @@
       </w:tr>
       <w:tr>
         <w:trPr>
+          <w:cantSplit/>
           <w:tblHeader w:val="off"/>
         </w:trPr>
         <w:tc>
@@ -5842,6 +6000,7 @@
       </w:tr>
       <w:tr>
         <w:trPr>
+          <w:cantSplit/>
           <w:tblHeader w:val="off"/>
         </w:trPr>
         <w:tc>
@@ -6051,6 +6210,7 @@
       </w:tr>
       <w:tr>
         <w:trPr>
+          <w:cantSplit/>
           <w:tblHeader w:val="off"/>
         </w:trPr>
         <w:tc>
@@ -6250,6 +6410,7 @@
       </w:tr>
       <w:tr>
         <w:trPr>
+          <w:cantSplit/>
           <w:tblHeader w:val="off"/>
         </w:trPr>
         <w:tc>
@@ -6553,7 +6714,7 @@
           <w:sz w:val="22"/>
           <w:szCs w:val="22"/>
         </w:rPr>
-        <w:t xml:space="preserve">CRM, booking and campaign permissions only gate their preview pages, because those modules have no features yet.</w:t>
+        <w:t xml:space="preserve">The CRM permission gates the contact directory. Booking and campaign permissions only gate their preview pages, because those modules have no features yet.</w:t>
       </w:r>
     </w:p>
     <w:p>
@@ -6647,8 +6808,8 @@
       <w:r>
         <w:rPr>
           <w:rFonts w:ascii="Consolas" w:cs="Consolas" w:eastAsia="Consolas" w:hAnsi="Consolas"/>
-          <w:sz w:val="22"/>
-          <w:szCs w:val="22"/>
+          <w:sz w:val="20"/>
+          <w:szCs w:val="20"/>
           <w:shd w:fill="F1F3F5" w:val="clear"/>
         </w:rPr>
         <w:t xml:space="preserve">src/lib/db.ts</w:t>
@@ -6664,8 +6825,8 @@
       <w:r>
         <w:rPr>
           <w:rFonts w:ascii="Consolas" w:cs="Consolas" w:eastAsia="Consolas" w:hAnsi="Consolas"/>
-          <w:sz w:val="22"/>
-          <w:szCs w:val="22"/>
+          <w:sz w:val="20"/>
+          <w:szCs w:val="20"/>
           <w:shd w:fill="F1F3F5" w:val="clear"/>
         </w:rPr>
         <w:t xml:space="preserve">src/lib/clinical.ts</w:t>
@@ -6676,7 +6837,24 @@
           <w:sz w:val="22"/>
           <w:szCs w:val="22"/>
         </w:rPr>
-        <w:t xml:space="preserve">: 25 patients (12 original plus 13 created from converted enquiries), 3 providers, 7 services, 2 locations, 6 rooms, 6 users, appointments dated around 2026-10-07 (a fixed "today" and a demo clock), visits, photos, invoices, inventory, forms, treatment plans, audit entries.</w:t>
+        <w:t xml:space="preserve">: 25 patients (12 original plus 13 created from converted enquiries, built once by </w:t>
+      </w:r>
+      <w:r>
+        <w:rPr>
+          <w:rFonts w:ascii="Consolas" w:cs="Consolas" w:eastAsia="Consolas" w:hAnsi="Consolas"/>
+          <w:sz w:val="20"/>
+          <w:szCs w:val="20"/>
+          <w:shd w:fill="F1F3F5" w:val="clear"/>
+        </w:rPr>
+        <w:t xml:space="preserve">src/lib/demo-seed.ts</w:t>
+      </w:r>
+      <w:r>
+        <w:rPr>
+          <w:rFonts w:ascii="Calibri" w:cs="Calibri" w:eastAsia="Calibri" w:hAnsi="Calibri"/>
+          <w:sz w:val="22"/>
+          <w:szCs w:val="22"/>
+        </w:rPr>
+        <w:t xml:space="preserve"> so every page sees the same data), 3 providers, 7 services, 2 locations, 6 rooms, 6 users, appointments dated around 2026-10-07 (a fixed "today" and a demo clock), visits, photos, invoices, inventory, forms, treatment plans, audit entries.</w:t>
       </w:r>
     </w:p>
     <w:p>
@@ -6709,8 +6887,8 @@
       <w:r>
         <w:rPr>
           <w:rFonts w:ascii="Consolas" w:cs="Consolas" w:eastAsia="Consolas" w:hAnsi="Consolas"/>
-          <w:sz w:val="22"/>
-          <w:szCs w:val="22"/>
+          <w:sz w:val="20"/>
+          <w:szCs w:val="20"/>
           <w:shd w:fill="F1F3F5" w:val="clear"/>
         </w:rPr>
         <w:t xml:space="preserve">Contact</w:t>
@@ -6726,8 +6904,8 @@
       <w:r>
         <w:rPr>
           <w:rFonts w:ascii="Consolas" w:cs="Consolas" w:eastAsia="Consolas" w:hAnsi="Consolas"/>
-          <w:sz w:val="22"/>
-          <w:szCs w:val="22"/>
+          <w:sz w:val="20"/>
+          <w:szCs w:val="20"/>
           <w:shd w:fill="F1F3F5" w:val="clear"/>
         </w:rPr>
         <w:t xml:space="preserve">src/platform/contact.ts</w:t>
@@ -6738,7 +6916,7 @@
           <w:sz w:val="22"/>
           <w:szCs w:val="22"/>
         </w:rPr>
-        <w:t xml:space="preserve">) is a proposed shared person record with per-channel, per-purpose consent. It is not wired into PMS data. CRM shows contacts derived from patients as an interim demo. Ownership between Patient, CRM and Contact is a decision still to agree with the backend developer (see ARCHITECTURE.md).</w:t>
+        <w:t xml:space="preserve">) is a proposed shared person record with per-channel, per-purpose consent. It is not wired into PMS data. The CRM directory builds its rows from patients and enquiries with temporary keys and does not use this type. Ownership between Patient, CRM and Contact is a decision still to agree with the backend developer (see ARCHITECTURE.md).</w:t>
       </w:r>
     </w:p>
     <w:p>
@@ -6791,7 +6969,7 @@
           <w:sz w:val="22"/>
           <w:szCs w:val="22"/>
         </w:rPr>
-        <w:t xml:space="preserve">CRM, Online Bookings and Campaigns features. Messaging, email/SMS sending, online booking page, payment processing, EVOQ Billing and Campaigns connections.</w:t>
+        <w:t xml:space="preserve">CRM pipeline, owners, tasks, merging and editing (the directory is read-only), and Online Bookings and Campaigns features. Messaging, email/SMS sending, online booking page, payment processing, EVOQ Billing and Campaigns connections.</w:t>
       </w:r>
     </w:p>
     <w:p>
@@ -6939,8 +7117,8 @@
       <w:r>
         <w:rPr>
           <w:rFonts w:ascii="Consolas" w:cs="Consolas" w:eastAsia="Consolas" w:hAnsi="Consolas"/>
-          <w:sz w:val="22"/>
-          <w:szCs w:val="22"/>
+          <w:sz w:val="20"/>
+          <w:szCs w:val="20"/>
           <w:shd w:fill="F1F3F5" w:val="clear"/>
         </w:rPr>
         <w:t xml:space="preserve">pms.*</w:t>
@@ -6974,8 +7152,8 @@
       <w:r>
         <w:rPr>
           <w:rFonts w:ascii="Consolas" w:cs="Consolas" w:eastAsia="Consolas" w:hAnsi="Consolas"/>
-          <w:sz w:val="22"/>
-          <w:szCs w:val="22"/>
+          <w:sz w:val="20"/>
+          <w:szCs w:val="20"/>
           <w:shd w:fill="F1F3F5" w:val="clear"/>
         </w:rPr>
         <w:t xml:space="preserve">Patient</w:t>
@@ -7148,8 +7326,8 @@
       <w:r>
         <w:rPr>
           <w:rFonts w:ascii="Consolas" w:cs="Consolas" w:eastAsia="Consolas" w:hAnsi="Consolas"/>
-          <w:sz w:val="22"/>
-          <w:szCs w:val="22"/>
+          <w:sz w:val="20"/>
+          <w:szCs w:val="20"/>
           <w:shd w:fill="F1F3F5" w:val="clear"/>
         </w:rPr>
         <w:t xml:space="preserve">pms.*</w:t>
@@ -7343,6 +7521,9 @@
       <w:pPr>
         <w:ind w:left="720" w:hanging="360"/>
       </w:pPr>
+      <w:rPr>
+        <w:rFonts w:ascii="Calibri" w:cs="Calibri" w:eastAsia="Calibri" w:hAnsi="Calibri"/>
+      </w:rPr>
     </w:lvl>
   </w:abstractNum>
   <w:abstractNum w:abstractNumId="3" w15:restartNumberingAfterBreak="0">
@@ -7355,6 +7536,9 @@
       <w:pPr>
         <w:ind w:left="720" w:hanging="360"/>
       </w:pPr>
+      <w:rPr>
+        <w:rFonts w:ascii="Calibri" w:cs="Calibri" w:eastAsia="Calibri" w:hAnsi="Calibri"/>
+      </w:rPr>
     </w:lvl>
   </w:abstractNum>
   <w:num w:numId="1">

</xml_diff>

<commit_message>
feat: complete frontend modules (comms, campaigns, online booking) and availability rules
- Appointments: central status rules, logged history (cancel, no-show, reschedule),
  enquiry-to-appointment link and duplicate-booking prompt
- Communications: shared consent and eligibility rule, simulated messaging panel
- Campaigns: audience preview from CRM contacts, scheduling and simulated runs
- Online Bookings: public /book and /book/manage journey, staff /booking page
- Availability: provider weekdays and time off, buffer, practice break, closed
  dates, notice period and booking window, shared by internal and online booking
- Patient Summary: alerts and patient information first, container-query layout
- Shell: content width cap raised to 1760px
- Docs: identity decisions, developer instructions, architecture and overview
- Tests: 64 passing (new suites for appointments, comms, campaigns, booking, availability)

Co-Authored-By: Claude Sonnet 5.5 <noreply@anthropic.com>
</commit_message>
<xml_diff>
--- a/docs/APP_OVERVIEW.docx
+++ b/docs/APP_OVERVIEW.docx
@@ -775,7 +775,7 @@
                 <w:sz w:val="19"/>
                 <w:szCs w:val="19"/>
               </w:rPr>
-              <w:t xml:space="preserve">: 28 unit tests for permissions, the shared seed, appointment/insights logic, the Flow layout and CRM contact derivation. No UI test suite</w:t>
+              <w:t xml:space="preserve">: 57 unit tests for permissions, the shared seed, appointment/insights logic, the Flow layout, CRM contact derivation, appointment rules, messaging eligibility, campaigns and online booking. No UI test suite</w:t>
             </w:r>
           </w:p>
         </w:tc>
@@ -1722,6 +1722,37 @@
               </w:rPr>
               <w:t xml:space="preserve">/booking</w:t>
             </w:r>
+            <w:r>
+              <w:rPr>
+                <w:rFonts w:ascii="Calibri" w:cs="Calibri" w:eastAsia="Calibri" w:hAnsi="Calibri"/>
+                <w:b w:val="false"/>
+                <w:bCs w:val="false"/>
+                <w:sz w:val="19"/>
+                <w:szCs w:val="19"/>
+              </w:rPr>
+              <w:t xml:space="preserve"> (staff), </w:t>
+            </w:r>
+            <w:r>
+              <w:rPr>
+                <w:rFonts w:ascii="Consolas" w:cs="Consolas" w:eastAsia="Consolas" w:hAnsi="Consolas"/>
+                <w:b w:val="false"/>
+                <w:bCs w:val="false"/>
+                <w:sz w:val="17"/>
+                <w:szCs w:val="17"/>
+                <w:shd w:fill="F1F3F5" w:val="clear"/>
+              </w:rPr>
+              <w:t xml:space="preserve">/book</w:t>
+            </w:r>
+            <w:r>
+              <w:rPr>
+                <w:rFonts w:ascii="Calibri" w:cs="Calibri" w:eastAsia="Calibri" w:hAnsi="Calibri"/>
+                <w:b w:val="false"/>
+                <w:bCs w:val="false"/>
+                <w:sz w:val="19"/>
+                <w:szCs w:val="19"/>
+              </w:rPr>
+              <w:t xml:space="preserve"> (public)</w:t>
+            </w:r>
           </w:p>
         </w:tc>
         <w:tc>
@@ -1752,7 +1783,7 @@
                 <w:sz w:val="19"/>
                 <w:szCs w:val="19"/>
               </w:rPr>
-              <w:t xml:space="preserve">Preview only</w:t>
+              <w:t xml:space="preserve">Working in demo mode: public booking journey that follows provider days, time off, breaks, closed dates and notice rules (on demo data), practice settings, list of online bookings</w:t>
             </w:r>
           </w:p>
         </w:tc>
@@ -1855,7 +1886,7 @@
                 <w:sz w:val="19"/>
                 <w:szCs w:val="19"/>
               </w:rPr>
-              <w:t xml:space="preserve">Preview only</w:t>
+              <w:t xml:space="preserve">Working in demo mode: campaign list and editor, consent-based audience preview, simulated runs. Nothing is sent</w:t>
             </w:r>
           </w:p>
         </w:tc>
@@ -2237,7 +2268,7 @@
           <w:sz w:val="22"/>
           <w:szCs w:val="22"/>
         </w:rPr>
-        <w:t xml:space="preserve">: a read-only directory of every patient and every enquiry-only person (25 patients plus 35 enquiry-only people in the demo). Search by name, phone or email, filter by derived stage and first-touch source, and open a detail panel with the enquiries and appointments linked to the person and links to the patient, enquiry and appointment screens. People are never merged by name, phone or email. Consent shows "Not recorded" unless a decision is recorded on the patient (only two demo patients have one), and no consent date or source is ever shown because none is stored. Marketing sees names, stage, source and a date and status for appointments, but phone, email, date of birth, patient ids and appointment details are hidden, and it gets no links into patient records. Original demo patients show source "Unknown" because no referral is recorded for them.</w:t>
+        <w:t xml:space="preserve">: a read-only directory of every patient and every enquiry-only person (25 patients plus 35 enquiry-only people in the demo). Search by name, phone or email, filter by derived stage and first-touch source, and open a detail panel with the enquiries and appointments linked to the person and links to the patient, enquiry and appointment screens. People are never merged by name, phone or email. Consent shows "Not recorded" unless a decision is recorded on the patient (only nine demo patients have one), and no consent date or source is ever shown because none is stored. Marketing sees names, stage, source and a date and status for appointments, but phone, email, date of birth, patient ids and appointment details are hidden, and it gets no links into patient records. Original demo patients show source "Unknown" because no referral is recorded for them.</w:t>
       </w:r>
     </w:p>
     <w:p>
@@ -2257,15 +2288,143 @@
           <w:sz w:val="22"/>
           <w:szCs w:val="22"/>
         </w:rPr>
-        <w:t xml:space="preserve">Previews</w:t>
-      </w:r>
-      <w:r>
-        <w:rPr>
-          <w:rFonts w:ascii="Calibri" w:cs="Calibri" w:eastAsia="Calibri" w:hAnsi="Calibri"/>
-          <w:sz w:val="22"/>
-          <w:szCs w:val="22"/>
-        </w:rPr>
-        <w:t xml:space="preserve">: Online Bookings and Campaigns pages explain what is planned and are labelled "Preview".</w:t>
+        <w:t xml:space="preserve">Messages</w:t>
+      </w:r>
+      <w:r>
+        <w:rPr>
+          <w:rFonts w:ascii="Calibri" w:cs="Calibri" w:eastAsia="Calibri" w:hAnsi="Calibri"/>
+          <w:sz w:val="22"/>
+          <w:szCs w:val="22"/>
+        </w:rPr>
+        <w:t xml:space="preserve">: every enquiry has a message history and one composer for email, SMS and call logs. Sending is simulated and labelled "Demo only, not delivered". A consent and eligibility summary shows marketing eligibility (an explicit yes is required) separately from service messages. The CRM contact panel shows the same history read-only.</w:t>
+      </w:r>
+    </w:p>
+    <w:p>
+      <w:pPr>
+        <w:pStyle w:val="ListParagraph"/>
+        <w:numPr>
+          <w:ilvl w:val="0"/>
+          <w:numId w:val="2"/>
+        </w:numPr>
+        <w:spacing w:after="60"/>
+      </w:pPr>
+      <w:r>
+        <w:rPr>
+          <w:rFonts w:ascii="Calibri" w:cs="Calibri" w:eastAsia="Calibri" w:hAnsi="Calibri"/>
+          <w:b/>
+          <w:bCs/>
+          <w:sz w:val="22"/>
+          <w:szCs w:val="22"/>
+        </w:rPr>
+        <w:t xml:space="preserve">Campaigns (</w:t>
+      </w:r>
+      <w:r>
+        <w:rPr>
+          <w:rFonts w:ascii="Consolas" w:cs="Consolas" w:eastAsia="Consolas" w:hAnsi="Consolas"/>
+          <w:b/>
+          <w:bCs/>
+          <w:sz w:val="20"/>
+          <w:szCs w:val="20"/>
+          <w:shd w:fill="F1F3F5" w:val="clear"/>
+        </w:rPr>
+        <w:t xml:space="preserve">/campaigns</w:t>
+      </w:r>
+      <w:r>
+        <w:rPr>
+          <w:rFonts w:ascii="Calibri" w:cs="Calibri" w:eastAsia="Calibri" w:hAnsi="Calibri"/>
+          <w:b/>
+          <w:bCs/>
+          <w:sz w:val="22"/>
+          <w:szCs w:val="22"/>
+        </w:rPr>
+        <w:t xml:space="preserve">)</w:t>
+      </w:r>
+      <w:r>
+        <w:rPr>
+          <w:rFonts w:ascii="Calibri" w:cs="Calibri" w:eastAsia="Calibri" w:hAnsi="Calibri"/>
+          <w:sz w:val="22"/>
+          <w:szCs w:val="22"/>
+        </w:rPr>
+        <w:t xml:space="preserve">: create and edit email or SMS campaigns, choose an audience by stage and source, and see who is eligible and why others are left out. Only people with explicit marketing consent are eligible, and SMS marketing is always blocked because no SMS consent is stored. Schedule (demo) or "Simulate send", which records simulated messages in recipients' histories. The one set of performance figures is labelled sample data.</w:t>
+      </w:r>
+    </w:p>
+    <w:p>
+      <w:pPr>
+        <w:pStyle w:val="ListParagraph"/>
+        <w:numPr>
+          <w:ilvl w:val="0"/>
+          <w:numId w:val="2"/>
+        </w:numPr>
+        <w:spacing w:after="60"/>
+      </w:pPr>
+      <w:r>
+        <w:rPr>
+          <w:rFonts w:ascii="Calibri" w:cs="Calibri" w:eastAsia="Calibri" w:hAnsi="Calibri"/>
+          <w:b/>
+          <w:bCs/>
+          <w:sz w:val="22"/>
+          <w:szCs w:val="22"/>
+        </w:rPr>
+        <w:t xml:space="preserve">Online Bookings</w:t>
+      </w:r>
+      <w:r>
+        <w:rPr>
+          <w:rFonts w:ascii="Calibri" w:cs="Calibri" w:eastAsia="Calibri" w:hAnsi="Calibri"/>
+          <w:sz w:val="22"/>
+          <w:szCs w:val="22"/>
+        </w:rPr>
+        <w:t xml:space="preserve">: the practice page (</w:t>
+      </w:r>
+      <w:r>
+        <w:rPr>
+          <w:rFonts w:ascii="Consolas" w:cs="Consolas" w:eastAsia="Consolas" w:hAnsi="Consolas"/>
+          <w:sz w:val="20"/>
+          <w:szCs w:val="20"/>
+          <w:shd w:fill="F1F3F5" w:val="clear"/>
+        </w:rPr>
+        <w:t xml:space="preserve">/booking</w:t>
+      </w:r>
+      <w:r>
+        <w:rPr>
+          <w:rFonts w:ascii="Calibri" w:cs="Calibri" w:eastAsia="Calibri" w:hAnsi="Calibri"/>
+          <w:sz w:val="22"/>
+          <w:szCs w:val="22"/>
+        </w:rPr>
+        <w:t xml:space="preserve">) controls which services are offered and lists online bookings. The public page (</w:t>
+      </w:r>
+      <w:r>
+        <w:rPr>
+          <w:rFonts w:ascii="Consolas" w:cs="Consolas" w:eastAsia="Consolas" w:hAnsi="Consolas"/>
+          <w:sz w:val="20"/>
+          <w:szCs w:val="20"/>
+          <w:shd w:fill="F1F3F5" w:val="clear"/>
+        </w:rPr>
+        <w:t xml:space="preserve">/book</w:t>
+      </w:r>
+      <w:r>
+        <w:rPr>
+          <w:rFonts w:ascii="Calibri" w:cs="Calibri" w:eastAsia="Calibri" w:hAnsi="Calibri"/>
+          <w:sz w:val="22"/>
+          <w:szCs w:val="22"/>
+        </w:rPr>
+        <w:t xml:space="preserve">) is a five-step journey that ends in a normal appointment. It offers only times the practice could book itself: working hours, each provider's days and time off, the practice break, closed dates, the buffer between visits, a notice period and a booking window, and </w:t>
+      </w:r>
+      <w:r>
+        <w:rPr>
+          <w:rFonts w:ascii="Consolas" w:cs="Consolas" w:eastAsia="Consolas" w:hAnsi="Consolas"/>
+          <w:sz w:val="20"/>
+          <w:szCs w:val="20"/>
+          <w:shd w:fill="F1F3F5" w:val="clear"/>
+        </w:rPr>
+        <w:t xml:space="preserve">/book/manage</w:t>
+      </w:r>
+      <w:r>
+        <w:rPr>
+          <w:rFonts w:ascii="Calibri" w:cs="Calibri" w:eastAsia="Calibri" w:hAnsi="Calibri"/>
+          <w:sz w:val="22"/>
+          <w:szCs w:val="22"/>
+        </w:rPr>
+        <w:t xml:space="preserve"> lets a person change or cancel with a reference and email. Nothing is emailed or texted.</w:t>
       </w:r>
     </w:p>
     <w:p>
@@ -6714,7 +6873,75 @@
           <w:sz w:val="22"/>
           <w:szCs w:val="22"/>
         </w:rPr>
-        <w:t xml:space="preserve">The CRM permission gates the contact directory. Booking and campaign permissions only gate their preview pages, because those modules have no features yet.</w:t>
+        <w:t xml:space="preserve">The CRM permission gates the contact directory. Campaign and booking permissions gate their modules: managing needs </w:t>
+      </w:r>
+      <w:r>
+        <w:rPr>
+          <w:rFonts w:ascii="Consolas" w:cs="Consolas" w:eastAsia="Consolas" w:hAnsi="Consolas"/>
+          <w:sz w:val="20"/>
+          <w:szCs w:val="20"/>
+          <w:shd w:fill="F1F3F5" w:val="clear"/>
+        </w:rPr>
+        <w:t xml:space="preserve">campaigns</w:t>
+      </w:r>
+      <w:r>
+        <w:rPr>
+          <w:rFonts w:ascii="Calibri" w:cs="Calibri" w:eastAsia="Calibri" w:hAnsi="Calibri"/>
+          <w:sz w:val="22"/>
+          <w:szCs w:val="22"/>
+        </w:rPr>
+        <w:t xml:space="preserve"> or </w:t>
+      </w:r>
+      <w:r>
+        <w:rPr>
+          <w:rFonts w:ascii="Consolas" w:cs="Consolas" w:eastAsia="Consolas" w:hAnsi="Consolas"/>
+          <w:sz w:val="20"/>
+          <w:szCs w:val="20"/>
+          <w:shd w:fill="F1F3F5" w:val="clear"/>
+        </w:rPr>
+        <w:t xml:space="preserve">booking</w:t>
+      </w:r>
+      <w:r>
+        <w:rPr>
+          <w:rFonts w:ascii="Calibri" w:cs="Calibri" w:eastAsia="Calibri" w:hAnsi="Calibri"/>
+          <w:sz w:val="22"/>
+          <w:szCs w:val="22"/>
+        </w:rPr>
+        <w:t xml:space="preserve">, and </w:t>
+      </w:r>
+      <w:r>
+        <w:rPr>
+          <w:rFonts w:ascii="Consolas" w:cs="Consolas" w:eastAsia="Consolas" w:hAnsi="Consolas"/>
+          <w:sz w:val="20"/>
+          <w:szCs w:val="20"/>
+          <w:shd w:fill="F1F3F5" w:val="clear"/>
+        </w:rPr>
+        <w:t xml:space="preserve">insights</w:t>
+      </w:r>
+      <w:r>
+        <w:rPr>
+          <w:rFonts w:ascii="Calibri" w:cs="Calibri" w:eastAsia="Calibri" w:hAnsi="Calibri"/>
+          <w:sz w:val="22"/>
+          <w:szCs w:val="22"/>
+        </w:rPr>
+        <w:t xml:space="preserve"> or </w:t>
+      </w:r>
+      <w:r>
+        <w:rPr>
+          <w:rFonts w:ascii="Consolas" w:cs="Consolas" w:eastAsia="Consolas" w:hAnsi="Consolas"/>
+          <w:sz w:val="20"/>
+          <w:szCs w:val="20"/>
+          <w:shd w:fill="F1F3F5" w:val="clear"/>
+        </w:rPr>
+        <w:t xml:space="preserve">booking_view</w:t>
+      </w:r>
+      <w:r>
+        <w:rPr>
+          <w:rFonts w:ascii="Calibri" w:cs="Calibri" w:eastAsia="Calibri" w:hAnsi="Calibri"/>
+          <w:sz w:val="22"/>
+          <w:szCs w:val="22"/>
+        </w:rPr>
+        <w:t xml:space="preserve"> alone give a read-only view. Message text needs enquiry management.</w:t>
       </w:r>
     </w:p>
     <w:p>
@@ -6969,7 +7196,7 @@
           <w:sz w:val="22"/>
           <w:szCs w:val="22"/>
         </w:rPr>
-        <w:t xml:space="preserve">CRM pipeline, owners, tasks, merging and editing (the directory is read-only), and Online Bookings and Campaigns features. Messaging, email/SMS sending, online booking page, payment processing, EVOQ Billing and Campaigns connections.</w:t>
+        <w:t xml:space="preserve">CRM pipeline, owners, tasks, merging and editing (the directory is read-only). Real delivery for Campaigns, messages and booking confirmations, real-time availability, identity checks on the public booking page. Messaging, email/SMS sending, online booking page, payment processing, EVOQ Billing and Campaigns connections.</w:t>
       </w:r>
     </w:p>
     <w:p>
@@ -7229,15 +7456,100 @@
           <w:sz w:val="22"/>
           <w:szCs w:val="22"/>
         </w:rPr>
-        <w:t xml:space="preserve">Build the next module's UI</w:t>
-      </w:r>
-      <w:r>
-        <w:rPr>
-          <w:rFonts w:ascii="Calibri" w:cs="Calibri" w:eastAsia="Calibri" w:hAnsi="Calibri"/>
-          <w:sz w:val="22"/>
-          <w:szCs w:val="22"/>
-        </w:rPr>
-        <w:t xml:space="preserve">, most reuse first: Online Bookings (can reuse providers, services, rooms and availability), then CRM, then Campaigns (audiences and consent).</w:t>
+        <w:t xml:space="preserve">Agree the identity and consent model</w:t>
+      </w:r>
+      <w:r>
+        <w:rPr>
+          <w:rFonts w:ascii="Calibri" w:cs="Calibri" w:eastAsia="Calibri" w:hAnsi="Calibri"/>
+          <w:sz w:val="22"/>
+          <w:szCs w:val="22"/>
+        </w:rPr>
+        <w:t xml:space="preserve"> in </w:t>
+      </w:r>
+      <w:r>
+        <w:rPr>
+          <w:rFonts w:ascii="Consolas" w:cs="Consolas" w:eastAsia="Consolas" w:hAnsi="Consolas"/>
+          <w:sz w:val="20"/>
+          <w:szCs w:val="20"/>
+          <w:shd w:fill="F1F3F5" w:val="clear"/>
+        </w:rPr>
+        <w:t xml:space="preserve">docs/IDENTITY_DECISIONS.md</w:t>
+      </w:r>
+      <w:r>
+        <w:rPr>
+          <w:rFonts w:ascii="Calibri" w:cs="Calibri" w:eastAsia="Calibri" w:hAnsi="Calibri"/>
+          <w:sz w:val="22"/>
+          <w:szCs w:val="22"/>
+        </w:rPr>
+        <w:t xml:space="preserve"> with the backend developer, then replace the demo data layers behind </w:t>
+      </w:r>
+      <w:r>
+        <w:rPr>
+          <w:rFonts w:ascii="Consolas" w:cs="Consolas" w:eastAsia="Consolas" w:hAnsi="Consolas"/>
+          <w:sz w:val="20"/>
+          <w:szCs w:val="20"/>
+          <w:shd w:fill="F1F3F5" w:val="clear"/>
+        </w:rPr>
+        <w:t xml:space="preserve">enquiriesApi</w:t>
+      </w:r>
+      <w:r>
+        <w:rPr>
+          <w:rFonts w:ascii="Calibri" w:cs="Calibri" w:eastAsia="Calibri" w:hAnsi="Calibri"/>
+          <w:sz w:val="22"/>
+          <w:szCs w:val="22"/>
+        </w:rPr>
+        <w:t xml:space="preserve">, </w:t>
+      </w:r>
+      <w:r>
+        <w:rPr>
+          <w:rFonts w:ascii="Consolas" w:cs="Consolas" w:eastAsia="Consolas" w:hAnsi="Consolas"/>
+          <w:sz w:val="20"/>
+          <w:szCs w:val="20"/>
+          <w:shd w:fill="F1F3F5" w:val="clear"/>
+        </w:rPr>
+        <w:t xml:space="preserve">commsApi</w:t>
+      </w:r>
+      <w:r>
+        <w:rPr>
+          <w:rFonts w:ascii="Calibri" w:cs="Calibri" w:eastAsia="Calibri" w:hAnsi="Calibri"/>
+          <w:sz w:val="22"/>
+          <w:szCs w:val="22"/>
+        </w:rPr>
+        <w:t xml:space="preserve">, </w:t>
+      </w:r>
+      <w:r>
+        <w:rPr>
+          <w:rFonts w:ascii="Consolas" w:cs="Consolas" w:eastAsia="Consolas" w:hAnsi="Consolas"/>
+          <w:sz w:val="20"/>
+          <w:szCs w:val="20"/>
+          <w:shd w:fill="F1F3F5" w:val="clear"/>
+        </w:rPr>
+        <w:t xml:space="preserve">campaignsApi</w:t>
+      </w:r>
+      <w:r>
+        <w:rPr>
+          <w:rFonts w:ascii="Calibri" w:cs="Calibri" w:eastAsia="Calibri" w:hAnsi="Calibri"/>
+          <w:sz w:val="22"/>
+          <w:szCs w:val="22"/>
+        </w:rPr>
+        <w:t xml:space="preserve"> and </w:t>
+      </w:r>
+      <w:r>
+        <w:rPr>
+          <w:rFonts w:ascii="Consolas" w:cs="Consolas" w:eastAsia="Consolas" w:hAnsi="Consolas"/>
+          <w:sz w:val="20"/>
+          <w:szCs w:val="20"/>
+          <w:shd w:fill="F1F3F5" w:val="clear"/>
+        </w:rPr>
+        <w:t xml:space="preserve">bookingApi</w:t>
+      </w:r>
+      <w:r>
+        <w:rPr>
+          <w:rFonts w:ascii="Calibri" w:cs="Calibri" w:eastAsia="Calibri" w:hAnsi="Calibri"/>
+          <w:sz w:val="22"/>
+          <w:szCs w:val="22"/>
+        </w:rPr>
+        <w:t xml:space="preserve">.</w:t>
       </w:r>
     </w:p>
     <w:p>

</xml_diff>

<commit_message>
feat: calendar stages, practice configuration clarity, form preview, agent explanations
- Calendar: booked/attending/completed/did-not-take-place stages, status key, keyboard navigation
- Dialogs and panels opened from code return focus to their opener
- Services, rooms: active/inactive meaning; inactive items not offered for new bookings
- Team: availability shown as the booking rules read it
- Inventory: movement types, visit links, editable reorder level, applied-amount ledger
- Forms: read-only preview; multi-select options shown
- Agents: "Why this appeared" on every finding; removed invented claim; cancelled bookings no longer count as next appointment
- Tests: unit and Playwright additions; docs updated

Co-Authored-By: Claude Sonnet 5.5 <noreply@anthropic.com>
</commit_message>
<xml_diff>
--- a/docs/APP_OVERVIEW.docx
+++ b/docs/APP_OVERVIEW.docx
@@ -4521,6 +4521,62 @@
           <w:szCs w:val="21"/>
         </w:rPr>
         <w:t xml:space="preserve">: "From the records in this app" (appointment records by status in the chosen range, follow-up snapshot), billing summary and inventory come from the demo records and are reconciled with the Calendar. Appointment and no-show trends, utilization, service volume, provider activity and patient activity are generated illustrative figures: they sit under a warning and each panel carries an "Illustrative" badge. The CSV export contains the record counts only.</w:t>
+      </w:r>
+    </w:p>
+    <w:p>
+      <w:pPr>
+        <w:pStyle w:val="ListParagraph"/>
+        <w:numPr>
+          <w:ilvl w:val="0"/>
+          <w:numId w:val="2"/>
+        </w:numPr>
+        <w:spacing w:after="70"/>
+      </w:pPr>
+      <w:r>
+        <w:rPr>
+          <w:rFonts w:ascii="Calibri" w:cs="Calibri" w:eastAsia="Calibri" w:hAnsi="Calibri"/>
+          <w:b/>
+          <w:bCs/>
+          <w:sz w:val="21"/>
+          <w:szCs w:val="21"/>
+        </w:rPr>
+        <w:t xml:space="preserve">Calendar</w:t>
+      </w:r>
+      <w:r>
+        <w:rPr>
+          <w:rFonts w:ascii="Calibri" w:cs="Calibri" w:eastAsia="Calibri" w:hAnsi="Calibri"/>
+          <w:sz w:val="21"/>
+          <w:szCs w:val="21"/>
+        </w:rPr>
+        <w:t xml:space="preserve">: day, week and month. Each appointment shows its stage, kept apart: Booked (scheduled, confirmed; dashed outline), Attending (arrived, waiting, in visit), Completed, and Did not take place (cancelled, no-show, labelled and struck through). A key sits under the grid. Keyboard: with the calendar focused, left and right arrows move the period and T returns to today; Enter on an appointment opens it, and Escape returns focus to it.</w:t>
+      </w:r>
+    </w:p>
+    <w:p>
+      <w:pPr>
+        <w:pStyle w:val="ListParagraph"/>
+        <w:numPr>
+          <w:ilvl w:val="0"/>
+          <w:numId w:val="2"/>
+        </w:numPr>
+        <w:spacing w:after="70"/>
+      </w:pPr>
+      <w:r>
+        <w:rPr>
+          <w:rFonts w:ascii="Calibri" w:cs="Calibri" w:eastAsia="Calibri" w:hAnsi="Calibri"/>
+          <w:b/>
+          <w:bCs/>
+          <w:sz w:val="21"/>
+          <w:szCs w:val="21"/>
+        </w:rPr>
+        <w:t xml:space="preserve">Agents and EVI</w:t>
+      </w:r>
+      <w:r>
+        <w:rPr>
+          <w:rFonts w:ascii="Calibri" w:cs="Calibri" w:eastAsia="Calibri" w:hAnsi="Calibri"/>
+          <w:sz w:val="21"/>
+          <w:szCs w:val="21"/>
+        </w:rPr>
+        <w:t xml:space="preserve">: demo agents apply fixed rules to the demo records; no AI model is connected. Each finding has a "Why this appeared" panel: the rule, what is recorded, what the rule cannot tell, and links to the patient, visit or follow-up. Nothing changes until a person approves it.</w:t>
       </w:r>
     </w:p>
     <w:p>
@@ -9096,7 +9152,7 @@
           <w:sz w:val="24"/>
           <w:szCs w:val="24"/>
         </w:rPr>
-        <w:t xml:space="preserve">Consent as shown in the app (frontend only)</w:t>
+        <w:t xml:space="preserve">Practice configuration (frontend)</w:t>
       </w:r>
     </w:p>
     <w:p>
@@ -9116,15 +9172,15 @@
           <w:sz w:val="21"/>
           <w:szCs w:val="21"/>
         </w:rPr>
-        <w:t xml:space="preserve">Marketing consent</w:t>
-      </w:r>
-      <w:r>
-        <w:rPr>
-          <w:rFonts w:ascii="Calibri" w:cs="Calibri" w:eastAsia="Calibri" w:hAnsi="Calibri"/>
-          <w:sz w:val="21"/>
-          <w:szCs w:val="21"/>
-        </w:rPr>
-        <w:t xml:space="preserve"> (patients only): Granted, Not granted (earlier record, details unknown), or Not recorded. The old stored yes/no cannot say whether someone declined, withdrew or was never asked, so it is never shown as "Withdrawn". Enquiry-only people always show Not recorded. No date or source is shown unless one exists.</w:t>
+        <w:t xml:space="preserve">Services</w:t>
+      </w:r>
+      <w:r>
+        <w:rPr>
+          <w:rFonts w:ascii="Calibri" w:cs="Calibri" w:eastAsia="Calibri" w:hAnsi="Calibri"/>
+          <w:sz w:val="21"/>
+          <w:szCs w:val="21"/>
+        </w:rPr>
+        <w:t xml:space="preserve">: Active services are offered for new bookings. Inactive services are not offered on the online booking page or in the new appointment form; existing appointments, visits and invoices keep them. Inactive rooms are treated the same way.</w:t>
       </w:r>
     </w:p>
     <w:p>
@@ -9144,15 +9200,15 @@
           <w:sz w:val="21"/>
           <w:szCs w:val="21"/>
         </w:rPr>
-        <w:t xml:space="preserve">Photo consent</w:t>
-      </w:r>
-      <w:r>
-        <w:rPr>
-          <w:rFonts w:ascii="Calibri" w:cs="Calibri" w:eastAsia="Calibri" w:hAnsi="Calibri"/>
-          <w:sz w:val="21"/>
-          <w:szCs w:val="21"/>
-        </w:rPr>
-        <w:t xml:space="preserve"> (clinical record only): Granted, Denied, Withdrawn or Not recorded. Photo capture defaults to Not recorded and no longer pre-ticks consent. Demo photos are Not recorded because the demo has no photo consent evidence. Use of a photo in marketing or teaching is a separate permission that is not modelled.</w:t>
+        <w:t xml:space="preserve">Team</w:t>
+      </w:r>
+      <w:r>
+        <w:rPr>
+          <w:rFonts w:ascii="Calibri" w:cs="Calibri" w:eastAsia="Calibri" w:hAnsi="Calibri"/>
+          <w:sz w:val="21"/>
+          <w:szCs w:val="21"/>
+        </w:rPr>
+        <w:t xml:space="preserve">: each provider's availability is shown as the booking rules actually read it (days and hours, time off). Text that cannot be read is reported and no rule is applied. The practice break, closed dates, booking notice and window are practice-wide settings.</w:t>
       </w:r>
     </w:p>
     <w:p>
@@ -9172,51 +9228,15 @@
           <w:sz w:val="21"/>
           <w:szCs w:val="21"/>
         </w:rPr>
-        <w:t xml:space="preserve">Treatment consent</w:t>
-      </w:r>
-      <w:r>
-        <w:rPr>
-          <w:rFonts w:ascii="Calibri" w:cs="Calibri" w:eastAsia="Calibri" w:hAnsi="Calibri"/>
-          <w:sz w:val="21"/>
-          <w:szCs w:val="21"/>
-        </w:rPr>
-        <w:t xml:space="preserve"> is read only from signed consent forms and filed consent documents. </w:t>
-      </w:r>
-      <w:r>
-        <w:rPr>
-          <w:rFonts w:ascii="Calibri" w:cs="Calibri" w:eastAsia="Calibri" w:hAnsi="Calibri"/>
-          <w:b/>
-          <w:bCs/>
-          <w:sz w:val="21"/>
-          <w:szCs w:val="21"/>
-        </w:rPr>
-        <w:t xml:space="preserve">Care communication preferences</w:t>
-      </w:r>
-      <w:r>
-        <w:rPr>
-          <w:rFonts w:ascii="Calibri" w:cs="Calibri" w:eastAsia="Calibri" w:hAnsi="Calibri"/>
-          <w:sz w:val="21"/>
-          <w:szCs w:val="21"/>
-        </w:rPr>
-        <w:t xml:space="preserve"> are not modelled. The four are kept separate and none is inferred from another.</w:t>
-      </w:r>
-    </w:p>
-    <w:p>
-      <w:pPr>
-        <w:pStyle w:val="Heading2"/>
-        <w:keepNext/>
-        <w:spacing w:after="100" w:before="320"/>
-      </w:pPr>
-      <w:r>
-        <w:rPr>
-          <w:rFonts w:ascii="Calibri" w:cs="Calibri" w:eastAsia="Calibri" w:hAnsi="Calibri"/>
-          <w:b/>
-          <w:bCs/>
-          <w:color w:val="2867B2"/>
-          <w:sz w:val="30"/>
-          <w:szCs w:val="30"/>
-        </w:rPr>
-        <w:t xml:space="preserve">8. Not built or not real</w:t>
+        <w:t xml:space="preserve">Inventory</w:t>
+      </w:r>
+      <w:r>
+        <w:rPr>
+          <w:rFonts w:ascii="Calibri" w:cs="Calibri" w:eastAsia="Calibri" w:hAnsi="Calibri"/>
+          <w:sz w:val="21"/>
+          <w:szCs w:val="21"/>
+        </w:rPr>
+        <w:t xml:space="preserve">: each item shows its quantity, status, an editable reorder level, and its movements by type (Opening stock, Received, Used in a visit, Count correction) with date, who, and a link to the visit. Changes last for the demo session only.</w:t>
       </w:r>
     </w:p>
     <w:p>
@@ -9231,10 +9251,20 @@
       <w:r>
         <w:rPr>
           <w:rFonts w:ascii="Calibri" w:cs="Calibri" w:eastAsia="Calibri" w:hAnsi="Calibri"/>
-          <w:sz w:val="21"/>
-          <w:szCs w:val="21"/>
-        </w:rPr>
-        <w:t xml:space="preserve">Backend, database, real authentication (sessions, MFA, email verification are simulated).</w:t>
+          <w:b/>
+          <w:bCs/>
+          <w:sz w:val="21"/>
+          <w:szCs w:val="21"/>
+        </w:rPr>
+        <w:t xml:space="preserve">Rooms</w:t>
+      </w:r>
+      <w:r>
+        <w:rPr>
+          <w:rFonts w:ascii="Calibri" w:cs="Calibri" w:eastAsia="Calibri" w:hAnsi="Calibri"/>
+          <w:sz w:val="21"/>
+          <w:szCs w:val="21"/>
+        </w:rPr>
+        <w:t xml:space="preserve">: not linked to services. Any active room at the location can be chosen for any service and only double-booking is checked.</w:t>
       </w:r>
     </w:p>
     <w:p>
@@ -9249,10 +9279,38 @@
       <w:r>
         <w:rPr>
           <w:rFonts w:ascii="Calibri" w:cs="Calibri" w:eastAsia="Calibri" w:hAnsi="Calibri"/>
-          <w:sz w:val="21"/>
-          <w:szCs w:val="21"/>
-        </w:rPr>
-        <w:t xml:space="preserve">CRM pipeline, owners, tasks, merging and editing (the directory is read-only). Real delivery for Campaigns, messages and booking confirmations, real-time availability, identity checks on the public booking page. Messaging, email/SMS sending, online booking page, payment processing, EVOQ Billing and Campaigns connections.</w:t>
+          <w:b/>
+          <w:bCs/>
+          <w:sz w:val="21"/>
+          <w:szCs w:val="21"/>
+        </w:rPr>
+        <w:t xml:space="preserve">Forms</w:t>
+      </w:r>
+      <w:r>
+        <w:rPr>
+          <w:rFonts w:ascii="Calibri" w:cs="Calibri" w:eastAsia="Calibri" w:hAnsi="Calibri"/>
+          <w:sz w:val="21"/>
+          <w:szCs w:val="21"/>
+        </w:rPr>
+        <w:t xml:space="preserve">: Preview opens a read-only view of a template (its questions, answer options and required count) from the list or the builder. It never creates a response, signs a form or records consent.</w:t>
+      </w:r>
+    </w:p>
+    <w:p>
+      <w:pPr>
+        <w:pStyle w:val="Heading3"/>
+        <w:keepNext/>
+        <w:spacing w:after="100" w:before="220"/>
+      </w:pPr>
+      <w:r>
+        <w:rPr>
+          <w:rFonts w:ascii="Calibri" w:cs="Calibri" w:eastAsia="Calibri" w:hAnsi="Calibri"/>
+          <w:b/>
+          <w:bCs/>
+          <w:color w:val="2867B2"/>
+          <w:sz w:val="24"/>
+          <w:szCs w:val="24"/>
+        </w:rPr>
+        <w:t xml:space="preserve">Consent as shown in the app (frontend only)</w:t>
       </w:r>
     </w:p>
     <w:p>
@@ -9267,10 +9325,20 @@
       <w:r>
         <w:rPr>
           <w:rFonts w:ascii="Calibri" w:cs="Calibri" w:eastAsia="Calibri" w:hAnsi="Calibri"/>
-          <w:sz w:val="21"/>
-          <w:szCs w:val="21"/>
-        </w:rPr>
-        <w:t xml:space="preserve">Enquiries are not yet part of Reports or EVI agents, and enquiry follow-up tasks are separate from patient Follow-ups.</w:t>
+          <w:b/>
+          <w:bCs/>
+          <w:sz w:val="21"/>
+          <w:szCs w:val="21"/>
+        </w:rPr>
+        <w:t xml:space="preserve">Marketing consent</w:t>
+      </w:r>
+      <w:r>
+        <w:rPr>
+          <w:rFonts w:ascii="Calibri" w:cs="Calibri" w:eastAsia="Calibri" w:hAnsi="Calibri"/>
+          <w:sz w:val="21"/>
+          <w:szCs w:val="21"/>
+        </w:rPr>
+        <w:t xml:space="preserve"> (patients only): Granted, Not granted (earlier record, details unknown), or Not recorded. The old stored yes/no cannot say whether someone declined, withdrew or was never asked, so it is never shown as "Withdrawn". Enquiry-only people always show Not recorded. No date or source is shown unless one exists.</w:t>
       </w:r>
     </w:p>
     <w:p>
@@ -9285,10 +9353,20 @@
       <w:r>
         <w:rPr>
           <w:rFonts w:ascii="Calibri" w:cs="Calibri" w:eastAsia="Calibri" w:hAnsi="Calibri"/>
-          <w:sz w:val="21"/>
-          <w:szCs w:val="21"/>
-        </w:rPr>
-        <w:t xml:space="preserve">Real AI. File storage (uploaded photos and documents are not persisted).</w:t>
+          <w:b/>
+          <w:bCs/>
+          <w:sz w:val="21"/>
+          <w:szCs w:val="21"/>
+        </w:rPr>
+        <w:t xml:space="preserve">Photo consent</w:t>
+      </w:r>
+      <w:r>
+        <w:rPr>
+          <w:rFonts w:ascii="Calibri" w:cs="Calibri" w:eastAsia="Calibri" w:hAnsi="Calibri"/>
+          <w:sz w:val="21"/>
+          <w:szCs w:val="21"/>
+        </w:rPr>
+        <w:t xml:space="preserve"> (clinical record only): Granted, Denied, Withdrawn or Not recorded. Photo capture defaults to Not recorded and no longer pre-ticks consent. Demo photos are Not recorded because the demo has no photo consent evidence. Use of a photo in marketing or teaching is a separate permission that is not modelled.</w:t>
       </w:r>
     </w:p>
     <w:p>
@@ -9303,10 +9381,56 @@
       <w:r>
         <w:rPr>
           <w:rFonts w:ascii="Calibri" w:cs="Calibri" w:eastAsia="Calibri" w:hAnsi="Calibri"/>
-          <w:sz w:val="21"/>
-          <w:szCs w:val="21"/>
-        </w:rPr>
-        <w:t xml:space="preserve">UI-level automated tests, accessibility audit, audit-log persistence, data export beyond the audit-log CSV.</w:t>
+          <w:b/>
+          <w:bCs/>
+          <w:sz w:val="21"/>
+          <w:szCs w:val="21"/>
+        </w:rPr>
+        <w:t xml:space="preserve">Treatment consent</w:t>
+      </w:r>
+      <w:r>
+        <w:rPr>
+          <w:rFonts w:ascii="Calibri" w:cs="Calibri" w:eastAsia="Calibri" w:hAnsi="Calibri"/>
+          <w:sz w:val="21"/>
+          <w:szCs w:val="21"/>
+        </w:rPr>
+        <w:t xml:space="preserve"> is read only from signed consent forms and filed consent documents. </w:t>
+      </w:r>
+      <w:r>
+        <w:rPr>
+          <w:rFonts w:ascii="Calibri" w:cs="Calibri" w:eastAsia="Calibri" w:hAnsi="Calibri"/>
+          <w:b/>
+          <w:bCs/>
+          <w:sz w:val="21"/>
+          <w:szCs w:val="21"/>
+        </w:rPr>
+        <w:t xml:space="preserve">Care communication preferences</w:t>
+      </w:r>
+      <w:r>
+        <w:rPr>
+          <w:rFonts w:ascii="Calibri" w:cs="Calibri" w:eastAsia="Calibri" w:hAnsi="Calibri"/>
+          <w:sz w:val="21"/>
+          <w:szCs w:val="21"/>
+        </w:rPr>
+        <w:t xml:space="preserve"> are not modelled. The four are kept separate and none is inferred from another.</w:t>
+      </w:r>
+    </w:p>
+    <w:p>
+      <w:pPr>
+        <w:pStyle w:val="Heading2"/>
+        <w:keepNext/>
+        <w:spacing w:after="100" w:before="320"/>
+      </w:pPr>
+      <w:r>
+        <w:rPr>
+          <w:rFonts w:ascii="Calibri" w:cs="Calibri" w:eastAsia="Calibri" w:hAnsi="Calibri"/>
+          <w:b/>
+          <w:bCs/>
+          <w:color w:val="2867B2"/>
+          <w:sz w:val="30"/>
+          <w:szCs w:val="30"/>
+        </w:rPr>
+        <w:t xml:space="preserve">8. Not built or not real</w:t>
       </w:r>
     </w:p>
     <w:p>
@@ -9324,6 +9448,96 @@
           <w:sz w:val="21"/>
           <w:szCs w:val="21"/>
         </w:rPr>
+        <w:t xml:space="preserve">Backend, database, real authentication (sessions, MFA, email verification are simulated).</w:t>
+      </w:r>
+    </w:p>
+    <w:p>
+      <w:pPr>
+        <w:pStyle w:val="ListParagraph"/>
+        <w:numPr>
+          <w:ilvl w:val="0"/>
+          <w:numId w:val="2"/>
+        </w:numPr>
+        <w:spacing w:after="70"/>
+      </w:pPr>
+      <w:r>
+        <w:rPr>
+          <w:rFonts w:ascii="Calibri" w:cs="Calibri" w:eastAsia="Calibri" w:hAnsi="Calibri"/>
+          <w:sz w:val="21"/>
+          <w:szCs w:val="21"/>
+        </w:rPr>
+        <w:t xml:space="preserve">CRM pipeline, owners, tasks, merging and editing (the directory is read-only). Real delivery for Campaigns, messages and booking confirmations, real-time availability, identity checks on the public booking page. Messaging, email/SMS sending, online booking page, payment processing, EVOQ Billing and Campaigns connections.</w:t>
+      </w:r>
+    </w:p>
+    <w:p>
+      <w:pPr>
+        <w:pStyle w:val="ListParagraph"/>
+        <w:numPr>
+          <w:ilvl w:val="0"/>
+          <w:numId w:val="2"/>
+        </w:numPr>
+        <w:spacing w:after="70"/>
+      </w:pPr>
+      <w:r>
+        <w:rPr>
+          <w:rFonts w:ascii="Calibri" w:cs="Calibri" w:eastAsia="Calibri" w:hAnsi="Calibri"/>
+          <w:sz w:val="21"/>
+          <w:szCs w:val="21"/>
+        </w:rPr>
+        <w:t xml:space="preserve">Enquiries are not yet part of Reports or EVI agents, and enquiry follow-up tasks are separate from patient Follow-ups.</w:t>
+      </w:r>
+    </w:p>
+    <w:p>
+      <w:pPr>
+        <w:pStyle w:val="ListParagraph"/>
+        <w:numPr>
+          <w:ilvl w:val="0"/>
+          <w:numId w:val="2"/>
+        </w:numPr>
+        <w:spacing w:after="70"/>
+      </w:pPr>
+      <w:r>
+        <w:rPr>
+          <w:rFonts w:ascii="Calibri" w:cs="Calibri" w:eastAsia="Calibri" w:hAnsi="Calibri"/>
+          <w:sz w:val="21"/>
+          <w:szCs w:val="21"/>
+        </w:rPr>
+        <w:t xml:space="preserve">Real AI. File storage (uploaded photos and documents are not persisted).</w:t>
+      </w:r>
+    </w:p>
+    <w:p>
+      <w:pPr>
+        <w:pStyle w:val="ListParagraph"/>
+        <w:numPr>
+          <w:ilvl w:val="0"/>
+          <w:numId w:val="2"/>
+        </w:numPr>
+        <w:spacing w:after="70"/>
+      </w:pPr>
+      <w:r>
+        <w:rPr>
+          <w:rFonts w:ascii="Calibri" w:cs="Calibri" w:eastAsia="Calibri" w:hAnsi="Calibri"/>
+          <w:sz w:val="21"/>
+          <w:szCs w:val="21"/>
+        </w:rPr>
+        <w:t xml:space="preserve">UI-level automated tests, accessibility audit, audit-log persistence, data export beyond the audit-log CSV.</w:t>
+      </w:r>
+    </w:p>
+    <w:p>
+      <w:pPr>
+        <w:pStyle w:val="ListParagraph"/>
+        <w:numPr>
+          <w:ilvl w:val="0"/>
+          <w:numId w:val="2"/>
+        </w:numPr>
+        <w:spacing w:after="70"/>
+      </w:pPr>
+      <w:r>
+        <w:rPr>
+          <w:rFonts w:ascii="Calibri" w:cs="Calibri" w:eastAsia="Calibri" w:hAnsi="Calibri"/>
+          <w:sz w:val="21"/>
+          <w:szCs w:val="21"/>
+        </w:rPr>
         <w:t xml:space="preserve">Multi-clinic tenancy: one practice per browser.</w:t>
       </w:r>
     </w:p>
@@ -9364,7 +9578,7 @@
           <w:sz w:val="21"/>
           <w:szCs w:val="21"/>
         </w:rPr>
-        <w:t xml:space="preserve"> runs Playwright (Chromium) against the dev server: patient tabs by mouse and keyboard, resuming an in-progress visit without a duplicate, patient to appointment to visit and back, a follow-up to its source visit, completing a form, role access, a controlled save failure, Reports labelling, consent wording, and no horizontal scroll at 375, 768 and 1280px on key screens. A development-only seam (</w:t>
+        <w:t xml:space="preserve"> runs 67 Playwright tests (Chromium) against the dev server: Calendar status and keyboard, configuration screens, form preview and agent explanations, plus patient tabs by mouse and keyboard, resuming an in-progress visit without a duplicate, patient to appointment to visit and back, a follow-up to its source visit, completing a form, role access, a controlled save failure, Reports labelling, consent wording, and no horizontal scroll at 375, 768 and 1280px on key screens. A development-only seam (</w:t>
       </w:r>
       <w:r>
         <w:rPr>

</xml_diff>

<commit_message>
feat: full detail pages for enquiries and contacts
- /enquiries/[id], /crm/patient/[id], /crm/enquiry/[id] reuse the side-panel content; panels link to the full page
- Contact addresses use patient or enquiry record ids, not display keys
- Playwright tests and docs updated

Co-Authored-By: Claude Sonnet 5.5 <noreply@anthropic.com>
</commit_message>
<xml_diff>
--- a/docs/APP_OVERVIEW.docx
+++ b/docs/APP_OVERVIEW.docx
@@ -9152,7 +9152,7 @@
           <w:sz w:val="24"/>
           <w:szCs w:val="24"/>
         </w:rPr>
-        <w:t xml:space="preserve">Practice configuration (frontend)</w:t>
+        <w:t xml:space="preserve">Detail pages</w:t>
       </w:r>
     </w:p>
     <w:p>
@@ -9172,15 +9172,84 @@
           <w:sz w:val="21"/>
           <w:szCs w:val="21"/>
         </w:rPr>
-        <w:t xml:space="preserve">Services</w:t>
-      </w:r>
-      <w:r>
-        <w:rPr>
-          <w:rFonts w:ascii="Calibri" w:cs="Calibri" w:eastAsia="Calibri" w:hAnsi="Calibri"/>
-          <w:sz w:val="21"/>
-          <w:szCs w:val="21"/>
-        </w:rPr>
-        <w:t xml:space="preserve">: Active services are offered for new bookings. Inactive services are not offered on the online booking page or in the new appointment form; existing appointments, visits and invoices keep them. Inactive rooms are treated the same way.</w:t>
+        <w:t xml:space="preserve">Enquiries</w:t>
+      </w:r>
+      <w:r>
+        <w:rPr>
+          <w:rFonts w:ascii="Calibri" w:cs="Calibri" w:eastAsia="Calibri" w:hAnsi="Calibri"/>
+          <w:sz w:val="21"/>
+          <w:szCs w:val="21"/>
+        </w:rPr>
+        <w:t xml:space="preserve"> (</w:t>
+      </w:r>
+      <w:r>
+        <w:rPr>
+          <w:rFonts w:ascii="Consolas" w:cs="Consolas" w:eastAsia="Consolas" w:hAnsi="Consolas"/>
+          <w:sz w:val="19"/>
+          <w:szCs w:val="19"/>
+          <w:shd w:fill="F1F3F5" w:val="clear"/>
+        </w:rPr>
+        <w:t xml:space="preserve">/enquiries/[id]</w:t>
+      </w:r>
+      <w:r>
+        <w:rPr>
+          <w:rFonts w:ascii="Calibri" w:cs="Calibri" w:eastAsia="Calibri" w:hAnsi="Calibri"/>
+          <w:sz w:val="21"/>
+          <w:szCs w:val="21"/>
+        </w:rPr>
+        <w:t xml:space="preserve">) and </w:t>
+      </w:r>
+      <w:r>
+        <w:rPr>
+          <w:rFonts w:ascii="Calibri" w:cs="Calibri" w:eastAsia="Calibri" w:hAnsi="Calibri"/>
+          <w:b/>
+          <w:bCs/>
+          <w:sz w:val="21"/>
+          <w:szCs w:val="21"/>
+        </w:rPr>
+        <w:t xml:space="preserve">Contacts</w:t>
+      </w:r>
+      <w:r>
+        <w:rPr>
+          <w:rFonts w:ascii="Calibri" w:cs="Calibri" w:eastAsia="Calibri" w:hAnsi="Calibri"/>
+          <w:sz w:val="21"/>
+          <w:szCs w:val="21"/>
+        </w:rPr>
+        <w:t xml:space="preserve"> (</w:t>
+      </w:r>
+      <w:r>
+        <w:rPr>
+          <w:rFonts w:ascii="Consolas" w:cs="Consolas" w:eastAsia="Consolas" w:hAnsi="Consolas"/>
+          <w:sz w:val="19"/>
+          <w:szCs w:val="19"/>
+          <w:shd w:fill="F1F3F5" w:val="clear"/>
+        </w:rPr>
+        <w:t xml:space="preserve">/crm/patient/[patientId]</w:t>
+      </w:r>
+      <w:r>
+        <w:rPr>
+          <w:rFonts w:ascii="Calibri" w:cs="Calibri" w:eastAsia="Calibri" w:hAnsi="Calibri"/>
+          <w:sz w:val="21"/>
+          <w:szCs w:val="21"/>
+        </w:rPr>
+        <w:t xml:space="preserve">, </w:t>
+      </w:r>
+      <w:r>
+        <w:rPr>
+          <w:rFonts w:ascii="Consolas" w:cs="Consolas" w:eastAsia="Consolas" w:hAnsi="Consolas"/>
+          <w:sz w:val="19"/>
+          <w:szCs w:val="19"/>
+          <w:shd w:fill="F1F3F5" w:val="clear"/>
+        </w:rPr>
+        <w:t xml:space="preserve">/crm/enquiry/[enquiryId]</w:t>
+      </w:r>
+      <w:r>
+        <w:rPr>
+          <w:rFonts w:ascii="Calibri" w:cs="Calibri" w:eastAsia="Calibri" w:hAnsi="Calibri"/>
+          <w:sz w:val="21"/>
+          <w:szCs w:val="21"/>
+        </w:rPr>
+        <w:t xml:space="preserve">) have full pages with the same content as the side panel. Lists still open the side panel for quick viewing, and each panel has an "Open full page" link. The contact address uses the patient or enquiry record id, not the directory's display key, because a contact has no id of its own yet. A role that cannot see those ids gets no page link and a "Contact not found" message.</w:t>
       </w:r>
     </w:p>
     <w:p>
@@ -9195,20 +9264,28 @@
       <w:r>
         <w:rPr>
           <w:rFonts w:ascii="Calibri" w:cs="Calibri" w:eastAsia="Calibri" w:hAnsi="Calibri"/>
+          <w:sz w:val="21"/>
+          <w:szCs w:val="21"/>
+        </w:rPr>
+        <w:t xml:space="preserve">Other records (campaigns, online bookings, providers, services, inventory items, forms) still open in a panel or editor. Appointments open in the appointment panel; their full-page version is not built.</w:t>
+      </w:r>
+    </w:p>
+    <w:p>
+      <w:pPr>
+        <w:pStyle w:val="Heading3"/>
+        <w:keepNext/>
+        <w:spacing w:after="100" w:before="220"/>
+      </w:pPr>
+      <w:r>
+        <w:rPr>
+          <w:rFonts w:ascii="Calibri" w:cs="Calibri" w:eastAsia="Calibri" w:hAnsi="Calibri"/>
           <w:b/>
           <w:bCs/>
-          <w:sz w:val="21"/>
-          <w:szCs w:val="21"/>
-        </w:rPr>
-        <w:t xml:space="preserve">Team</w:t>
-      </w:r>
-      <w:r>
-        <w:rPr>
-          <w:rFonts w:ascii="Calibri" w:cs="Calibri" w:eastAsia="Calibri" w:hAnsi="Calibri"/>
-          <w:sz w:val="21"/>
-          <w:szCs w:val="21"/>
-        </w:rPr>
-        <w:t xml:space="preserve">: each provider's availability is shown as the booking rules actually read it (days and hours, time off). Text that cannot be read is reported and no rule is applied. The practice break, closed dates, booking notice and window are practice-wide settings.</w:t>
+          <w:color w:val="2867B2"/>
+          <w:sz w:val="24"/>
+          <w:szCs w:val="24"/>
+        </w:rPr>
+        <w:t xml:space="preserve">Practice configuration (frontend)</w:t>
       </w:r>
     </w:p>
     <w:p>
@@ -9228,15 +9305,15 @@
           <w:sz w:val="21"/>
           <w:szCs w:val="21"/>
         </w:rPr>
-        <w:t xml:space="preserve">Inventory</w:t>
-      </w:r>
-      <w:r>
-        <w:rPr>
-          <w:rFonts w:ascii="Calibri" w:cs="Calibri" w:eastAsia="Calibri" w:hAnsi="Calibri"/>
-          <w:sz w:val="21"/>
-          <w:szCs w:val="21"/>
-        </w:rPr>
-        <w:t xml:space="preserve">: each item shows its quantity, status, an editable reorder level, and its movements by type (Opening stock, Received, Used in a visit, Count correction) with date, who, and a link to the visit. Changes last for the demo session only.</w:t>
+        <w:t xml:space="preserve">Services</w:t>
+      </w:r>
+      <w:r>
+        <w:rPr>
+          <w:rFonts w:ascii="Calibri" w:cs="Calibri" w:eastAsia="Calibri" w:hAnsi="Calibri"/>
+          <w:sz w:val="21"/>
+          <w:szCs w:val="21"/>
+        </w:rPr>
+        <w:t xml:space="preserve">: Active services are offered for new bookings. Inactive services are not offered on the online booking page or in the new appointment form; existing appointments, visits and invoices keep them. Inactive rooms are treated the same way.</w:t>
       </w:r>
     </w:p>
     <w:p>
@@ -9256,15 +9333,15 @@
           <w:sz w:val="21"/>
           <w:szCs w:val="21"/>
         </w:rPr>
-        <w:t xml:space="preserve">Rooms</w:t>
-      </w:r>
-      <w:r>
-        <w:rPr>
-          <w:rFonts w:ascii="Calibri" w:cs="Calibri" w:eastAsia="Calibri" w:hAnsi="Calibri"/>
-          <w:sz w:val="21"/>
-          <w:szCs w:val="21"/>
-        </w:rPr>
-        <w:t xml:space="preserve">: not linked to services. Any active room at the location can be chosen for any service and only double-booking is checked.</w:t>
+        <w:t xml:space="preserve">Team</w:t>
+      </w:r>
+      <w:r>
+        <w:rPr>
+          <w:rFonts w:ascii="Calibri" w:cs="Calibri" w:eastAsia="Calibri" w:hAnsi="Calibri"/>
+          <w:sz w:val="21"/>
+          <w:szCs w:val="21"/>
+        </w:rPr>
+        <w:t xml:space="preserve">: each provider's availability is shown as the booking rules actually read it (days and hours, time off). Text that cannot be read is reported and no rule is applied. The practice break, closed dates, booking notice and window are practice-wide settings.</w:t>
       </w:r>
     </w:p>
     <w:p>
@@ -9284,33 +9361,15 @@
           <w:sz w:val="21"/>
           <w:szCs w:val="21"/>
         </w:rPr>
-        <w:t xml:space="preserve">Forms</w:t>
-      </w:r>
-      <w:r>
-        <w:rPr>
-          <w:rFonts w:ascii="Calibri" w:cs="Calibri" w:eastAsia="Calibri" w:hAnsi="Calibri"/>
-          <w:sz w:val="21"/>
-          <w:szCs w:val="21"/>
-        </w:rPr>
-        <w:t xml:space="preserve">: Preview opens a read-only view of a template (its questions, answer options and required count) from the list or the builder. It never creates a response, signs a form or records consent.</w:t>
-      </w:r>
-    </w:p>
-    <w:p>
-      <w:pPr>
-        <w:pStyle w:val="Heading3"/>
-        <w:keepNext/>
-        <w:spacing w:after="100" w:before="220"/>
-      </w:pPr>
-      <w:r>
-        <w:rPr>
-          <w:rFonts w:ascii="Calibri" w:cs="Calibri" w:eastAsia="Calibri" w:hAnsi="Calibri"/>
-          <w:b/>
-          <w:bCs/>
-          <w:color w:val="2867B2"/>
-          <w:sz w:val="24"/>
-          <w:szCs w:val="24"/>
-        </w:rPr>
-        <w:t xml:space="preserve">Consent as shown in the app (frontend only)</w:t>
+        <w:t xml:space="preserve">Inventory</w:t>
+      </w:r>
+      <w:r>
+        <w:rPr>
+          <w:rFonts w:ascii="Calibri" w:cs="Calibri" w:eastAsia="Calibri" w:hAnsi="Calibri"/>
+          <w:sz w:val="21"/>
+          <w:szCs w:val="21"/>
+        </w:rPr>
+        <w:t xml:space="preserve">: each item shows its quantity, status, an editable reorder level, and its movements by type (Opening stock, Received, Used in a visit, Count correction) with date, who, and a link to the visit. Changes last for the demo session only.</w:t>
       </w:r>
     </w:p>
     <w:p>
@@ -9330,15 +9389,15 @@
           <w:sz w:val="21"/>
           <w:szCs w:val="21"/>
         </w:rPr>
-        <w:t xml:space="preserve">Marketing consent</w:t>
-      </w:r>
-      <w:r>
-        <w:rPr>
-          <w:rFonts w:ascii="Calibri" w:cs="Calibri" w:eastAsia="Calibri" w:hAnsi="Calibri"/>
-          <w:sz w:val="21"/>
-          <w:szCs w:val="21"/>
-        </w:rPr>
-        <w:t xml:space="preserve"> (patients only): Granted, Not granted (earlier record, details unknown), or Not recorded. The old stored yes/no cannot say whether someone declined, withdrew or was never asked, so it is never shown as "Withdrawn". Enquiry-only people always show Not recorded. No date or source is shown unless one exists.</w:t>
+        <w:t xml:space="preserve">Rooms</w:t>
+      </w:r>
+      <w:r>
+        <w:rPr>
+          <w:rFonts w:ascii="Calibri" w:cs="Calibri" w:eastAsia="Calibri" w:hAnsi="Calibri"/>
+          <w:sz w:val="21"/>
+          <w:szCs w:val="21"/>
+        </w:rPr>
+        <w:t xml:space="preserve">: not linked to services. Any active room at the location can be chosen for any service and only double-booking is checked.</w:t>
       </w:r>
     </w:p>
     <w:p>
@@ -9358,15 +9417,33 @@
           <w:sz w:val="21"/>
           <w:szCs w:val="21"/>
         </w:rPr>
-        <w:t xml:space="preserve">Photo consent</w:t>
-      </w:r>
-      <w:r>
-        <w:rPr>
-          <w:rFonts w:ascii="Calibri" w:cs="Calibri" w:eastAsia="Calibri" w:hAnsi="Calibri"/>
-          <w:sz w:val="21"/>
-          <w:szCs w:val="21"/>
-        </w:rPr>
-        <w:t xml:space="preserve"> (clinical record only): Granted, Denied, Withdrawn or Not recorded. Photo capture defaults to Not recorded and no longer pre-ticks consent. Demo photos are Not recorded because the demo has no photo consent evidence. Use of a photo in marketing or teaching is a separate permission that is not modelled.</w:t>
+        <w:t xml:space="preserve">Forms</w:t>
+      </w:r>
+      <w:r>
+        <w:rPr>
+          <w:rFonts w:ascii="Calibri" w:cs="Calibri" w:eastAsia="Calibri" w:hAnsi="Calibri"/>
+          <w:sz w:val="21"/>
+          <w:szCs w:val="21"/>
+        </w:rPr>
+        <w:t xml:space="preserve">: Preview opens a read-only view of a template (its questions, answer options and required count) from the list or the builder. It never creates a response, signs a form or records consent.</w:t>
+      </w:r>
+    </w:p>
+    <w:p>
+      <w:pPr>
+        <w:pStyle w:val="Heading3"/>
+        <w:keepNext/>
+        <w:spacing w:after="100" w:before="220"/>
+      </w:pPr>
+      <w:r>
+        <w:rPr>
+          <w:rFonts w:ascii="Calibri" w:cs="Calibri" w:eastAsia="Calibri" w:hAnsi="Calibri"/>
+          <w:b/>
+          <w:bCs/>
+          <w:color w:val="2867B2"/>
+          <w:sz w:val="24"/>
+          <w:szCs w:val="24"/>
+        </w:rPr>
+        <w:t xml:space="preserve">Consent as shown in the app (frontend only)</w:t>
       </w:r>
     </w:p>
     <w:p>
@@ -9386,51 +9463,15 @@
           <w:sz w:val="21"/>
           <w:szCs w:val="21"/>
         </w:rPr>
-        <w:t xml:space="preserve">Treatment consent</w:t>
-      </w:r>
-      <w:r>
-        <w:rPr>
-          <w:rFonts w:ascii="Calibri" w:cs="Calibri" w:eastAsia="Calibri" w:hAnsi="Calibri"/>
-          <w:sz w:val="21"/>
-          <w:szCs w:val="21"/>
-        </w:rPr>
-        <w:t xml:space="preserve"> is read only from signed consent forms and filed consent documents. </w:t>
-      </w:r>
-      <w:r>
-        <w:rPr>
-          <w:rFonts w:ascii="Calibri" w:cs="Calibri" w:eastAsia="Calibri" w:hAnsi="Calibri"/>
-          <w:b/>
-          <w:bCs/>
-          <w:sz w:val="21"/>
-          <w:szCs w:val="21"/>
-        </w:rPr>
-        <w:t xml:space="preserve">Care communication preferences</w:t>
-      </w:r>
-      <w:r>
-        <w:rPr>
-          <w:rFonts w:ascii="Calibri" w:cs="Calibri" w:eastAsia="Calibri" w:hAnsi="Calibri"/>
-          <w:sz w:val="21"/>
-          <w:szCs w:val="21"/>
-        </w:rPr>
-        <w:t xml:space="preserve"> are not modelled. The four are kept separate and none is inferred from another.</w:t>
-      </w:r>
-    </w:p>
-    <w:p>
-      <w:pPr>
-        <w:pStyle w:val="Heading2"/>
-        <w:keepNext/>
-        <w:spacing w:after="100" w:before="320"/>
-      </w:pPr>
-      <w:r>
-        <w:rPr>
-          <w:rFonts w:ascii="Calibri" w:cs="Calibri" w:eastAsia="Calibri" w:hAnsi="Calibri"/>
-          <w:b/>
-          <w:bCs/>
-          <w:color w:val="2867B2"/>
-          <w:sz w:val="30"/>
-          <w:szCs w:val="30"/>
-        </w:rPr>
-        <w:t xml:space="preserve">8. Not built or not real</w:t>
+        <w:t xml:space="preserve">Marketing consent</w:t>
+      </w:r>
+      <w:r>
+        <w:rPr>
+          <w:rFonts w:ascii="Calibri" w:cs="Calibri" w:eastAsia="Calibri" w:hAnsi="Calibri"/>
+          <w:sz w:val="21"/>
+          <w:szCs w:val="21"/>
+        </w:rPr>
+        <w:t xml:space="preserve"> (patients only): Granted, Not granted (earlier record, details unknown), or Not recorded. The old stored yes/no cannot say whether someone declined, withdrew or was never asked, so it is never shown as "Withdrawn". Enquiry-only people always show Not recorded. No date or source is shown unless one exists.</w:t>
       </w:r>
     </w:p>
     <w:p>
@@ -9445,10 +9486,20 @@
       <w:r>
         <w:rPr>
           <w:rFonts w:ascii="Calibri" w:cs="Calibri" w:eastAsia="Calibri" w:hAnsi="Calibri"/>
-          <w:sz w:val="21"/>
-          <w:szCs w:val="21"/>
-        </w:rPr>
-        <w:t xml:space="preserve">Backend, database, real authentication (sessions, MFA, email verification are simulated).</w:t>
+          <w:b/>
+          <w:bCs/>
+          <w:sz w:val="21"/>
+          <w:szCs w:val="21"/>
+        </w:rPr>
+        <w:t xml:space="preserve">Photo consent</w:t>
+      </w:r>
+      <w:r>
+        <w:rPr>
+          <w:rFonts w:ascii="Calibri" w:cs="Calibri" w:eastAsia="Calibri" w:hAnsi="Calibri"/>
+          <w:sz w:val="21"/>
+          <w:szCs w:val="21"/>
+        </w:rPr>
+        <w:t xml:space="preserve"> (clinical record only): Granted, Denied, Withdrawn or Not recorded. Photo capture defaults to Not recorded and no longer pre-ticks consent. Demo photos are Not recorded because the demo has no photo consent evidence. Use of a photo in marketing or teaching is a separate permission that is not modelled.</w:t>
       </w:r>
     </w:p>
     <w:p>
@@ -9463,10 +9514,56 @@
       <w:r>
         <w:rPr>
           <w:rFonts w:ascii="Calibri" w:cs="Calibri" w:eastAsia="Calibri" w:hAnsi="Calibri"/>
-          <w:sz w:val="21"/>
-          <w:szCs w:val="21"/>
-        </w:rPr>
-        <w:t xml:space="preserve">CRM pipeline, owners, tasks, merging and editing (the directory is read-only). Real delivery for Campaigns, messages and booking confirmations, real-time availability, identity checks on the public booking page. Messaging, email/SMS sending, online booking page, payment processing, EVOQ Billing and Campaigns connections.</w:t>
+          <w:b/>
+          <w:bCs/>
+          <w:sz w:val="21"/>
+          <w:szCs w:val="21"/>
+        </w:rPr>
+        <w:t xml:space="preserve">Treatment consent</w:t>
+      </w:r>
+      <w:r>
+        <w:rPr>
+          <w:rFonts w:ascii="Calibri" w:cs="Calibri" w:eastAsia="Calibri" w:hAnsi="Calibri"/>
+          <w:sz w:val="21"/>
+          <w:szCs w:val="21"/>
+        </w:rPr>
+        <w:t xml:space="preserve"> is read only from signed consent forms and filed consent documents. </w:t>
+      </w:r>
+      <w:r>
+        <w:rPr>
+          <w:rFonts w:ascii="Calibri" w:cs="Calibri" w:eastAsia="Calibri" w:hAnsi="Calibri"/>
+          <w:b/>
+          <w:bCs/>
+          <w:sz w:val="21"/>
+          <w:szCs w:val="21"/>
+        </w:rPr>
+        <w:t xml:space="preserve">Care communication preferences</w:t>
+      </w:r>
+      <w:r>
+        <w:rPr>
+          <w:rFonts w:ascii="Calibri" w:cs="Calibri" w:eastAsia="Calibri" w:hAnsi="Calibri"/>
+          <w:sz w:val="21"/>
+          <w:szCs w:val="21"/>
+        </w:rPr>
+        <w:t xml:space="preserve"> are not modelled. The four are kept separate and none is inferred from another.</w:t>
+      </w:r>
+    </w:p>
+    <w:p>
+      <w:pPr>
+        <w:pStyle w:val="Heading2"/>
+        <w:keepNext/>
+        <w:spacing w:after="100" w:before="320"/>
+      </w:pPr>
+      <w:r>
+        <w:rPr>
+          <w:rFonts w:ascii="Calibri" w:cs="Calibri" w:eastAsia="Calibri" w:hAnsi="Calibri"/>
+          <w:b/>
+          <w:bCs/>
+          <w:color w:val="2867B2"/>
+          <w:sz w:val="30"/>
+          <w:szCs w:val="30"/>
+        </w:rPr>
+        <w:t xml:space="preserve">8. Not built or not real</w:t>
       </w:r>
     </w:p>
     <w:p>
@@ -9484,7 +9581,7 @@
           <w:sz w:val="21"/>
           <w:szCs w:val="21"/>
         </w:rPr>
-        <w:t xml:space="preserve">Enquiries are not yet part of Reports or EVI agents, and enquiry follow-up tasks are separate from patient Follow-ups.</w:t>
+        <w:t xml:space="preserve">Backend, database, real authentication (sessions, MFA, email verification are simulated).</w:t>
       </w:r>
     </w:p>
     <w:p>
@@ -9502,7 +9599,7 @@
           <w:sz w:val="21"/>
           <w:szCs w:val="21"/>
         </w:rPr>
-        <w:t xml:space="preserve">Real AI. File storage (uploaded photos and documents are not persisted).</w:t>
+        <w:t xml:space="preserve">CRM pipeline, owners, tasks, merging and editing (the directory is read-only). Real delivery for Campaigns, messages and booking confirmations, real-time availability, identity checks on the public booking page. Messaging, email/SMS sending, online booking page, payment processing, EVOQ Billing and Campaigns connections.</w:t>
       </w:r>
     </w:p>
     <w:p>
@@ -9520,7 +9617,7 @@
           <w:sz w:val="21"/>
           <w:szCs w:val="21"/>
         </w:rPr>
-        <w:t xml:space="preserve">UI-level automated tests, accessibility audit, audit-log persistence, data export beyond the audit-log CSV.</w:t>
+        <w:t xml:space="preserve">Enquiries are not yet part of Reports or EVI agents, and enquiry follow-up tasks are separate from patient Follow-ups.</w:t>
       </w:r>
     </w:p>
     <w:p>
@@ -9538,6 +9635,42 @@
           <w:sz w:val="21"/>
           <w:szCs w:val="21"/>
         </w:rPr>
+        <w:t xml:space="preserve">Real AI. File storage (uploaded photos and documents are not persisted).</w:t>
+      </w:r>
+    </w:p>
+    <w:p>
+      <w:pPr>
+        <w:pStyle w:val="ListParagraph"/>
+        <w:numPr>
+          <w:ilvl w:val="0"/>
+          <w:numId w:val="2"/>
+        </w:numPr>
+        <w:spacing w:after="70"/>
+      </w:pPr>
+      <w:r>
+        <w:rPr>
+          <w:rFonts w:ascii="Calibri" w:cs="Calibri" w:eastAsia="Calibri" w:hAnsi="Calibri"/>
+          <w:sz w:val="21"/>
+          <w:szCs w:val="21"/>
+        </w:rPr>
+        <w:t xml:space="preserve">UI-level automated tests, accessibility audit, audit-log persistence, data export beyond the audit-log CSV.</w:t>
+      </w:r>
+    </w:p>
+    <w:p>
+      <w:pPr>
+        <w:pStyle w:val="ListParagraph"/>
+        <w:numPr>
+          <w:ilvl w:val="0"/>
+          <w:numId w:val="2"/>
+        </w:numPr>
+        <w:spacing w:after="70"/>
+      </w:pPr>
+      <w:r>
+        <w:rPr>
+          <w:rFonts w:ascii="Calibri" w:cs="Calibri" w:eastAsia="Calibri" w:hAnsi="Calibri"/>
+          <w:sz w:val="21"/>
+          <w:szCs w:val="21"/>
+        </w:rPr>
         <w:t xml:space="preserve">Multi-clinic tenancy: one practice per browser.</w:t>
       </w:r>
     </w:p>
@@ -9578,7 +9711,7 @@
           <w:sz w:val="21"/>
           <w:szCs w:val="21"/>
         </w:rPr>
-        <w:t xml:space="preserve"> runs 67 Playwright tests (Chromium) against the dev server: Calendar status and keyboard, configuration screens, form preview and agent explanations, plus patient tabs by mouse and keyboard, resuming an in-progress visit without a duplicate, patient to appointment to visit and back, a follow-up to its source visit, completing a form, role access, a controlled save failure, Reports labelling, consent wording, and no horizontal scroll at 375, 768 and 1280px on key screens. A development-only seam (</w:t>
+        <w:t xml:space="preserve"> runs 72 Playwright tests (Chromium) against the dev server: Calendar status and keyboard, configuration screens, form preview and agent explanations, plus patient tabs by mouse and keyboard, resuming an in-progress visit without a duplicate, patient to appointment to visit and back, a follow-up to its source visit, completing a form, role access, a controlled save failure, Reports labelling, consent wording, and no horizontal scroll at 375, 768 and 1280px on key screens. A development-only seam (</w:t>
       </w:r>
       <w:r>
         <w:rPr>

</xml_diff>

<commit_message>
feat: new navigation, Appointments, Activities, Analytics and Reports
- Sidebar: Clinic, Patient Acquisition, Patient Engagement, Insights (Analytics, Reports), Practice Management subgroups
- Appointments list and detail with booking and attendance states; Activities worklist on existing records
- Analytics (Marketing Insights inside it) and Reports (11 filterable, sortable, exportable record reports) with matching counts
- Billing list; redirects for /insights and /marketing-insights; floating EVI avatar removed
- Today welcome banner; unit and Playwright tests; docs updated

Co-Authored-By: Claude Sonnet 5.5 <noreply@anthropic.com>
</commit_message>
<xml_diff>
--- a/docs/APP_OVERVIEW.docx
+++ b/docs/APP_OVERVIEW.docx
@@ -947,9 +947,9 @@
         </w:tblBorders>
       </w:tblPr>
       <w:tblGrid>
-        <w:gridCol w:w="1023"/>
-        <w:gridCol w:w="3791"/>
-        <w:gridCol w:w="5266"/>
+        <w:gridCol w:w="1043"/>
+        <w:gridCol w:w="4329"/>
+        <w:gridCol w:w="4708"/>
       </w:tblGrid>
       <w:tr>
         <w:trPr>
@@ -957,7 +957,7 @@
         </w:trPr>
         <w:tc>
           <w:tcPr>
-            <w:tcW w:type="dxa" w:w="1023"/>
+            <w:tcW w:type="dxa" w:w="1043"/>
             <w:tcBorders>
               <w:top w:val="single" w:color="D5DBE1" w:sz="4"/>
               <w:left w:val="single" w:color="D5DBE1" w:sz="4"/>
@@ -990,7 +990,7 @@
         </w:tc>
         <w:tc>
           <w:tcPr>
-            <w:tcW w:type="dxa" w:w="3791"/>
+            <w:tcW w:type="dxa" w:w="4329"/>
             <w:tcBorders>
               <w:top w:val="single" w:color="D5DBE1" w:sz="4"/>
               <w:left w:val="single" w:color="D5DBE1" w:sz="4"/>
@@ -1023,7 +1023,7 @@
         </w:tc>
         <w:tc>
           <w:tcPr>
-            <w:tcW w:type="dxa" w:w="5266"/>
+            <w:tcW w:type="dxa" w:w="4708"/>
             <w:tcBorders>
               <w:top w:val="single" w:color="D5DBE1" w:sz="4"/>
               <w:left w:val="single" w:color="D5DBE1" w:sz="4"/>
@@ -1061,7 +1061,7 @@
         </w:trPr>
         <w:tc>
           <w:tcPr>
-            <w:tcW w:type="dxa" w:w="1023"/>
+            <w:tcW w:type="dxa" w:w="1043"/>
             <w:tcBorders>
               <w:top w:val="single" w:color="D5DBE1" w:sz="4"/>
               <w:left w:val="single" w:color="D5DBE1" w:sz="4"/>
@@ -1093,7 +1093,7 @@
         </w:tc>
         <w:tc>
           <w:tcPr>
-            <w:tcW w:type="dxa" w:w="3791"/>
+            <w:tcW w:type="dxa" w:w="4329"/>
             <w:tcBorders>
               <w:top w:val="single" w:color="D5DBE1" w:sz="4"/>
               <w:left w:val="single" w:color="D5DBE1" w:sz="4"/>
@@ -1162,7 +1162,7 @@
                 <w:szCs w:val="17"/>
                 <w:shd w:fill="F1F3F5" w:val="clear"/>
               </w:rPr>
-              <w:t xml:space="preserve">/patients</w:t>
+              <w:t xml:space="preserve">/appointments</w:t>
             </w:r>
             <w:r>
               <w:rPr>
@@ -1204,7 +1204,7 @@
                 <w:szCs w:val="17"/>
                 <w:shd w:fill="F1F3F5" w:val="clear"/>
               </w:rPr>
-              <w:t xml:space="preserve">/follow-ups</w:t>
+              <w:t xml:space="preserve">/patients</w:t>
             </w:r>
             <w:r>
               <w:rPr>
@@ -1225,7 +1225,7 @@
                 <w:szCs w:val="17"/>
                 <w:shd w:fill="F1F3F5" w:val="clear"/>
               </w:rPr>
-              <w:t xml:space="preserve">/reports</w:t>
+              <w:t xml:space="preserve">/activities</w:t>
             </w:r>
             <w:r>
               <w:rPr>
@@ -1246,7 +1246,7 @@
                 <w:szCs w:val="17"/>
                 <w:shd w:fill="F1F3F5" w:val="clear"/>
               </w:rPr>
-              <w:t xml:space="preserve">/agents</w:t>
+              <w:t xml:space="preserve">/follow-ups</w:t>
             </w:r>
             <w:r>
               <w:rPr>
@@ -1267,13 +1267,55 @@
                 <w:szCs w:val="17"/>
                 <w:shd w:fill="F1F3F5" w:val="clear"/>
               </w:rPr>
+              <w:t xml:space="preserve">/agents</w:t>
+            </w:r>
+            <w:r>
+              <w:rPr>
+                <w:rFonts w:ascii="Calibri" w:cs="Calibri" w:eastAsia="Calibri" w:hAnsi="Calibri"/>
+                <w:b w:val="false"/>
+                <w:bCs w:val="false"/>
+                <w:sz w:val="19"/>
+                <w:szCs w:val="19"/>
+              </w:rPr>
+              <w:t xml:space="preserve">, </w:t>
+            </w:r>
+            <w:r>
+              <w:rPr>
+                <w:rFonts w:ascii="Consolas" w:cs="Consolas" w:eastAsia="Consolas" w:hAnsi="Consolas"/>
+                <w:b w:val="false"/>
+                <w:bCs w:val="false"/>
+                <w:sz w:val="17"/>
+                <w:szCs w:val="17"/>
+                <w:shd w:fill="F1F3F5" w:val="clear"/>
+              </w:rPr>
+              <w:t xml:space="preserve">/billing</w:t>
+            </w:r>
+            <w:r>
+              <w:rPr>
+                <w:rFonts w:ascii="Calibri" w:cs="Calibri" w:eastAsia="Calibri" w:hAnsi="Calibri"/>
+                <w:b w:val="false"/>
+                <w:bCs w:val="false"/>
+                <w:sz w:val="19"/>
+                <w:szCs w:val="19"/>
+              </w:rPr>
+              <w:t xml:space="preserve">, </w:t>
+            </w:r>
+            <w:r>
+              <w:rPr>
+                <w:rFonts w:ascii="Consolas" w:cs="Consolas" w:eastAsia="Consolas" w:hAnsi="Consolas"/>
+                <w:b w:val="false"/>
+                <w:bCs w:val="false"/>
+                <w:sz w:val="17"/>
+                <w:szCs w:val="17"/>
+                <w:shd w:fill="F1F3F5" w:val="clear"/>
+              </w:rPr>
               <w:t xml:space="preserve">/practice/*</w:t>
             </w:r>
           </w:p>
         </w:tc>
         <w:tc>
           <w:tcPr>
-            <w:tcW w:type="dxa" w:w="5266"/>
+            <w:tcW w:type="dxa" w:w="4708"/>
             <w:tcBorders>
               <w:top w:val="single" w:color="D5DBE1" w:sz="4"/>
               <w:left w:val="single" w:color="D5DBE1" w:sz="4"/>
@@ -1310,7 +1352,7 @@
         </w:trPr>
         <w:tc>
           <w:tcPr>
-            <w:tcW w:type="dxa" w:w="1023"/>
+            <w:tcW w:type="dxa" w:w="1043"/>
             <w:tcBorders>
               <w:top w:val="single" w:color="D5DBE1" w:sz="4"/>
               <w:left w:val="single" w:color="D5DBE1" w:sz="4"/>
@@ -1342,7 +1384,7 @@
         </w:tc>
         <w:tc>
           <w:tcPr>
-            <w:tcW w:type="dxa" w:w="3791"/>
+            <w:tcW w:type="dxa" w:w="4329"/>
             <w:tcBorders>
               <w:top w:val="single" w:color="D5DBE1" w:sz="4"/>
               <w:left w:val="single" w:color="D5DBE1" w:sz="4"/>
@@ -1375,7 +1417,7 @@
         </w:tc>
         <w:tc>
           <w:tcPr>
-            <w:tcW w:type="dxa" w:w="5266"/>
+            <w:tcW w:type="dxa" w:w="4708"/>
             <w:tcBorders>
               <w:top w:val="single" w:color="D5DBE1" w:sz="4"/>
               <w:left w:val="single" w:color="D5DBE1" w:sz="4"/>
@@ -1412,39 +1454,39 @@
         </w:trPr>
         <w:tc>
           <w:tcPr>
-            <w:tcW w:type="dxa" w:w="1023"/>
-            <w:tcBorders>
-              <w:top w:val="single" w:color="D5DBE1" w:sz="4"/>
-              <w:left w:val="single" w:color="D5DBE1" w:sz="4"/>
-              <w:bottom w:val="single" w:color="D5DBE1" w:sz="4"/>
-              <w:right w:val="single" w:color="D5DBE1" w:sz="4"/>
-            </w:tcBorders>
-            <w:tcMar>
-              <w:top w:type="dxa" w:w="70"/>
-              <w:left w:type="dxa" w:w="100"/>
-              <w:bottom w:type="dxa" w:w="70"/>
-              <w:right w:type="dxa" w:w="100"/>
-            </w:tcMar>
-          </w:tcPr>
-          <w:p>
-            <w:pPr>
-              <w:jc w:val="left"/>
-            </w:pPr>
-            <w:r>
-              <w:rPr>
-                <w:rFonts w:ascii="Calibri" w:cs="Calibri" w:eastAsia="Calibri" w:hAnsi="Calibri"/>
-                <w:b w:val="false"/>
-                <w:bCs w:val="false"/>
-                <w:sz w:val="19"/>
-                <w:szCs w:val="19"/>
-              </w:rPr>
-              <w:t xml:space="preserve">Marketing Insights</w:t>
-            </w:r>
-          </w:p>
-        </w:tc>
-        <w:tc>
-          <w:tcPr>
-            <w:tcW w:type="dxa" w:w="3791"/>
+            <w:tcW w:type="dxa" w:w="1043"/>
+            <w:tcBorders>
+              <w:top w:val="single" w:color="D5DBE1" w:sz="4"/>
+              <w:left w:val="single" w:color="D5DBE1" w:sz="4"/>
+              <w:bottom w:val="single" w:color="D5DBE1" w:sz="4"/>
+              <w:right w:val="single" w:color="D5DBE1" w:sz="4"/>
+            </w:tcBorders>
+            <w:tcMar>
+              <w:top w:type="dxa" w:w="70"/>
+              <w:left w:type="dxa" w:w="100"/>
+              <w:bottom w:type="dxa" w:w="70"/>
+              <w:right w:type="dxa" w:w="100"/>
+            </w:tcMar>
+          </w:tcPr>
+          <w:p>
+            <w:pPr>
+              <w:jc w:val="left"/>
+            </w:pPr>
+            <w:r>
+              <w:rPr>
+                <w:rFonts w:ascii="Calibri" w:cs="Calibri" w:eastAsia="Calibri" w:hAnsi="Calibri"/>
+                <w:b w:val="false"/>
+                <w:bCs w:val="false"/>
+                <w:sz w:val="19"/>
+                <w:szCs w:val="19"/>
+              </w:rPr>
+              <w:t xml:space="preserve">Analytics and Reports</w:t>
+            </w:r>
+          </w:p>
+        </w:tc>
+        <w:tc>
+          <w:tcPr>
+            <w:tcW w:type="dxa" w:w="4329"/>
             <w:tcBorders>
               <w:top w:val="single" w:color="D5DBE1" w:sz="4"/>
               <w:left w:val="single" w:color="D5DBE1" w:sz="4"/>
@@ -1471,39 +1513,165 @@
                 <w:szCs w:val="17"/>
                 <w:shd w:fill="F1F3F5" w:val="clear"/>
               </w:rPr>
+              <w:t xml:space="preserve">/analytics</w:t>
+            </w:r>
+            <w:r>
+              <w:rPr>
+                <w:rFonts w:ascii="Calibri" w:cs="Calibri" w:eastAsia="Calibri" w:hAnsi="Calibri"/>
+                <w:b w:val="false"/>
+                <w:bCs w:val="false"/>
+                <w:sz w:val="19"/>
+                <w:szCs w:val="19"/>
+              </w:rPr>
+              <w:t xml:space="preserve">, </w:t>
+            </w:r>
+            <w:r>
+              <w:rPr>
+                <w:rFonts w:ascii="Consolas" w:cs="Consolas" w:eastAsia="Consolas" w:hAnsi="Consolas"/>
+                <w:b w:val="false"/>
+                <w:bCs w:val="false"/>
+                <w:sz w:val="17"/>
+                <w:szCs w:val="17"/>
+                <w:shd w:fill="F1F3F5" w:val="clear"/>
+              </w:rPr>
+              <w:t xml:space="preserve">/analytics/[slug]</w:t>
+            </w:r>
+            <w:r>
+              <w:rPr>
+                <w:rFonts w:ascii="Calibri" w:cs="Calibri" w:eastAsia="Calibri" w:hAnsi="Calibri"/>
+                <w:b w:val="false"/>
+                <w:bCs w:val="false"/>
+                <w:sz w:val="19"/>
+                <w:szCs w:val="19"/>
+              </w:rPr>
+              <w:t xml:space="preserve">, </w:t>
+            </w:r>
+            <w:r>
+              <w:rPr>
+                <w:rFonts w:ascii="Consolas" w:cs="Consolas" w:eastAsia="Consolas" w:hAnsi="Consolas"/>
+                <w:b w:val="false"/>
+                <w:bCs w:val="false"/>
+                <w:sz w:val="17"/>
+                <w:szCs w:val="17"/>
+                <w:shd w:fill="F1F3F5" w:val="clear"/>
+              </w:rPr>
+              <w:t xml:space="preserve">/reports</w:t>
+            </w:r>
+            <w:r>
+              <w:rPr>
+                <w:rFonts w:ascii="Calibri" w:cs="Calibri" w:eastAsia="Calibri" w:hAnsi="Calibri"/>
+                <w:b w:val="false"/>
+                <w:bCs w:val="false"/>
+                <w:sz w:val="19"/>
+                <w:szCs w:val="19"/>
+              </w:rPr>
+              <w:t xml:space="preserve">, </w:t>
+            </w:r>
+            <w:r>
+              <w:rPr>
+                <w:rFonts w:ascii="Consolas" w:cs="Consolas" w:eastAsia="Consolas" w:hAnsi="Consolas"/>
+                <w:b w:val="false"/>
+                <w:bCs w:val="false"/>
+                <w:sz w:val="17"/>
+                <w:szCs w:val="17"/>
+                <w:shd w:fill="F1F3F5" w:val="clear"/>
+              </w:rPr>
+              <w:t xml:space="preserve">/reports/[slug]</w:t>
+            </w:r>
+          </w:p>
+        </w:tc>
+        <w:tc>
+          <w:tcPr>
+            <w:tcW w:type="dxa" w:w="4708"/>
+            <w:tcBorders>
+              <w:top w:val="single" w:color="D5DBE1" w:sz="4"/>
+              <w:left w:val="single" w:color="D5DBE1" w:sz="4"/>
+              <w:bottom w:val="single" w:color="D5DBE1" w:sz="4"/>
+              <w:right w:val="single" w:color="D5DBE1" w:sz="4"/>
+            </w:tcBorders>
+            <w:tcMar>
+              <w:top w:type="dxa" w:w="70"/>
+              <w:left w:type="dxa" w:w="100"/>
+              <w:bottom w:type="dxa" w:w="70"/>
+              <w:right w:type="dxa" w:w="100"/>
+            </w:tcMar>
+          </w:tcPr>
+          <w:p>
+            <w:pPr>
+              <w:jc w:val="left"/>
+            </w:pPr>
+            <w:r>
+              <w:rPr>
+                <w:rFonts w:ascii="Calibri" w:cs="Calibri" w:eastAsia="Calibri" w:hAnsi="Calibri"/>
+                <w:b w:val="false"/>
+                <w:bCs w:val="false"/>
+                <w:sz w:val="19"/>
+                <w:szCs w:val="19"/>
+              </w:rPr>
+              <w:t xml:space="preserve">Working demo on record data. </w:t>
+            </w:r>
+            <w:r>
+              <w:rPr>
+                <w:rFonts w:ascii="Consolas" w:cs="Consolas" w:eastAsia="Consolas" w:hAnsi="Consolas"/>
+                <w:b w:val="false"/>
+                <w:bCs w:val="false"/>
+                <w:sz w:val="17"/>
+                <w:szCs w:val="17"/>
+                <w:shd w:fill="F1F3F5" w:val="clear"/>
+              </w:rPr>
+              <w:t xml:space="preserve">/insights</w:t>
+            </w:r>
+            <w:r>
+              <w:rPr>
+                <w:rFonts w:ascii="Calibri" w:cs="Calibri" w:eastAsia="Calibri" w:hAnsi="Calibri"/>
+                <w:b w:val="false"/>
+                <w:bCs w:val="false"/>
+                <w:sz w:val="19"/>
+                <w:szCs w:val="19"/>
+              </w:rPr>
+              <w:t xml:space="preserve">, </w:t>
+            </w:r>
+            <w:r>
+              <w:rPr>
+                <w:rFonts w:ascii="Consolas" w:cs="Consolas" w:eastAsia="Consolas" w:hAnsi="Consolas"/>
+                <w:b w:val="false"/>
+                <w:bCs w:val="false"/>
+                <w:sz w:val="17"/>
+                <w:szCs w:val="17"/>
+                <w:shd w:fill="F1F3F5" w:val="clear"/>
+              </w:rPr>
+              <w:t xml:space="preserve">/insights/[slug]</w:t>
+            </w:r>
+            <w:r>
+              <w:rPr>
+                <w:rFonts w:ascii="Calibri" w:cs="Calibri" w:eastAsia="Calibri" w:hAnsi="Calibri"/>
+                <w:b w:val="false"/>
+                <w:bCs w:val="false"/>
+                <w:sz w:val="19"/>
+                <w:szCs w:val="19"/>
+              </w:rPr>
+              <w:t xml:space="preserve"> and </w:t>
+            </w:r>
+            <w:r>
+              <w:rPr>
+                <w:rFonts w:ascii="Consolas" w:cs="Consolas" w:eastAsia="Consolas" w:hAnsi="Consolas"/>
+                <w:b w:val="false"/>
+                <w:bCs w:val="false"/>
+                <w:sz w:val="17"/>
+                <w:szCs w:val="17"/>
+                <w:shd w:fill="F1F3F5" w:val="clear"/>
+              </w:rPr>
               <w:t xml:space="preserve">/marketing-insights</w:t>
             </w:r>
-          </w:p>
-        </w:tc>
-        <w:tc>
-          <w:tcPr>
-            <w:tcW w:type="dxa" w:w="5266"/>
-            <w:tcBorders>
-              <w:top w:val="single" w:color="D5DBE1" w:sz="4"/>
-              <w:left w:val="single" w:color="D5DBE1" w:sz="4"/>
-              <w:bottom w:val="single" w:color="D5DBE1" w:sz="4"/>
-              <w:right w:val="single" w:color="D5DBE1" w:sz="4"/>
-            </w:tcBorders>
-            <w:tcMar>
-              <w:top w:type="dxa" w:w="70"/>
-              <w:left w:type="dxa" w:w="100"/>
-              <w:bottom w:type="dxa" w:w="70"/>
-              <w:right w:type="dxa" w:w="100"/>
-            </w:tcMar>
-          </w:tcPr>
-          <w:p>
-            <w:pPr>
-              <w:jc w:val="left"/>
-            </w:pPr>
-            <w:r>
-              <w:rPr>
-                <w:rFonts w:ascii="Calibri" w:cs="Calibri" w:eastAsia="Calibri" w:hAnsi="Calibri"/>
-                <w:b w:val="false"/>
-                <w:bCs w:val="false"/>
-                <w:sz w:val="19"/>
-                <w:szCs w:val="19"/>
-              </w:rPr>
-              <w:t xml:space="preserve">Working demo on sample data</w:t>
+            <w:r>
+              <w:rPr>
+                <w:rFonts w:ascii="Calibri" w:cs="Calibri" w:eastAsia="Calibri" w:hAnsi="Calibri"/>
+                <w:b w:val="false"/>
+                <w:bCs w:val="false"/>
+                <w:sz w:val="19"/>
+                <w:szCs w:val="19"/>
+              </w:rPr>
+              <w:t xml:space="preserve"> redirect to Analytics</w:t>
             </w:r>
           </w:p>
         </w:tc>
@@ -1514,7 +1682,7 @@
         </w:trPr>
         <w:tc>
           <w:tcPr>
-            <w:tcW w:type="dxa" w:w="1023"/>
+            <w:tcW w:type="dxa" w:w="1043"/>
             <w:tcBorders>
               <w:top w:val="single" w:color="D5DBE1" w:sz="4"/>
               <w:left w:val="single" w:color="D5DBE1" w:sz="4"/>
@@ -1546,7 +1714,7 @@
         </w:tc>
         <w:tc>
           <w:tcPr>
-            <w:tcW w:type="dxa" w:w="3791"/>
+            <w:tcW w:type="dxa" w:w="4329"/>
             <w:tcBorders>
               <w:top w:val="single" w:color="D5DBE1" w:sz="4"/>
               <w:left w:val="single" w:color="D5DBE1" w:sz="4"/>
@@ -1579,7 +1747,7 @@
         </w:tc>
         <w:tc>
           <w:tcPr>
-            <w:tcW w:type="dxa" w:w="5266"/>
+            <w:tcW w:type="dxa" w:w="4708"/>
             <w:tcBorders>
               <w:top w:val="single" w:color="D5DBE1" w:sz="4"/>
               <w:left w:val="single" w:color="D5DBE1" w:sz="4"/>
@@ -1616,7 +1784,7 @@
         </w:trPr>
         <w:tc>
           <w:tcPr>
-            <w:tcW w:type="dxa" w:w="1023"/>
+            <w:tcW w:type="dxa" w:w="1043"/>
             <w:tcBorders>
               <w:top w:val="single" w:color="D5DBE1" w:sz="4"/>
               <w:left w:val="single" w:color="D5DBE1" w:sz="4"/>
@@ -1648,7 +1816,7 @@
         </w:tc>
         <w:tc>
           <w:tcPr>
-            <w:tcW w:type="dxa" w:w="3791"/>
+            <w:tcW w:type="dxa" w:w="4329"/>
             <w:tcBorders>
               <w:top w:val="single" w:color="D5DBE1" w:sz="4"/>
               <w:left w:val="single" w:color="D5DBE1" w:sz="4"/>
@@ -1712,7 +1880,7 @@
         </w:tc>
         <w:tc>
           <w:tcPr>
-            <w:tcW w:type="dxa" w:w="5266"/>
+            <w:tcW w:type="dxa" w:w="4708"/>
             <w:tcBorders>
               <w:top w:val="single" w:color="D5DBE1" w:sz="4"/>
               <w:left w:val="single" w:color="D5DBE1" w:sz="4"/>
@@ -1749,7 +1917,7 @@
         </w:trPr>
         <w:tc>
           <w:tcPr>
-            <w:tcW w:type="dxa" w:w="1023"/>
+            <w:tcW w:type="dxa" w:w="1043"/>
             <w:tcBorders>
               <w:top w:val="single" w:color="D5DBE1" w:sz="4"/>
               <w:left w:val="single" w:color="D5DBE1" w:sz="4"/>
@@ -1781,7 +1949,7 @@
         </w:tc>
         <w:tc>
           <w:tcPr>
-            <w:tcW w:type="dxa" w:w="3791"/>
+            <w:tcW w:type="dxa" w:w="4329"/>
             <w:tcBorders>
               <w:top w:val="single" w:color="D5DBE1" w:sz="4"/>
               <w:left w:val="single" w:color="D5DBE1" w:sz="4"/>
@@ -1814,7 +1982,7 @@
         </w:tc>
         <w:tc>
           <w:tcPr>
-            <w:tcW w:type="dxa" w:w="5266"/>
+            <w:tcW w:type="dxa" w:w="4708"/>
             <w:tcBorders>
               <w:top w:val="single" w:color="D5DBE1" w:sz="4"/>
               <w:left w:val="single" w:color="D5DBE1" w:sz="4"/>
@@ -1901,7 +2069,7 @@
           <w:sz w:val="21"/>
           <w:szCs w:val="21"/>
         </w:rPr>
-        <w:t xml:space="preserve"> Clinic (Today, Calendar, Front desk, Visits, Patients, Follow-ups), Patient acquisition (Enquiries, Contacts, Online booking, Campaigns, Marketing insights), Practice management (Reports, Team, Services &amp; treatments, Inventory, Locations &amp; rooms, Forms &amp; documents), with Settings and Help at the bottom. Front desk is the Patient flow view of Today on its own address (</w:t>
+        <w:t xml:space="preserve"> Clinic (Today, Calendar, Appointments, Visits, Patients, Activities, Follow-ups), Patient Acquisition (Enquiries, Contacts), Patient Engagement (Online booking, Campaigns), Insights (two destinations: Analytics and Reports), Practice Management in three small groups (People &amp; Services: Team &amp; providers, Services &amp; treatments. Facilities &amp; Resources: Locations &amp; rooms, Inventory. Administration: Forms &amp; documents, Billing), then Settings and Help at the bottom. Front desk is no longer in the menu: patient flow is a view inside Today (</w:t>
       </w:r>
       <w:r>
         <w:rPr>
@@ -1918,7 +2086,7 @@
           <w:sz w:val="21"/>
           <w:szCs w:val="21"/>
         </w:rPr>
-        <w:t xml:space="preserve">). Marketing insights is kept in the acquisition group so the Marketing role's landing page stays reachable. Contacts, Online booking and Campaigns are optional and can be switched off in Practice &gt; Integrations.</w:t>
+        <w:t xml:space="preserve"> still opens it). Marketing Insights is a view inside Analytics, not a menu item. The floating EVI avatar was removed; Ask EVI stays in the top bar and on Ctrl+J. Optional modules (Contacts, Online booking, Campaigns) still hide when switched off.</w:t>
       </w:r>
     </w:p>
     <w:p>
@@ -3431,7 +3599,7 @@
                 <w:sz w:val="19"/>
                 <w:szCs w:val="19"/>
               </w:rPr>
-              <w:t xml:space="preserve">Reports, Marketing Insights</w:t>
+              <w:t xml:space="preserve">Analytics, Reports</w:t>
             </w:r>
           </w:p>
         </w:tc>
@@ -3463,7 +3631,7 @@
                 <w:sz w:val="19"/>
                 <w:szCs w:val="19"/>
               </w:rPr>
-              <w:t xml:space="preserve">Operational trends and enquiry-to-appointment conversion by source.</w:t>
+              <w:t xml:space="preserve">Analytics shows what is changing; Reports lists the records behind it and exports them. Every number states how it is worked out.</w:t>
             </w:r>
           </w:p>
         </w:tc>
@@ -4484,15 +4652,57 @@
           <w:sz w:val="21"/>
           <w:szCs w:val="21"/>
         </w:rPr>
-        <w:t xml:space="preserve">Follow-ups</w:t>
-      </w:r>
-      <w:r>
-        <w:rPr>
-          <w:rFonts w:ascii="Calibri" w:cs="Calibri" w:eastAsia="Calibri" w:hAnsi="Calibri"/>
-          <w:sz w:val="21"/>
-          <w:szCs w:val="21"/>
-        </w:rPr>
-        <w:t xml:space="preserve">: four tiles that double as filters (due today, overdue, upcoming, completed). Each row shows the source visit (date and type, linked), the type and a free-text reason ("Reason not recorded" for any follow-up where nobody entered one; no reason is invented), owner, due date and status. The reason is entered when a follow-up is created, from the Follow-ups page, the patient, or the visit.</w:t>
+        <w:t xml:space="preserve">Appointments (</w:t>
+      </w:r>
+      <w:r>
+        <w:rPr>
+          <w:rFonts w:ascii="Consolas" w:cs="Consolas" w:eastAsia="Consolas" w:hAnsi="Consolas"/>
+          <w:b/>
+          <w:bCs/>
+          <w:sz w:val="19"/>
+          <w:szCs w:val="19"/>
+          <w:shd w:fill="F1F3F5" w:val="clear"/>
+        </w:rPr>
+        <w:t xml:space="preserve">/appointments</w:t>
+      </w:r>
+      <w:r>
+        <w:rPr>
+          <w:rFonts w:ascii="Calibri" w:cs="Calibri" w:eastAsia="Calibri" w:hAnsi="Calibri"/>
+          <w:b/>
+          <w:bCs/>
+          <w:sz w:val="21"/>
+          <w:szCs w:val="21"/>
+        </w:rPr>
+        <w:t xml:space="preserve">, </w:t>
+      </w:r>
+      <w:r>
+        <w:rPr>
+          <w:rFonts w:ascii="Consolas" w:cs="Consolas" w:eastAsia="Consolas" w:hAnsi="Consolas"/>
+          <w:b/>
+          <w:bCs/>
+          <w:sz w:val="19"/>
+          <w:szCs w:val="19"/>
+          <w:shd w:fill="F1F3F5" w:val="clear"/>
+        </w:rPr>
+        <w:t xml:space="preserve">/appointments/[id]</w:t>
+      </w:r>
+      <w:r>
+        <w:rPr>
+          <w:rFonts w:ascii="Calibri" w:cs="Calibri" w:eastAsia="Calibri" w:hAnsi="Calibri"/>
+          <w:b/>
+          <w:bCs/>
+          <w:sz w:val="21"/>
+          <w:szCs w:val="21"/>
+        </w:rPr>
+        <w:t xml:space="preserve">)</w:t>
+      </w:r>
+      <w:r>
+        <w:rPr>
+          <w:rFonts w:ascii="Calibri" w:cs="Calibri" w:eastAsia="Calibri" w:hAnsi="Calibri"/>
+          <w:sz w:val="21"/>
+          <w:szCs w:val="21"/>
+        </w:rPr>
+        <w:t xml:space="preserve">: a searchable list that is separate from the Calendar and uses the same records and status rules. Quick views (All, Upcoming, Today, Past, Cancelled / no-show), quick filters (Today, Awaiting confirmation, Needs attention), and filters for provider, service, location, source, booking status, attendance, and dates. Each row shows booking and attendance apart (the model has one stored status, so each is stated only as far as it supports: for example, once someone has arrived, confirmation is shown as "Booked", not "Confirmed"). The row menu offers only actions that fit the status: Open, Confirm booking, Check in, Open visit, Reschedule, Mark no-show, Open patient, Cancel (with confirmation). The detail page shows who, what, when, the recorded provider, location, room, source and notes, the linked visit or a plain statement that none exists (opening a page never creates one), only the history that is actually logged, and a concise invoice indicator for roles with Financials. Rescheduling offers only times the availability rules allow. The side panel stays as a quick view with an Open full page link.</w:t>
       </w:r>
     </w:p>
     <w:p>
@@ -4512,15 +4722,211 @@
           <w:sz w:val="21"/>
           <w:szCs w:val="21"/>
         </w:rPr>
-        <w:t xml:space="preserve">Reports</w:t>
-      </w:r>
-      <w:r>
-        <w:rPr>
-          <w:rFonts w:ascii="Calibri" w:cs="Calibri" w:eastAsia="Calibri" w:hAnsi="Calibri"/>
-          <w:sz w:val="21"/>
-          <w:szCs w:val="21"/>
-        </w:rPr>
-        <w:t xml:space="preserve">: "From the records in this app" (appointment records by status in the chosen range, follow-up snapshot), billing summary and inventory come from the demo records and are reconciled with the Calendar. Appointment and no-show trends, utilization, service volume, provider activity and patient activity are generated illustrative figures: they sit under a warning and each panel carries an "Illustrative" badge. The CSV export contains the record counts only.</w:t>
+        <w:t xml:space="preserve">Activities (</w:t>
+      </w:r>
+      <w:r>
+        <w:rPr>
+          <w:rFonts w:ascii="Consolas" w:cs="Consolas" w:eastAsia="Consolas" w:hAnsi="Consolas"/>
+          <w:b/>
+          <w:bCs/>
+          <w:sz w:val="19"/>
+          <w:szCs w:val="19"/>
+          <w:shd w:fill="F1F3F5" w:val="clear"/>
+        </w:rPr>
+        <w:t xml:space="preserve">/activities</w:t>
+      </w:r>
+      <w:r>
+        <w:rPr>
+          <w:rFonts w:ascii="Calibri" w:cs="Calibri" w:eastAsia="Calibri" w:hAnsi="Calibri"/>
+          <w:b/>
+          <w:bCs/>
+          <w:sz w:val="21"/>
+          <w:szCs w:val="21"/>
+        </w:rPr>
+        <w:t xml:space="preserve">)</w:t>
+      </w:r>
+      <w:r>
+        <w:rPr>
+          <w:rFonts w:ascii="Calibri" w:cs="Calibri" w:eastAsia="Calibri" w:hAnsi="Calibri"/>
+          <w:sz w:val="21"/>
+          <w:szCs w:val="21"/>
+        </w:rPr>
+        <w:t xml:space="preserve">: one worklist of logged calls, tasks, meetings and other interactions. Each record appears once: calls come from the communication log, tasks on an enquiry are the enquiry's own tasks, and other tasks and meetings are kept in an in-memory list that starts empty. Views: All, My activities, Upcoming, Overdue, Completed, with search and filters. Overdue and due-soon are shown in text. A follow-up stays in Follow-ups: an activity can point to one, and completing the activity never completes it. No telephony or call recording exists.</w:t>
+      </w:r>
+    </w:p>
+    <w:p>
+      <w:pPr>
+        <w:pStyle w:val="ListParagraph"/>
+        <w:numPr>
+          <w:ilvl w:val="0"/>
+          <w:numId w:val="2"/>
+        </w:numPr>
+        <w:spacing w:after="70"/>
+      </w:pPr>
+      <w:r>
+        <w:rPr>
+          <w:rFonts w:ascii="Calibri" w:cs="Calibri" w:eastAsia="Calibri" w:hAnsi="Calibri"/>
+          <w:b/>
+          <w:bCs/>
+          <w:sz w:val="21"/>
+          <w:szCs w:val="21"/>
+        </w:rPr>
+        <w:t xml:space="preserve">Billing (</w:t>
+      </w:r>
+      <w:r>
+        <w:rPr>
+          <w:rFonts w:ascii="Consolas" w:cs="Consolas" w:eastAsia="Consolas" w:hAnsi="Consolas"/>
+          <w:b/>
+          <w:bCs/>
+          <w:sz w:val="19"/>
+          <w:szCs w:val="19"/>
+          <w:shd w:fill="F1F3F5" w:val="clear"/>
+        </w:rPr>
+        <w:t xml:space="preserve">/billing</w:t>
+      </w:r>
+      <w:r>
+        <w:rPr>
+          <w:rFonts w:ascii="Calibri" w:cs="Calibri" w:eastAsia="Calibri" w:hAnsi="Calibri"/>
+          <w:b/>
+          <w:bCs/>
+          <w:sz w:val="21"/>
+          <w:szCs w:val="21"/>
+        </w:rPr>
+        <w:t xml:space="preserve">)</w:t>
+      </w:r>
+      <w:r>
+        <w:rPr>
+          <w:rFonts w:ascii="Calibri" w:cs="Calibri" w:eastAsia="Calibri" w:hAnsi="Calibri"/>
+          <w:sz w:val="21"/>
+          <w:szCs w:val="21"/>
+        </w:rPr>
+        <w:t xml:space="preserve">: a read-only list of invoices and balances across patients with links to each patient's financials. EVOQ Billing is not connected, and nothing here processes a payment.</w:t>
+      </w:r>
+    </w:p>
+    <w:p>
+      <w:pPr>
+        <w:pStyle w:val="ListParagraph"/>
+        <w:numPr>
+          <w:ilvl w:val="0"/>
+          <w:numId w:val="2"/>
+        </w:numPr>
+        <w:spacing w:after="70"/>
+      </w:pPr>
+      <w:r>
+        <w:rPr>
+          <w:rFonts w:ascii="Calibri" w:cs="Calibri" w:eastAsia="Calibri" w:hAnsi="Calibri"/>
+          <w:b/>
+          <w:bCs/>
+          <w:sz w:val="21"/>
+          <w:szCs w:val="21"/>
+        </w:rPr>
+        <w:t xml:space="preserve">Follow-ups</w:t>
+      </w:r>
+      <w:r>
+        <w:rPr>
+          <w:rFonts w:ascii="Calibri" w:cs="Calibri" w:eastAsia="Calibri" w:hAnsi="Calibri"/>
+          <w:sz w:val="21"/>
+          <w:szCs w:val="21"/>
+        </w:rPr>
+        <w:t xml:space="preserve">: four tiles that double as filters (due today, overdue, upcoming, completed). Each row shows the source visit (date and type, linked), the type and a free-text reason ("Reason not recorded" for any follow-up where nobody entered one; no reason is invented), owner, due date and status. The reason is entered when a follow-up is created, from the Follow-ups page, the patient, or the visit.</w:t>
+      </w:r>
+    </w:p>
+    <w:p>
+      <w:pPr>
+        <w:pStyle w:val="ListParagraph"/>
+        <w:numPr>
+          <w:ilvl w:val="0"/>
+          <w:numId w:val="2"/>
+        </w:numPr>
+        <w:spacing w:after="70"/>
+      </w:pPr>
+      <w:r>
+        <w:rPr>
+          <w:rFonts w:ascii="Calibri" w:cs="Calibri" w:eastAsia="Calibri" w:hAnsi="Calibri"/>
+          <w:b/>
+          <w:bCs/>
+          <w:sz w:val="21"/>
+          <w:szCs w:val="21"/>
+        </w:rPr>
+        <w:t xml:space="preserve">Analytics (</w:t>
+      </w:r>
+      <w:r>
+        <w:rPr>
+          <w:rFonts w:ascii="Consolas" w:cs="Consolas" w:eastAsia="Consolas" w:hAnsi="Consolas"/>
+          <w:b/>
+          <w:bCs/>
+          <w:sz w:val="19"/>
+          <w:szCs w:val="19"/>
+          <w:shd w:fill="F1F3F5" w:val="clear"/>
+        </w:rPr>
+        <w:t xml:space="preserve">/analytics</w:t>
+      </w:r>
+      <w:r>
+        <w:rPr>
+          <w:rFonts w:ascii="Calibri" w:cs="Calibri" w:eastAsia="Calibri" w:hAnsi="Calibri"/>
+          <w:b/>
+          <w:bCs/>
+          <w:sz w:val="21"/>
+          <w:szCs w:val="21"/>
+        </w:rPr>
+        <w:t xml:space="preserve">)</w:t>
+      </w:r>
+      <w:r>
+        <w:rPr>
+          <w:rFonts w:ascii="Calibri" w:cs="Calibri" w:eastAsia="Calibri" w:hAnsi="Calibri"/>
+          <w:sz w:val="21"/>
+          <w:szCs w:val="21"/>
+        </w:rPr>
+        <w:t xml:space="preserve">: answers "what is changing, and where should I look?". Category tabs (Overview, Clinic, Patients, Acquisition, Services, Capacity, Financials) and a catalogue of views: Clinic overview, Appointment analytics (booking volume, confirmation, attendance, cancellation and no-show rates, rescheduling, demand by weekday, hour, provider and location), Patient analytics (returning vs first visit on record, frequency, rebooking, inactive patients with a chosen threshold), Marketing Insights (under Acquisition: sources, conversion by source and by service, campaigns), Service &amp; treatment analytics, Provider &amp; capacity analytics (utilisation only where working hours can be read), Financial analytics (invoiced, collected, refunds and outstanding kept separate; needs Financials) and Follow-up &amp; care continuity. Inventory analytics is shown as not available yet, with the reason. Filters live in the address. Every metric prints its definition, and most link to the matching report. There are no illustrative charts. The appointment view keeps a counts-by-day CSV with no patient details.</w:t>
+      </w:r>
+    </w:p>
+    <w:p>
+      <w:pPr>
+        <w:pStyle w:val="ListParagraph"/>
+        <w:numPr>
+          <w:ilvl w:val="0"/>
+          <w:numId w:val="2"/>
+        </w:numPr>
+        <w:spacing w:after="70"/>
+      </w:pPr>
+      <w:r>
+        <w:rPr>
+          <w:rFonts w:ascii="Calibri" w:cs="Calibri" w:eastAsia="Calibri" w:hAnsi="Calibri"/>
+          <w:b/>
+          <w:bCs/>
+          <w:sz w:val="21"/>
+          <w:szCs w:val="21"/>
+        </w:rPr>
+        <w:t xml:space="preserve">Reports (</w:t>
+      </w:r>
+      <w:r>
+        <w:rPr>
+          <w:rFonts w:ascii="Consolas" w:cs="Consolas" w:eastAsia="Consolas" w:hAnsi="Consolas"/>
+          <w:b/>
+          <w:bCs/>
+          <w:sz w:val="19"/>
+          <w:szCs w:val="19"/>
+          <w:shd w:fill="F1F3F5" w:val="clear"/>
+        </w:rPr>
+        <w:t xml:space="preserve">/reports</w:t>
+      </w:r>
+      <w:r>
+        <w:rPr>
+          <w:rFonts w:ascii="Calibri" w:cs="Calibri" w:eastAsia="Calibri" w:hAnsi="Calibri"/>
+          <w:b/>
+          <w:bCs/>
+          <w:sz w:val="21"/>
+          <w:szCs w:val="21"/>
+        </w:rPr>
+        <w:t xml:space="preserve">)</w:t>
+      </w:r>
+      <w:r>
+        <w:rPr>
+          <w:rFonts w:ascii="Calibri" w:cs="Calibri" w:eastAsia="Calibri" w:hAnsi="Calibri"/>
+          <w:sz w:val="21"/>
+          <w:szCs w:val="21"/>
+        </w:rPr>
+        <w:t xml:space="preserve">: answers "which records make up this result?". A searchable catalogue by category (Appointments, Patients, Enquiries, Visits, Follow-ups, Services &amp; treatments, Financials, Campaigns) with a record count on each. Each report has filters that live in the address, free-text search, sortable columns, links to the source records, a record count that names the date the range applies to, and CSV export (Exports permission) of exactly the filtered, sorted records. Reports and Analytics use the same range and status rules, so a figure in Analytics equals the record count after following its link (tested). Patient names need the Patients permission, money needs Financials, enquiries need an enquiry permission. Campaign records carry no delivery or response figures because nothing is delivered. Reports do not repeat workflows: opening a row goes to the Appointments, Patients, Visits, Follow-ups, Enquiries, Campaigns or Billing screen.</w:t>
       </w:r>
     </w:p>
     <w:p>
@@ -8827,7 +9233,7 @@
           <w:sz w:val="21"/>
           <w:szCs w:val="21"/>
         </w:rPr>
-        <w:t xml:space="preserve"> permission now blocks the patient-facing pages (Today, Calendar, Patients, Visits, Follow-ups, Agents), including by direct URL. Marketing lands on Marketing Insights.</w:t>
+        <w:t xml:space="preserve"> permission now blocks the patient-facing pages (Today, Calendar, Patients, Visits, Follow-ups, Agents), including by direct URL. Marketing lands on Marketing Insights inside Analytics.</w:t>
       </w:r>
     </w:p>
     <w:p>
@@ -9617,7 +10023,7 @@
           <w:sz w:val="21"/>
           <w:szCs w:val="21"/>
         </w:rPr>
-        <w:t xml:space="preserve">Enquiries are not yet part of Reports or EVI agents, and enquiry follow-up tasks are separate from patient Follow-ups.</w:t>
+        <w:t xml:space="preserve">Enquiries are part of Marketing Insights but not of EVI agents, and enquiry follow-up tasks are separate from patient Follow-ups.</w:t>
       </w:r>
     </w:p>
     <w:p>
@@ -9711,7 +10117,7 @@
           <w:sz w:val="21"/>
           <w:szCs w:val="21"/>
         </w:rPr>
-        <w:t xml:space="preserve"> runs 72 Playwright tests (Chromium) against the dev server: Calendar status and keyboard, configuration screens, form preview and agent explanations, plus patient tabs by mouse and keyboard, resuming an in-progress visit without a duplicate, patient to appointment to visit and back, a follow-up to its source visit, completing a form, role access, a controlled save failure, Reports labelling, consent wording, and no horizontal scroll at 375, 768 and 1280px on key screens. A development-only seam (</w:t>
+        <w:t xml:space="preserve"> runs 143 Playwright tests (Chromium) against the dev server: Calendar status and keyboard, configuration screens, form preview and agent explanations, plus patient tabs by mouse and keyboard, resuming an in-progress visit without a duplicate, patient to appointment to visit and back, a follow-up to its source visit, completing a form, role access, a controlled save failure, Reports labelling, consent wording, and no horizontal scroll at 375, 768 and 1280px on key screens. A development-only seam (</w:t>
       </w:r>
       <w:r>
         <w:rPr>

</xml_diff>